<commit_message>
docs: document the smoke run and the bind and loop-bound constraints
Adds Section 12.7 for the reset and idle run, records why the POS
line-address array is packed and why helper loop bounds are hoisted, and
regenerates the Word deliverable.

Co-authored-by: swasthikamath <swasthikamath@gmail.com>
</commit_message>
<xml_diff>
--- a/docs/chi_interconnect_design_spec.docx
+++ b/docs/chi_interconnect_design_spec.docx
@@ -2640,7 +2640,7 @@
               <w:t xml:space="preserve"> </w:t>
             </w:r>
             <w:r>
-              <w:t xml:space="preserve">operations. The Home serializes the operand, reads the initial value, applies the operation, writes it back and returns the original value. Little-endian and big-endian operands are both handled.</w:t>
+              <w:t xml:space="preserve">operations. The Home serializes the operand, reads the initial value, applies the operation, writes it back and returns the original value. Little-endian and big-endian operands are both handled. The datapath is 64 bits, so operands wider than 8 bytes are not supported.</w:t>
             </w:r>
           </w:p>
         </w:tc>
@@ -16742,19 +16742,37 @@
         <w:t xml:space="preserve"> </w:t>
       </w:r>
       <w:r>
-        <w:t xml:space="preserve">endiannesses. A snoop that invalidates a dirty peer copy supplies the initial</w:t>
-      </w:r>
-      <w:r>
-        <w:t xml:space="preserve"> </w:t>
-      </w:r>
-      <w:r>
-        <w:t xml:space="preserve">value and removes the downstream read. The operation is always performed at</w:t>
-      </w:r>
-      <w:r>
-        <w:t xml:space="preserve"> </w:t>
-      </w:r>
-      <w:r>
-        <w:t xml:space="preserve">the Home; there is no far-atomic negotiation.</w:t>
+        <w:t xml:space="preserve">endiannesses. Big-endian operands are byte-reversed within the operand size</w:t>
+      </w:r>
+      <w:r>
+        <w:t xml:space="preserve"> </w:t>
+      </w:r>
+      <w:r>
+        <w:t xml:space="preserve">before the arithmetic and reversed again on the way out, because atomic data</w:t>
+      </w:r>
+      <w:r>
+        <w:t xml:space="preserve"> </w:t>
+      </w:r>
+      <w:r>
+        <w:t xml:space="preserve">is byte invariant. A snoop that invalidates a dirty peer copy supplies the</w:t>
+      </w:r>
+      <w:r>
+        <w:t xml:space="preserve"> </w:t>
+      </w:r>
+      <w:r>
+        <w:t xml:space="preserve">initial value and removes the downstream read. The datapath is 64 bits wide,</w:t>
+      </w:r>
+      <w:r>
+        <w:t xml:space="preserve"> </w:t>
+      </w:r>
+      <w:r>
+        <w:t xml:space="preserve">so operands wider than 8 bytes are unsupported. The operation is always</w:t>
+      </w:r>
+      <w:r>
+        <w:t xml:space="preserve"> </w:t>
+      </w:r>
+      <w:r>
+        <w:t xml:space="preserve">performed at the Home; there is no far-atomic negotiation.</w:t>
       </w:r>
     </w:p>
     <w:bookmarkEnd w:id="56"/>
@@ -20516,7 +20534,7 @@
       </w:r>
     </w:p>
     <w:bookmarkEnd w:id="69"/>
-    <w:bookmarkStart w:id="77" w:name="verification-source-manifest-and-lint"/>
+    <w:bookmarkStart w:id="78" w:name="verification-source-manifest-and-lint"/>
     <w:p>
       <w:pPr>
         <w:pStyle w:val="Heading1"/>
@@ -21382,6 +21400,83 @@
         <w:t xml:space="preserve">response dependency, or end-to-end forward progress.</w:t>
       </w:r>
     </w:p>
+    <w:p>
+      <w:pPr>
+        <w:pStyle w:val="BodyText"/>
+      </w:pPr>
+      <w:r>
+        <w:t xml:space="preserve">Binding an assertion module that takes an unpacked array port is not portable</w:t>
+      </w:r>
+      <w:r>
+        <w:t xml:space="preserve"> </w:t>
+      </w:r>
+      <w:r>
+        <w:t xml:space="preserve">across simulators, so</w:t>
+      </w:r>
+      <w:r>
+        <w:t xml:space="preserve"> </w:t>
+      </w:r>
+      <w:r>
+        <w:rPr>
+          <w:rStyle w:val="VerbatimChar"/>
+        </w:rPr>
+        <w:t xml:space="preserve">chi_pos</w:t>
+      </w:r>
+      <w:r>
+        <w:t xml:space="preserve"> </w:t>
+      </w:r>
+      <w:r>
+        <w:t xml:space="preserve">exports its line-address array packed. This</w:t>
+      </w:r>
+      <w:r>
+        <w:t xml:space="preserve"> </w:t>
+      </w:r>
+      <w:r>
+        <w:t xml:space="preserve">is the reason</w:t>
+      </w:r>
+      <w:r>
+        <w:t xml:space="preserve"> </w:t>
+      </w:r>
+      <w:r>
+        <w:rPr>
+          <w:rStyle w:val="VerbatimChar"/>
+        </w:rPr>
+        <w:t xml:space="preserve">chi_pos.lineAddr</w:t>
+      </w:r>
+      <w:r>
+        <w:t xml:space="preserve">,</w:t>
+      </w:r>
+      <w:r>
+        <w:t xml:space="preserve"> </w:t>
+      </w:r>
+      <w:r>
+        <w:rPr>
+          <w:rStyle w:val="VerbatimChar"/>
+        </w:rPr>
+        <w:t xml:space="preserve">chi_hazard.activeLineAddr</w:t>
+      </w:r>
+      <w:r>
+        <w:t xml:space="preserve"> </w:t>
+      </w:r>
+      <w:r>
+        <w:t xml:space="preserve">and</w:t>
+      </w:r>
+      <w:r>
+        <w:t xml:space="preserve"> </w:t>
+      </w:r>
+      <w:r>
+        <w:rPr>
+          <w:rStyle w:val="VerbatimChar"/>
+        </w:rPr>
+        <w:t xml:space="preserve">chi_ordering_sva.lineAddr</w:t>
+      </w:r>
+      <w:r>
+        <w:t xml:space="preserve"> </w:t>
+      </w:r>
+      <w:r>
+        <w:t xml:space="preserve">are packed two-dimensional rather than unpacked.</w:t>
+      </w:r>
+    </w:p>
     <w:bookmarkEnd w:id="70"/>
     <w:bookmarkStart w:id="71" w:name="functional-coverage-outline"/>
     <w:p>
@@ -22207,6 +22302,62 @@
         <w:t xml:space="preserve">and are not product hierarchy.</w:t>
       </w:r>
     </w:p>
+    <w:p>
+      <w:pPr>
+        <w:pStyle w:val="BodyText"/>
+      </w:pPr>
+      <w:r>
+        <w:rPr>
+          <w:rStyle w:val="VerbatimChar"/>
+        </w:rPr>
+        <w:t xml:space="preserve">tb/chi_smoke_tb.sv</w:t>
+      </w:r>
+      <w:r>
+        <w:t xml:space="preserve"> </w:t>
+      </w:r>
+      <w:r>
+        <w:t xml:space="preserve">is the simulation top described in Section 12.7. It is</w:t>
+      </w:r>
+      <w:r>
+        <w:t xml:space="preserve"> </w:t>
+      </w:r>
+      <w:r>
+        <w:t xml:space="preserve">also outside</w:t>
+      </w:r>
+      <w:r>
+        <w:t xml:space="preserve"> </w:t>
+      </w:r>
+      <w:r>
+        <w:rPr>
+          <w:rStyle w:val="VerbatimChar"/>
+        </w:rPr>
+        <w:t xml:space="preserve">filelist.f</w:t>
+      </w:r>
+      <w:r>
+        <w:t xml:space="preserve">, and it is not synthesizable.</w:t>
+      </w:r>
+      <w:r>
+        <w:t xml:space="preserve"> </w:t>
+      </w:r>
+      <w:r>
+        <w:rPr>
+          <w:rStyle w:val="VerbatimChar"/>
+        </w:rPr>
+        <w:t xml:space="preserve">Makefile</w:t>
+      </w:r>
+      <w:r>
+        <w:t xml:space="preserve"> </w:t>
+      </w:r>
+      <w:r>
+        <w:t xml:space="preserve">drives</w:t>
+      </w:r>
+      <w:r>
+        <w:t xml:space="preserve"> </w:t>
+      </w:r>
+      <w:r>
+        <w:t xml:space="preserve">lint, the smoke run and document generation.</w:t>
+      </w:r>
+    </w:p>
     <w:bookmarkEnd w:id="74"/>
     <w:bookmarkStart w:id="75" w:name="passing-lint-commands"/>
     <w:p>
@@ -23088,13 +23239,13 @@
       </w:r>
     </w:p>
     <w:bookmarkEnd w:id="75"/>
-    <w:bookmarkStart w:id="76" w:name="regenerating-this-document"/>
+    <w:bookmarkStart w:id="76" w:name="reset-and-idle-smoke-run"/>
     <w:p>
       <w:pPr>
         <w:pStyle w:val="Heading2"/>
       </w:pPr>
       <w:r>
-        <w:t xml:space="preserve">12.7 Regenerating this document</w:t>
+        <w:t xml:space="preserve">12.7 Reset and idle smoke run</w:t>
       </w:r>
     </w:p>
     <w:p>
@@ -23102,34 +23253,73 @@
         <w:pStyle w:val="FirstParagraph"/>
       </w:pPr>
       <w:r>
-        <w:t xml:space="preserve">The Word file in</w:t>
-      </w:r>
-      <w:r>
-        <w:t xml:space="preserve"> </w:t>
-      </w:r>
-      <w:r>
-        <w:rPr>
-          <w:rStyle w:val="VerbatimChar"/>
-        </w:rPr>
-        <w:t xml:space="preserve">docs/</w:t>
-      </w:r>
-      <w:r>
-        <w:t xml:space="preserve"> </w:t>
-      </w:r>
-      <w:r>
-        <w:t xml:space="preserve">is generated from</w:t>
-      </w:r>
-      <w:r>
-        <w:t xml:space="preserve"> </w:t>
-      </w:r>
-      <w:r>
-        <w:rPr>
-          <w:rStyle w:val="VerbatimChar"/>
-        </w:rPr>
-        <w:t xml:space="preserve">doc-src/</w:t>
-      </w:r>
-      <w:r>
-        <w:t xml:space="preserve">:</w:t>
+        <w:t xml:space="preserve">Lint elaborates the design but never executes it, so neither the</w:t>
+      </w:r>
+      <w:r>
+        <w:t xml:space="preserve"> </w:t>
+      </w:r>
+      <w:r>
+        <w:rPr>
+          <w:rStyle w:val="VerbatimChar"/>
+        </w:rPr>
+        <w:t xml:space="preserve">chi_cfg_check</w:t>
+      </w:r>
+      <w:r>
+        <w:t xml:space="preserve"> </w:t>
+      </w:r>
+      <w:r>
+        <w:t xml:space="preserve">elaboration checks of Section 3.2 nor any bound assertion</w:t>
+      </w:r>
+      <w:r>
+        <w:t xml:space="preserve"> </w:t>
+      </w:r>
+      <w:r>
+        <w:t xml:space="preserve">actually runs during a lint pass.</w:t>
+      </w:r>
+      <w:r>
+        <w:t xml:space="preserve"> </w:t>
+      </w:r>
+      <w:r>
+        <w:rPr>
+          <w:rStyle w:val="VerbatimChar"/>
+        </w:rPr>
+        <w:t xml:space="preserve">tb/chi_smoke_tb.sv</w:t>
+      </w:r>
+      <w:r>
+        <w:t xml:space="preserve"> </w:t>
+      </w:r>
+      <w:r>
+        <w:t xml:space="preserve">closes that gap. It is</w:t>
+      </w:r>
+      <w:r>
+        <w:t xml:space="preserve"> </w:t>
+      </w:r>
+      <w:r>
+        <w:t xml:space="preserve">not a protocol testbench: it instantiates</w:t>
+      </w:r>
+      <w:r>
+        <w:t xml:space="preserve"> </w:t>
+      </w:r>
+      <w:r>
+        <w:rPr>
+          <w:rStyle w:val="VerbatimChar"/>
+        </w:rPr>
+        <w:t xml:space="preserve">chi_interconnect_compile</w:t>
+      </w:r>
+      <w:r>
+        <w:t xml:space="preserve">, holds</w:t>
+      </w:r>
+      <w:r>
+        <w:t xml:space="preserve"> </w:t>
+      </w:r>
+      <w:r>
+        <w:t xml:space="preserve">synchronous reset for eight cycles, releases it, and runs the idle fabric for</w:t>
+      </w:r>
+      <w:r>
+        <w:t xml:space="preserve"> </w:t>
+      </w:r>
+      <w:r>
+        <w:t xml:space="preserve">512 cycles.</w:t>
       </w:r>
     </w:p>
     <w:p>
@@ -23146,7 +23336,7 @@
         <w:rPr>
           <w:rStyle w:val="NormalTok"/>
         </w:rPr>
-        <w:t xml:space="preserve"> doc</w:t>
+        <w:t xml:space="preserve"> sim</w:t>
       </w:r>
     </w:p>
     <w:p>
@@ -23154,7 +23344,135 @@
         <w:pStyle w:val="FirstParagraph"/>
       </w:pPr>
       <w:r>
-        <w:t xml:space="preserve">which runs:</w:t>
+        <w:t xml:space="preserve">The run fails if any elaboration check calls</w:t>
+      </w:r>
+      <w:r>
+        <w:t xml:space="preserve"> </w:t>
+      </w:r>
+      <w:r>
+        <w:rPr>
+          <w:rStyle w:val="VerbatimChar"/>
+        </w:rPr>
+        <w:t xml:space="preserve">$fatal</w:t>
+      </w:r>
+      <w:r>
+        <w:t xml:space="preserve">, if any bound assertion</w:t>
+      </w:r>
+      <w:r>
+        <w:t xml:space="preserve"> </w:t>
+      </w:r>
+      <w:r>
+        <w:t xml:space="preserve">fires out of reset, if the idle fabric presents a snoop flit to an RN-F or a</w:t>
+      </w:r>
+      <w:r>
+        <w:t xml:space="preserve"> </w:t>
+      </w:r>
+      <w:r>
+        <w:t xml:space="preserve">request flit to an SN-F, or if any port reports a flit parity or L-Credit</w:t>
+      </w:r>
+      <w:r>
+        <w:t xml:space="preserve"> </w:t>
+      </w:r>
+      <w:r>
+        <w:t xml:space="preserve">error while no traffic is in flight. Because the elaboration checks execute,</w:t>
+      </w:r>
+      <w:r>
+        <w:t xml:space="preserve"> </w:t>
+      </w:r>
+      <w:r>
+        <w:t xml:space="preserve">this run is what confirms at runtime that the default configuration is legal,</w:t>
+      </w:r>
+      <w:r>
+        <w:t xml:space="preserve"> </w:t>
+      </w:r>
+      <w:r>
+        <w:t xml:space="preserve">that every node has a unique placement, that each NodeID’s routing fields</w:t>
+      </w:r>
+      <w:r>
+        <w:t xml:space="preserve"> </w:t>
+      </w:r>
+      <w:r>
+        <w:t xml:space="preserve">decode back to the placement that produced it, and that all four derived flit</w:t>
+      </w:r>
+      <w:r>
+        <w:t xml:space="preserve"> </w:t>
+      </w:r>
+      <w:r>
+        <w:t xml:space="preserve">widths fall inside the Issue H ranges.</w:t>
+      </w:r>
+    </w:p>
+    <w:p>
+      <w:pPr>
+        <w:pStyle w:val="BodyText"/>
+      </w:pPr>
+      <w:r>
+        <w:t xml:space="preserve">The node count is derived from</w:t>
+      </w:r>
+      <w:r>
+        <w:t xml:space="preserve"> </w:t>
+      </w:r>
+      <w:r>
+        <w:rPr>
+          <w:rStyle w:val="VerbatimChar"/>
+        </w:rPr>
+        <w:t xml:space="preserve">CHI_CFG_DEFAULT</w:t>
+      </w:r>
+      <w:r>
+        <w:t xml:space="preserve"> </w:t>
+      </w:r>
+      <w:r>
+        <w:t xml:space="preserve">rather than written as a</w:t>
+      </w:r>
+      <w:r>
+        <w:t xml:space="preserve"> </w:t>
+      </w:r>
+      <w:r>
+        <w:t xml:space="preserve">literal, so the testbench follows a reconfigured node list without edits.</w:t>
+      </w:r>
+    </w:p>
+    <w:bookmarkEnd w:id="76"/>
+    <w:bookmarkStart w:id="77" w:name="regenerating-this-document"/>
+    <w:p>
+      <w:pPr>
+        <w:pStyle w:val="Heading2"/>
+      </w:pPr>
+      <w:r>
+        <w:t xml:space="preserve">12.8 Regenerating this document</w:t>
+      </w:r>
+    </w:p>
+    <w:p>
+      <w:pPr>
+        <w:pStyle w:val="FirstParagraph"/>
+      </w:pPr>
+      <w:r>
+        <w:t xml:space="preserve">The Word file in</w:t>
+      </w:r>
+      <w:r>
+        <w:t xml:space="preserve"> </w:t>
+      </w:r>
+      <w:r>
+        <w:rPr>
+          <w:rStyle w:val="VerbatimChar"/>
+        </w:rPr>
+        <w:t xml:space="preserve">docs/</w:t>
+      </w:r>
+      <w:r>
+        <w:t xml:space="preserve"> </w:t>
+      </w:r>
+      <w:r>
+        <w:t xml:space="preserve">is generated from</w:t>
+      </w:r>
+      <w:r>
+        <w:t xml:space="preserve"> </w:t>
+      </w:r>
+      <w:r>
+        <w:rPr>
+          <w:rStyle w:val="VerbatimChar"/>
+        </w:rPr>
+        <w:t xml:space="preserve">doc-src/</w:t>
+      </w:r>
+      <w:r>
+        <w:t xml:space="preserve">:</w:t>
       </w:r>
     </w:p>
     <w:p>
@@ -23163,72 +23481,15 @@
       </w:pPr>
       <w:r>
         <w:rPr>
-          <w:rStyle w:val="ExtensionTok"/>
-        </w:rPr>
-        <w:t xml:space="preserve">pandoc</w:t>
+          <w:rStyle w:val="FunctionTok"/>
+        </w:rPr>
+        <w:t xml:space="preserve">make</w:t>
       </w:r>
       <w:r>
         <w:rPr>
           <w:rStyle w:val="NormalTok"/>
         </w:rPr>
-        <w:t xml:space="preserve"> doc-src/chi_interconnect_design_spec.md </w:t>
-      </w:r>
-      <w:r>
-        <w:rPr>
-          <w:rStyle w:val="AttributeTok"/>
-        </w:rPr>
-        <w:t xml:space="preserve">--toc</w:t>
-      </w:r>
-      <w:r>
-        <w:rPr>
-          <w:rStyle w:val="NormalTok"/>
-        </w:rPr>
-        <w:t xml:space="preserve"> </w:t>
-      </w:r>
-      <w:r>
-        <w:rPr>
-          <w:rStyle w:val="AttributeTok"/>
-        </w:rPr>
-        <w:t xml:space="preserve">--toc-depth</w:t>
-      </w:r>
-      <w:r>
-        <w:rPr>
-          <w:rStyle w:val="OperatorTok"/>
-        </w:rPr>
-        <w:t xml:space="preserve">=</w:t>
-      </w:r>
-      <w:r>
-        <w:rPr>
-          <w:rStyle w:val="NormalTok"/>
-        </w:rPr>
-        <w:t xml:space="preserve">2 </w:t>
-      </w:r>
-      <w:r>
-        <w:rPr>
-          <w:rStyle w:val="DataTypeTok"/>
-        </w:rPr>
-        <w:t xml:space="preserve">\</w:t>
-      </w:r>
-      <w:r>
-        <w:br/>
-      </w:r>
-      <w:r>
-        <w:rPr>
-          <w:rStyle w:val="NormalTok"/>
-        </w:rPr>
-        <w:t xml:space="preserve">  </w:t>
-      </w:r>
-      <w:r>
-        <w:rPr>
-          <w:rStyle w:val="AttributeTok"/>
-        </w:rPr>
-        <w:t xml:space="preserve">-o</w:t>
-      </w:r>
-      <w:r>
-        <w:rPr>
-          <w:rStyle w:val="NormalTok"/>
-        </w:rPr>
-        <w:t xml:space="preserve"> docs/chi_interconnect_design_spec.docx</w:t>
+        <w:t xml:space="preserve"> doc</w:t>
       </w:r>
     </w:p>
     <w:p>
@@ -23236,6 +23497,88 @@
         <w:pStyle w:val="FirstParagraph"/>
       </w:pPr>
       <w:r>
+        <w:t xml:space="preserve">which runs:</w:t>
+      </w:r>
+    </w:p>
+    <w:p>
+      <w:pPr>
+        <w:pStyle w:val="SourceCode"/>
+      </w:pPr>
+      <w:r>
+        <w:rPr>
+          <w:rStyle w:val="ExtensionTok"/>
+        </w:rPr>
+        <w:t xml:space="preserve">pandoc</w:t>
+      </w:r>
+      <w:r>
+        <w:rPr>
+          <w:rStyle w:val="NormalTok"/>
+        </w:rPr>
+        <w:t xml:space="preserve"> doc-src/chi_interconnect_design_spec.md </w:t>
+      </w:r>
+      <w:r>
+        <w:rPr>
+          <w:rStyle w:val="AttributeTok"/>
+        </w:rPr>
+        <w:t xml:space="preserve">--toc</w:t>
+      </w:r>
+      <w:r>
+        <w:rPr>
+          <w:rStyle w:val="NormalTok"/>
+        </w:rPr>
+        <w:t xml:space="preserve"> </w:t>
+      </w:r>
+      <w:r>
+        <w:rPr>
+          <w:rStyle w:val="AttributeTok"/>
+        </w:rPr>
+        <w:t xml:space="preserve">--toc-depth</w:t>
+      </w:r>
+      <w:r>
+        <w:rPr>
+          <w:rStyle w:val="OperatorTok"/>
+        </w:rPr>
+        <w:t xml:space="preserve">=</w:t>
+      </w:r>
+      <w:r>
+        <w:rPr>
+          <w:rStyle w:val="NormalTok"/>
+        </w:rPr>
+        <w:t xml:space="preserve">2 </w:t>
+      </w:r>
+      <w:r>
+        <w:rPr>
+          <w:rStyle w:val="DataTypeTok"/>
+        </w:rPr>
+        <w:t xml:space="preserve">\</w:t>
+      </w:r>
+      <w:r>
+        <w:br/>
+      </w:r>
+      <w:r>
+        <w:rPr>
+          <w:rStyle w:val="NormalTok"/>
+        </w:rPr>
+        <w:t xml:space="preserve">  </w:t>
+      </w:r>
+      <w:r>
+        <w:rPr>
+          <w:rStyle w:val="AttributeTok"/>
+        </w:rPr>
+        <w:t xml:space="preserve">-o</w:t>
+      </w:r>
+      <w:r>
+        <w:rPr>
+          <w:rStyle w:val="NormalTok"/>
+        </w:rPr>
+        <w:t xml:space="preserve"> docs/chi_interconnect_design_spec.docx</w:t>
+      </w:r>
+    </w:p>
+    <w:p>
+      <w:pPr>
+        <w:pStyle w:val="FirstParagraph"/>
+      </w:pPr>
+      <w:r>
         <w:t xml:space="preserve">Section numbers are written into the headings rather than generated, so that</w:t>
       </w:r>
       <w:r>
@@ -23245,9 +23588,9 @@
         <w:t xml:space="preserve">the cross-references in the prose stay correct in every output format.</w:t>
       </w:r>
     </w:p>
-    <w:bookmarkEnd w:id="76"/>
     <w:bookmarkEnd w:id="77"/>
-    <w:bookmarkStart w:id="80" w:name="X5bf108ade8508cab34b28d325ecb3ab81501255"/>
+    <w:bookmarkEnd w:id="78"/>
+    <w:bookmarkStart w:id="81" w:name="X5bf108ade8508cab34b28d325ecb3ab81501255"/>
     <w:p>
       <w:pPr>
         <w:pStyle w:val="Heading1"/>
@@ -23256,7 +23599,7 @@
         <w:t xml:space="preserve">13 Open issues, known limitations and decisions</w:t>
       </w:r>
     </w:p>
-    <w:bookmarkStart w:id="78" w:name="known-limitations"/>
+    <w:bookmarkStart w:id="79" w:name="known-limitations"/>
     <w:p>
       <w:pPr>
         <w:pStyle w:val="Heading2"/>
@@ -23409,7 +23752,19 @@
         <w:pStyle w:val="Compact"/>
       </w:pPr>
       <w:r>
-        <w:t xml:space="preserve">Far atomics are always executed at the Home, and DCT has no fallback path.</w:t>
+        <w:t xml:space="preserve">Atomics are always executed at the Home rather than negotiated to the</w:t>
+      </w:r>
+      <w:r>
+        <w:t xml:space="preserve"> </w:t>
+      </w:r>
+      <w:r>
+        <w:t xml:space="preserve">Subordinate, the atomic datapath is 64 bits so wider operands are</w:t>
+      </w:r>
+      <w:r>
+        <w:t xml:space="preserve"> </w:t>
+      </w:r>
+      <w:r>
+        <w:t xml:space="preserve">unsupported, and DCT has no fallback path.</w:t>
       </w:r>
     </w:p>
     <w:p>
@@ -23502,8 +23857,8 @@
         <w:t xml:space="preserve">performance characterization.</w:t>
       </w:r>
     </w:p>
-    <w:bookmarkEnd w:id="78"/>
-    <w:bookmarkStart w:id="79" w:name="implementation-defined-decision-log"/>
+    <w:bookmarkEnd w:id="79"/>
+    <w:bookmarkStart w:id="80" w:name="implementation-defined-decision-log"/>
     <w:p>
       <w:pPr>
         <w:pStyle w:val="Heading2"/>
@@ -24297,9 +24652,94 @@
           </w:p>
         </w:tc>
       </w:tr>
+      <w:tr>
+        <w:tc>
+          <w:tcPr/>
+          <w:p>
+            <w:pPr>
+              <w:pStyle w:val="Compact"/>
+              <w:jc w:val="left"/>
+            </w:pPr>
+            <w:r>
+              <w:t xml:space="preserve">Bound assertion array ports</w:t>
+            </w:r>
+          </w:p>
+        </w:tc>
+        <w:tc>
+          <w:tcPr/>
+          <w:p>
+            <w:pPr>
+              <w:pStyle w:val="Compact"/>
+              <w:jc w:val="left"/>
+            </w:pPr>
+            <w:r>
+              <w:t xml:space="preserve">Packed two-dimensional, never unpacked</w:t>
+            </w:r>
+          </w:p>
+        </w:tc>
+        <w:tc>
+          <w:tcPr/>
+          <w:p>
+            <w:pPr>
+              <w:pStyle w:val="Compact"/>
+              <w:jc w:val="left"/>
+            </w:pPr>
+            <w:r>
+              <w:rPr>
+                <w:rStyle w:val="VerbatimChar"/>
+              </w:rPr>
+              <w:t xml:space="preserve">bind</w:t>
+            </w:r>
+            <w:r>
+              <w:t xml:space="preserve"> </w:t>
+            </w:r>
+            <w:r>
+              <w:t xml:space="preserve">elaborates portably across simulators.</w:t>
+            </w:r>
+          </w:p>
+        </w:tc>
+      </w:tr>
+      <w:tr>
+        <w:tc>
+          <w:tcPr/>
+          <w:p>
+            <w:pPr>
+              <w:pStyle w:val="Compact"/>
+              <w:jc w:val="left"/>
+            </w:pPr>
+            <w:r>
+              <w:t xml:space="preserve">Loop bounds in helper functions</w:t>
+            </w:r>
+          </w:p>
+        </w:tc>
+        <w:tc>
+          <w:tcPr/>
+          <w:p>
+            <w:pPr>
+              <w:pStyle w:val="Compact"/>
+              <w:jc w:val="left"/>
+            </w:pPr>
+            <w:r>
+              <w:t xml:space="preserve">Computed once into a local, never a call in the loop condition</w:t>
+            </w:r>
+          </w:p>
+        </w:tc>
+        <w:tc>
+          <w:tcPr/>
+          <w:p>
+            <w:pPr>
+              <w:pStyle w:val="Compact"/>
+              <w:jc w:val="left"/>
+            </w:pPr>
+            <w:r>
+              <w:t xml:space="preserve">The bound is not recomputed per iteration, and the design simulates.</w:t>
+            </w:r>
+          </w:p>
+        </w:tc>
+      </w:tr>
     </w:tbl>
-    <w:bookmarkEnd w:id="79"/>
     <w:bookmarkEnd w:id="80"/>
+    <w:bookmarkEnd w:id="81"/>
     <w:sectPr/>
   </w:body>
 </w:document>

</xml_diff>

<commit_message>
docs: describe what the smoke run covers, including link bring-up
Co-authored-by: swasthikamath <swasthikamath@gmail.com>
</commit_message>
<xml_diff>
--- a/docs/chi_interconnect_design_spec.docx
+++ b/docs/chi_interconnect_design_spec.docx
@@ -22310,19 +22310,40 @@
         <w:rPr>
           <w:rStyle w:val="VerbatimChar"/>
         </w:rPr>
+        <w:t xml:space="preserve">tb/chi_node_link_bfm.sv</w:t>
+      </w:r>
+      <w:r>
+        <w:t xml:space="preserve">,</w:t>
+      </w:r>
+      <w:r>
+        <w:t xml:space="preserve"> </w:t>
+      </w:r>
+      <w:r>
+        <w:rPr>
+          <w:rStyle w:val="VerbatimChar"/>
+        </w:rPr>
+        <w:t xml:space="preserve">tb/chi_sim_harness.sv</w:t>
+      </w:r>
+      <w:r>
+        <w:t xml:space="preserve"> </w:t>
+      </w:r>
+      <w:r>
+        <w:t xml:space="preserve">and</w:t>
+      </w:r>
+      <w:r>
+        <w:t xml:space="preserve"> </w:t>
+      </w:r>
+      <w:r>
+        <w:rPr>
+          <w:rStyle w:val="VerbatimChar"/>
+        </w:rPr>
         <w:t xml:space="preserve">tb/chi_smoke_tb.sv</w:t>
       </w:r>
       <w:r>
         <w:t xml:space="preserve"> </w:t>
       </w:r>
       <w:r>
-        <w:t xml:space="preserve">is the simulation top described in Section 12.7. It is</w:t>
-      </w:r>
-      <w:r>
-        <w:t xml:space="preserve"> </w:t>
-      </w:r>
-      <w:r>
-        <w:t xml:space="preserve">also outside</w:t>
+        <w:t xml:space="preserve">are the simulation files described in Section 12.7. They are also outside</w:t>
       </w:r>
       <w:r>
         <w:t xml:space="preserve"> </w:t>
@@ -22334,7 +22355,7 @@
         <w:t xml:space="preserve">filelist.f</w:t>
       </w:r>
       <w:r>
-        <w:t xml:space="preserve">, and it is not synthesizable.</w:t>
+        <w:t xml:space="preserve">, and they are not synthesizable.</w:t>
       </w:r>
       <w:r>
         <w:t xml:space="preserve"> </w:t>
@@ -22349,13 +22370,13 @@
         <w:t xml:space="preserve"> </w:t>
       </w:r>
       <w:r>
-        <w:t xml:space="preserve">drives</w:t>
-      </w:r>
-      <w:r>
-        <w:t xml:space="preserve"> </w:t>
-      </w:r>
-      <w:r>
-        <w:t xml:space="preserve">lint, the smoke run and document generation.</w:t>
+        <w:t xml:space="preserve">drives lint, the</w:t>
+      </w:r>
+      <w:r>
+        <w:t xml:space="preserve"> </w:t>
+      </w:r>
+      <w:r>
+        <w:t xml:space="preserve">smoke run and document generation.</w:t>
       </w:r>
     </w:p>
     <w:bookmarkEnd w:id="74"/>
@@ -23239,13 +23260,13 @@
       </w:r>
     </w:p>
     <w:bookmarkEnd w:id="75"/>
-    <w:bookmarkStart w:id="76" w:name="reset-and-idle-smoke-run"/>
+    <w:bookmarkStart w:id="76" w:name="reset-link-bring-up-and-idle-smoke-run"/>
     <w:p>
       <w:pPr>
         <w:pStyle w:val="Heading2"/>
       </w:pPr>
       <w:r>
-        <w:t xml:space="preserve">12.7 Reset and idle smoke run</w:t>
+        <w:t xml:space="preserve">12.7 Reset, link bring-up and idle smoke run</w:t>
       </w:r>
     </w:p>
     <w:p>
@@ -23289,37 +23310,7 @@
         <w:t xml:space="preserve"> </w:t>
       </w:r>
       <w:r>
-        <w:t xml:space="preserve">closes that gap. It is</w:t>
-      </w:r>
-      <w:r>
-        <w:t xml:space="preserve"> </w:t>
-      </w:r>
-      <w:r>
-        <w:t xml:space="preserve">not a protocol testbench: it instantiates</w:t>
-      </w:r>
-      <w:r>
-        <w:t xml:space="preserve"> </w:t>
-      </w:r>
-      <w:r>
-        <w:rPr>
-          <w:rStyle w:val="VerbatimChar"/>
-        </w:rPr>
-        <w:t xml:space="preserve">chi_interconnect_compile</w:t>
-      </w:r>
-      <w:r>
-        <w:t xml:space="preserve">, holds</w:t>
-      </w:r>
-      <w:r>
-        <w:t xml:space="preserve"> </w:t>
-      </w:r>
-      <w:r>
-        <w:t xml:space="preserve">synchronous reset for eight cycles, releases it, and runs the idle fabric for</w:t>
-      </w:r>
-      <w:r>
-        <w:t xml:space="preserve"> </w:t>
-      </w:r>
-      <w:r>
-        <w:t xml:space="preserve">512 cycles.</w:t>
+        <w:t xml:space="preserve">closes that gap:</w:t>
       </w:r>
     </w:p>
     <w:p>
@@ -23344,61 +23335,13 @@
         <w:pStyle w:val="FirstParagraph"/>
       </w:pPr>
       <w:r>
-        <w:t xml:space="preserve">The run fails if any elaboration check calls</w:t>
-      </w:r>
-      <w:r>
-        <w:t xml:space="preserve"> </w:t>
-      </w:r>
-      <w:r>
-        <w:rPr>
-          <w:rStyle w:val="VerbatimChar"/>
-        </w:rPr>
-        <w:t xml:space="preserve">$fatal</w:t>
-      </w:r>
-      <w:r>
-        <w:t xml:space="preserve">, if any bound assertion</w:t>
-      </w:r>
-      <w:r>
-        <w:t xml:space="preserve"> </w:t>
-      </w:r>
-      <w:r>
-        <w:t xml:space="preserve">fires out of reset, if the idle fabric presents a snoop flit to an RN-F or a</w:t>
-      </w:r>
-      <w:r>
-        <w:t xml:space="preserve"> </w:t>
-      </w:r>
-      <w:r>
-        <w:t xml:space="preserve">request flit to an SN-F, or if any port reports a flit parity or L-Credit</w:t>
-      </w:r>
-      <w:r>
-        <w:t xml:space="preserve"> </w:t>
-      </w:r>
-      <w:r>
-        <w:t xml:space="preserve">error while no traffic is in flight. Because the elaboration checks execute,</w:t>
-      </w:r>
-      <w:r>
-        <w:t xml:space="preserve"> </w:t>
-      </w:r>
-      <w:r>
-        <w:t xml:space="preserve">this run is what confirms at runtime that the default configuration is legal,</w:t>
-      </w:r>
-      <w:r>
-        <w:t xml:space="preserve"> </w:t>
-      </w:r>
-      <w:r>
-        <w:t xml:space="preserve">that every node has a unique placement, that each NodeID’s routing fields</w:t>
-      </w:r>
-      <w:r>
-        <w:t xml:space="preserve"> </w:t>
-      </w:r>
-      <w:r>
-        <w:t xml:space="preserve">decode back to the placement that produced it, and that all four derived flit</w:t>
-      </w:r>
-      <w:r>
-        <w:t xml:space="preserve"> </w:t>
-      </w:r>
-      <w:r>
-        <w:t xml:space="preserve">widths fall inside the Issue H ranges.</w:t>
+        <w:t xml:space="preserve">This is not a protocol testbench. There is no traffic generator, scoreboard</w:t>
+      </w:r>
+      <w:r>
+        <w:t xml:space="preserve"> </w:t>
+      </w:r>
+      <w:r>
+        <w:t xml:space="preserve">or coverage model. It checks three things.</w:t>
       </w:r>
     </w:p>
     <w:p>
@@ -23406,7 +23349,196 @@
         <w:pStyle w:val="BodyText"/>
       </w:pPr>
       <w:r>
-        <w:t xml:space="preserve">The node count is derived from</w:t>
+        <w:t xml:space="preserve">First, the elaboration checks execute. This is what confirms at runtime that</w:t>
+      </w:r>
+      <w:r>
+        <w:t xml:space="preserve"> </w:t>
+      </w:r>
+      <w:r>
+        <w:t xml:space="preserve">the default configuration is legal, that every node has a unique placement,</w:t>
+      </w:r>
+      <w:r>
+        <w:t xml:space="preserve"> </w:t>
+      </w:r>
+      <w:r>
+        <w:t xml:space="preserve">that each NodeID’s routing fields decode back to the placement that produced</w:t>
+      </w:r>
+      <w:r>
+        <w:t xml:space="preserve"> </w:t>
+      </w:r>
+      <w:r>
+        <w:t xml:space="preserve">it, and that all four derived flit widths fall inside the Issue H ranges.</w:t>
+      </w:r>
+    </w:p>
+    <w:p>
+      <w:pPr>
+        <w:pStyle w:val="BodyText"/>
+      </w:pPr>
+      <w:r>
+        <w:t xml:space="preserve">Second, every link comes up. The interconnect owns only its half of each</w:t>
+      </w:r>
+      <w:r>
+        <w:t xml:space="preserve"> </w:t>
+      </w:r>
+      <w:r>
+        <w:t xml:space="preserve">link: it initiates the direction it transmits on and acknowledges the</w:t>
+      </w:r>
+      <w:r>
+        <w:t xml:space="preserve"> </w:t>
+      </w:r>
+      <w:r>
+        <w:t xml:space="preserve">direction it receives on. Without a peer on the node side, every receive link</w:t>
+      </w:r>
+      <w:r>
+        <w:t xml:space="preserve"> </w:t>
+      </w:r>
+      <w:r>
+        <w:t xml:space="preserve">stays in STOP and no L-Credit is ever issued, so</w:t>
+      </w:r>
+      <w:r>
+        <w:t xml:space="preserve"> </w:t>
+      </w:r>
+      <w:r>
+        <w:rPr>
+          <w:rStyle w:val="VerbatimChar"/>
+        </w:rPr>
+        <w:t xml:space="preserve">chi_node_link_bfm</w:t>
+      </w:r>
+      <w:r>
+        <w:t xml:space="preserve"> </w:t>
+      </w:r>
+      <w:r>
+        <w:t xml:space="preserve">supplies</w:t>
+      </w:r>
+      <w:r>
+        <w:t xml:space="preserve"> </w:t>
+      </w:r>
+      <w:r>
+        <w:t xml:space="preserve">that peer. It is the mirror image of</w:t>
+      </w:r>
+      <w:r>
+        <w:t xml:space="preserve"> </w:t>
+      </w:r>
+      <w:r>
+        <w:rPr>
+          <w:rStyle w:val="VerbatimChar"/>
+        </w:rPr>
+        <w:t xml:space="preserve">chi_link_port</w:t>
+      </w:r>
+      <w:r>
+        <w:t xml:space="preserve">: it initiates the node</w:t>
+      </w:r>
+      <w:r>
+        <w:t xml:space="preserve"> </w:t>
+      </w:r>
+      <w:r>
+        <w:t xml:space="preserve">transmit direction, acknowledges the interconnect’s, issues L-Credits on the</w:t>
+      </w:r>
+      <w:r>
+        <w:t xml:space="preserve"> </w:t>
+      </w:r>
+      <w:r>
+        <w:t xml:space="preserve">channels the node receives, and counts and discards arriving flits.</w:t>
+      </w:r>
+      <w:r>
+        <w:t xml:space="preserve"> </w:t>
+      </w:r>
+      <w:r>
+        <w:rPr>
+          <w:rStyle w:val="VerbatimChar"/>
+        </w:rPr>
+        <w:t xml:space="preserve">chi_sim_harness</w:t>
+      </w:r>
+      <w:r>
+        <w:t xml:space="preserve"> </w:t>
+      </w:r>
+      <w:r>
+        <w:t xml:space="preserve">attaches one model per external port. The run requires all</w:t>
+      </w:r>
+      <w:r>
+        <w:t xml:space="preserve"> </w:t>
+      </w:r>
+      <w:r>
+        <w:t xml:space="preserve">eight external links to reach RUN in both directions and to hand over their</w:t>
+      </w:r>
+      <w:r>
+        <w:t xml:space="preserve"> </w:t>
+      </w:r>
+      <w:r>
+        <w:t xml:space="preserve">full</w:t>
+      </w:r>
+      <w:r>
+        <w:t xml:space="preserve"> </w:t>
+      </w:r>
+      <w:r>
+        <w:rPr>
+          <w:rStyle w:val="VerbatimChar"/>
+        </w:rPr>
+        <w:t xml:space="preserve">lcrdDepth</w:t>
+      </w:r>
+      <w:r>
+        <w:t xml:space="preserve"> </w:t>
+      </w:r>
+      <w:r>
+        <w:t xml:space="preserve">allocation on every applicable channel, and requires the</w:t>
+      </w:r>
+      <w:r>
+        <w:t xml:space="preserve"> </w:t>
+      </w:r>
+      <w:r>
+        <w:t xml:space="preserve">HN-F, HN-I and MN ordinals to report no link, since those are internal.</w:t>
+      </w:r>
+    </w:p>
+    <w:p>
+      <w:pPr>
+        <w:pStyle w:val="BodyText"/>
+      </w:pPr>
+      <w:r>
+        <w:t xml:space="preserve">Third, the fabric is silent when idle. With the links up and credits</w:t>
+      </w:r>
+      <w:r>
+        <w:t xml:space="preserve"> </w:t>
+      </w:r>
+      <w:r>
+        <w:t xml:space="preserve">available, the interconnect is free to transmit, so the run fails if any node</w:t>
+      </w:r>
+      <w:r>
+        <w:t xml:space="preserve"> </w:t>
+      </w:r>
+      <w:r>
+        <w:t xml:space="preserve">receives a flit while no request has been made. It also fails on any</w:t>
+      </w:r>
+      <w:r>
+        <w:t xml:space="preserve"> </w:t>
+      </w:r>
+      <w:r>
+        <w:t xml:space="preserve">elaboration</w:t>
+      </w:r>
+      <w:r>
+        <w:t xml:space="preserve"> </w:t>
+      </w:r>
+      <w:r>
+        <w:rPr>
+          <w:rStyle w:val="VerbatimChar"/>
+        </w:rPr>
+        <w:t xml:space="preserve">$fatal</w:t>
+      </w:r>
+      <w:r>
+        <w:t xml:space="preserve">, any bound assertion firing out of reset, any reported</w:t>
+      </w:r>
+      <w:r>
+        <w:t xml:space="preserve"> </w:t>
+      </w:r>
+      <w:r>
+        <w:t xml:space="preserve">flit parity or L-Credit error, and any link dropping out of RUN.</w:t>
+      </w:r>
+    </w:p>
+    <w:p>
+      <w:pPr>
+        <w:pStyle w:val="BodyText"/>
+      </w:pPr>
+      <w:r>
+        <w:t xml:space="preserve">Node and channel counts are derived from</w:t>
       </w:r>
       <w:r>
         <w:t xml:space="preserve"> </w:t>
@@ -23421,13 +23553,55 @@
         <w:t xml:space="preserve"> </w:t>
       </w:r>
       <w:r>
-        <w:t xml:space="preserve">rather than written as a</w:t>
-      </w:r>
-      <w:r>
-        <w:t xml:space="preserve"> </w:t>
-      </w:r>
-      <w:r>
-        <w:t xml:space="preserve">literal, so the testbench follows a reconfigured node list without edits.</w:t>
+        <w:t xml:space="preserve">rather than written</w:t>
+      </w:r>
+      <w:r>
+        <w:t xml:space="preserve"> </w:t>
+      </w:r>
+      <w:r>
+        <w:t xml:space="preserve">as literals, so the testbench follows a reconfigured node list without edits.</w:t>
+      </w:r>
+      <w:r>
+        <w:t xml:space="preserve"> </w:t>
+      </w:r>
+      <w:r>
+        <w:rPr>
+          <w:rStyle w:val="VerbatimChar"/>
+        </w:rPr>
+        <w:t xml:space="preserve">chi_sim_harness</w:t>
+      </w:r>
+      <w:r>
+        <w:t xml:space="preserve"> </w:t>
+      </w:r>
+      <w:r>
+        <w:t xml:space="preserve">rather than</w:t>
+      </w:r>
+      <w:r>
+        <w:t xml:space="preserve"> </w:t>
+      </w:r>
+      <w:r>
+        <w:rPr>
+          <w:rStyle w:val="VerbatimChar"/>
+        </w:rPr>
+        <w:t xml:space="preserve">chi_interconnect_compile</w:t>
+      </w:r>
+      <w:r>
+        <w:t xml:space="preserve"> </w:t>
+      </w:r>
+      <w:r>
+        <w:t xml:space="preserve">is the simulation</w:t>
+      </w:r>
+      <w:r>
+        <w:t xml:space="preserve"> </w:t>
+      </w:r>
+      <w:r>
+        <w:t xml:space="preserve">top, because the compile harness deliberately leaves the node-driven</w:t>
+      </w:r>
+      <w:r>
+        <w:t xml:space="preserve"> </w:t>
+      </w:r>
+      <w:r>
+        <w:t xml:space="preserve">interface inputs undriven for lint.</w:t>
       </w:r>
     </w:p>
     <w:bookmarkEnd w:id="76"/>

</xml_diff>

<commit_message>
rtl: do not build a link layer for a node class configured to zero
An interface array cannot be declared empty, so a class with a count of zero
still has a one-element sentinel port. The port loop ran to the array size
rather than the configured count, so it built a complete link layer for that
sentinel with nothing driving its node-side inputs. Verilator initialises to
zero, so the inputs read as quiet and the smoke run passed; under randomised
initialisation the receive link correctly reports a flit arriving while it is
not running.

Adds make simrand to replay the smoke run under several initialisation seeds,
and records in Section 12.8 where Verilator shaped this code and what a
four-state simulator would check that this flow cannot.

Co-authored-by: swasthikamath <swasthikamath@gmail.com>
</commit_message>
<xml_diff>
--- a/docs/chi_interconnect_design_spec.docx
+++ b/docs/chi_interconnect_design_spec.docx
@@ -20534,7 +20534,7 @@
       </w:r>
     </w:p>
     <w:bookmarkEnd w:id="69"/>
-    <w:bookmarkStart w:id="78" w:name="verification-source-manifest-and-lint"/>
+    <w:bookmarkStart w:id="79" w:name="verification-source-manifest-and-lint"/>
     <w:p>
       <w:pPr>
         <w:pStyle w:val="Heading1"/>
@@ -23604,14 +23604,29 @@
         <w:t xml:space="preserve">interface inputs undriven for lint.</w:t>
       </w:r>
     </w:p>
-    <w:bookmarkEnd w:id="76"/>
-    <w:bookmarkStart w:id="77" w:name="regenerating-this-document"/>
     <w:p>
       <w:pPr>
-        <w:pStyle w:val="Heading2"/>
+        <w:pStyle w:val="BodyText"/>
       </w:pPr>
       <w:r>
-        <w:t xml:space="preserve">12.8 Regenerating this document</w:t>
+        <w:t xml:space="preserve">The run is repeated with randomised initialisation:</w:t>
+      </w:r>
+    </w:p>
+    <w:p>
+      <w:pPr>
+        <w:pStyle w:val="SourceCode"/>
+      </w:pPr>
+      <w:r>
+        <w:rPr>
+          <w:rStyle w:val="FunctionTok"/>
+        </w:rPr>
+        <w:t xml:space="preserve">make</w:t>
+      </w:r>
+      <w:r>
+        <w:rPr>
+          <w:rStyle w:val="NormalTok"/>
+        </w:rPr>
+        <w:t xml:space="preserve"> simrand</w:t>
       </w:r>
     </w:p>
     <w:p>
@@ -23619,6 +23634,438 @@
         <w:pStyle w:val="FirstParagraph"/>
       </w:pPr>
       <w:r>
+        <w:t xml:space="preserve">Verilator initialises state to zero, so anything that depends on a register</w:t>
+      </w:r>
+      <w:r>
+        <w:t xml:space="preserve"> </w:t>
+      </w:r>
+      <w:r>
+        <w:t xml:space="preserve">or an input having been driven passes by accident. A four-state simulator</w:t>
+      </w:r>
+      <w:r>
+        <w:t xml:space="preserve"> </w:t>
+      </w:r>
+      <w:r>
+        <w:t xml:space="preserve">propagates X instead and fails.</w:t>
+      </w:r>
+      <w:r>
+        <w:t xml:space="preserve"> </w:t>
+      </w:r>
+      <w:r>
+        <w:rPr>
+          <w:rStyle w:val="VerbatimChar"/>
+        </w:rPr>
+        <w:t xml:space="preserve">make simrand</w:t>
+      </w:r>
+      <w:r>
+        <w:t xml:space="preserve"> </w:t>
+      </w:r>
+      <w:r>
+        <w:t xml:space="preserve">approximates that by replaying</w:t>
+      </w:r>
+      <w:r>
+        <w:t xml:space="preserve"> </w:t>
+      </w:r>
+      <w:r>
+        <w:t xml:space="preserve">the same run under several initialisation seeds, and it is the only part of</w:t>
+      </w:r>
+      <w:r>
+        <w:t xml:space="preserve"> </w:t>
+      </w:r>
+      <w:r>
+        <w:t xml:space="preserve">this flow that can catch a missing driver. It found one: a node class</w:t>
+      </w:r>
+      <w:r>
+        <w:t xml:space="preserve"> </w:t>
+      </w:r>
+      <w:r>
+        <w:t xml:space="preserve">configured to zero still has a one-element sentinel interface, because an</w:t>
+      </w:r>
+      <w:r>
+        <w:t xml:space="preserve"> </w:t>
+      </w:r>
+      <w:r>
+        <w:t xml:space="preserve">interface array cannot be declared empty, and the port loop originally built</w:t>
+      </w:r>
+      <w:r>
+        <w:t xml:space="preserve"> </w:t>
+      </w:r>
+      <w:r>
+        <w:t xml:space="preserve">a complete link layer for that sentinel. Nothing drove its node-side inputs.</w:t>
+      </w:r>
+      <w:r>
+        <w:t xml:space="preserve"> </w:t>
+      </w:r>
+      <w:r>
+        <w:t xml:space="preserve">The loop now runs to the configured count, so no link is built for a class</w:t>
+      </w:r>
+      <w:r>
+        <w:t xml:space="preserve"> </w:t>
+      </w:r>
+      <w:r>
+        <w:t xml:space="preserve">that does not exist.</w:t>
+      </w:r>
+    </w:p>
+    <w:bookmarkEnd w:id="76"/>
+    <w:bookmarkStart w:id="77" w:name="tool-dependence-of-this-code"/>
+    <w:p>
+      <w:pPr>
+        <w:pStyle w:val="Heading2"/>
+      </w:pPr>
+      <w:r>
+        <w:t xml:space="preserve">12.8 Tool dependence of this code</w:t>
+      </w:r>
+    </w:p>
+    <w:p>
+      <w:pPr>
+        <w:pStyle w:val="FirstParagraph"/>
+      </w:pPr>
+      <w:r>
+        <w:t xml:space="preserve">The flow above uses Verilator, which is not equivalent to a commercial</w:t>
+      </w:r>
+      <w:r>
+        <w:t xml:space="preserve"> </w:t>
+      </w:r>
+      <w:r>
+        <w:t xml:space="preserve">simulator. Three consequences are visible in the source and should be</w:t>
+      </w:r>
+      <w:r>
+        <w:t xml:space="preserve"> </w:t>
+      </w:r>
+      <w:r>
+        <w:t xml:space="preserve">understood before this RTL is taken into a Questa, Xcelium or VCS flow.</w:t>
+      </w:r>
+    </w:p>
+    <w:p>
+      <w:pPr>
+        <w:pStyle w:val="BodyText"/>
+      </w:pPr>
+      <w:r>
+        <w:t xml:space="preserve">First, some structure exists to satisfy Verilator rather than the language.</w:t>
+      </w:r>
+      <w:r>
+        <w:t xml:space="preserve"> </w:t>
+      </w:r>
+      <w:r>
+        <w:rPr>
+          <w:rStyle w:val="VerbatimChar"/>
+        </w:rPr>
+        <w:t xml:space="preserve">UNOPTFLAT</w:t>
+      </w:r>
+      <w:r>
+        <w:t xml:space="preserve"> </w:t>
+      </w:r>
+      <w:r>
+        <w:t xml:space="preserve">is reported per procedural block, not per signal, so a single</w:t>
+      </w:r>
+      <w:r>
+        <w:t xml:space="preserve"> </w:t>
+      </w:r>
+      <w:r>
+        <w:rPr>
+          <w:rStyle w:val="VerbatimChar"/>
+        </w:rPr>
+        <w:t xml:space="preserve">always_comb</w:t>
+      </w:r>
+      <w:r>
+        <w:t xml:space="preserve"> </w:t>
+      </w:r>
+      <w:r>
+        <w:t xml:space="preserve">that writes both directions of a handshake is flagged even when</w:t>
+      </w:r>
+      <w:r>
+        <w:t xml:space="preserve"> </w:t>
+      </w:r>
+      <w:r>
+        <w:t xml:space="preserve">no dependency actually closes. That is why</w:t>
+      </w:r>
+      <w:r>
+        <w:t xml:space="preserve"> </w:t>
+      </w:r>
+      <w:r>
+        <w:rPr>
+          <w:rStyle w:val="VerbatimChar"/>
+        </w:rPr>
+        <w:t xml:space="preserve">chi_mesh</w:t>
+      </w:r>
+      <w:r>
+        <w:t xml:space="preserve"> </w:t>
+      </w:r>
+      <w:r>
+        <w:t xml:space="preserve">splits into four blocks</w:t>
+      </w:r>
+      <w:r>
+        <w:t xml:space="preserve"> </w:t>
+      </w:r>
+      <w:r>
+        <w:t xml:space="preserve">and why the Home and HN-I ready outputs sit in blocks of their own. The</w:t>
+      </w:r>
+      <w:r>
+        <w:t xml:space="preserve"> </w:t>
+      </w:r>
+      <w:r>
+        <w:t xml:space="preserve">underlying rule those splits express, in Section 2.3, is sound and worth</w:t>
+      </w:r>
+      <w:r>
+        <w:t xml:space="preserve"> </w:t>
+      </w:r>
+      <w:r>
+        <w:t xml:space="preserve">keeping; the block count is an artifact.</w:t>
+      </w:r>
+      <w:r>
+        <w:t xml:space="preserve"> </w:t>
+      </w:r>
+      <w:r>
+        <w:rPr>
+          <w:rStyle w:val="VerbatimChar"/>
+        </w:rPr>
+        <w:t xml:space="preserve">chi_link_port</w:t>
+      </w:r>
+      <w:r>
+        <w:t xml:space="preserve"> </w:t>
+      </w:r>
+      <w:r>
+        <w:t xml:space="preserve">mirrors interface</w:t>
+      </w:r>
+      <w:r>
+        <w:t xml:space="preserve"> </w:t>
+      </w:r>
+      <w:r>
+        <w:t xml:space="preserve">members into local nets before using them as instance pins,</w:t>
+      </w:r>
+      <w:r>
+        <w:t xml:space="preserve"> </w:t>
+      </w:r>
+      <w:r>
+        <w:rPr>
+          <w:rStyle w:val="VerbatimChar"/>
+        </w:rPr>
+        <w:t xml:space="preserve">chi_pos</w:t>
+      </w:r>
+      <w:r>
+        <w:t xml:space="preserve"> </w:t>
+      </w:r>
+      <w:r>
+        <w:t xml:space="preserve">exports</w:t>
+      </w:r>
+      <w:r>
+        <w:t xml:space="preserve"> </w:t>
+      </w:r>
+      <w:r>
+        <w:t xml:space="preserve">a packed rather than unpacked array because binding an unpacked array port</w:t>
+      </w:r>
+      <w:r>
+        <w:t xml:space="preserve"> </w:t>
+      </w:r>
+      <w:r>
+        <w:t xml:space="preserve">fails, and the NodeID helpers hoist loop bounds into locals because a</w:t>
+      </w:r>
+      <w:r>
+        <w:t xml:space="preserve"> </w:t>
+      </w:r>
+      <w:r>
+        <w:t xml:space="preserve">function call in a loop condition is miscompiled. None of these change</w:t>
+      </w:r>
+      <w:r>
+        <w:t xml:space="preserve"> </w:t>
+      </w:r>
+      <w:r>
+        <w:t xml:space="preserve">behaviour, and all remain valid SystemVerilog, but none would have been</w:t>
+      </w:r>
+      <w:r>
+        <w:t xml:space="preserve"> </w:t>
+      </w:r>
+      <w:r>
+        <w:t xml:space="preserve">written this way against a commercial tool.</w:t>
+      </w:r>
+    </w:p>
+    <w:p>
+      <w:pPr>
+        <w:pStyle w:val="BodyText"/>
+      </w:pPr>
+      <w:r>
+        <w:t xml:space="preserve">Second, the bound assertions are limited by what Verilator accepts. They use</w:t>
+      </w:r>
+      <w:r>
+        <w:t xml:space="preserve"> </w:t>
+      </w:r>
+      <w:r>
+        <w:t xml:space="preserve">only implication,</w:t>
+      </w:r>
+      <w:r>
+        <w:t xml:space="preserve"> </w:t>
+      </w:r>
+      <w:r>
+        <w:rPr>
+          <w:rStyle w:val="VerbatimChar"/>
+        </w:rPr>
+        <w:t xml:space="preserve">$past</w:t>
+      </w:r>
+      <w:r>
+        <w:t xml:space="preserve"> </w:t>
+      </w:r>
+      <w:r>
+        <w:t xml:space="preserve">and</w:t>
+      </w:r>
+      <w:r>
+        <w:t xml:space="preserve"> </w:t>
+      </w:r>
+      <w:r>
+        <w:rPr>
+          <w:rStyle w:val="VerbatimChar"/>
+        </w:rPr>
+        <w:t xml:space="preserve">$stable</w:t>
+      </w:r>
+      <w:r>
+        <w:t xml:space="preserve">. Sequence repetition,</w:t>
+      </w:r>
+      <w:r>
+        <w:t xml:space="preserve"> </w:t>
+      </w:r>
+      <w:r>
+        <w:rPr>
+          <w:rStyle w:val="VerbatimChar"/>
+        </w:rPr>
+        <w:t xml:space="preserve">throughout</w:t>
+      </w:r>
+      <w:r>
+        <w:t xml:space="preserve">,</w:t>
+      </w:r>
+      <w:r>
+        <w:t xml:space="preserve"> </w:t>
+      </w:r>
+      <w:r>
+        <w:rPr>
+          <w:rStyle w:val="VerbatimChar"/>
+        </w:rPr>
+        <w:t xml:space="preserve">within</w:t>
+      </w:r>
+      <w:r>
+        <w:t xml:space="preserve"> </w:t>
+      </w:r>
+      <w:r>
+        <w:t xml:space="preserve">and local variables in sequences are unavailable, and those are</w:t>
+      </w:r>
+      <w:r>
+        <w:t xml:space="preserve"> </w:t>
+      </w:r>
+      <w:r>
+        <w:t xml:space="preserve">exactly what an end-to-end property needs. A property such as</w:t>
+      </w:r>
+      <w:r>
+        <w:t xml:space="preserve"> </w:t>
+      </w:r>
+      <w:r>
+        <w:t xml:space="preserve">“</w:t>
+      </w:r>
+      <w:r>
+        <w:t xml:space="preserve">every accepted</w:t>
+      </w:r>
+      <w:r>
+        <w:t xml:space="preserve"> </w:t>
+      </w:r>
+      <w:r>
+        <w:t xml:space="preserve">request eventually receives a completion carrying the matching</w:t>
+      </w:r>
+      <w:r>
+        <w:t xml:space="preserve"> </w:t>
+      </w:r>
+      <w:r>
+        <w:rPr>
+          <w:rStyle w:val="VerbatimChar"/>
+        </w:rPr>
+        <w:t xml:space="preserve">TxnID</w:t>
+      </w:r>
+      <w:r>
+        <w:t xml:space="preserve">”</w:t>
+      </w:r>
+      <w:r>
+        <w:t xml:space="preserve"> </w:t>
+      </w:r>
+      <w:r>
+        <w:t xml:space="preserve">cannot be expressed here, which is the concrete reason Section 12.1 describes</w:t>
+      </w:r>
+      <w:r>
+        <w:t xml:space="preserve"> </w:t>
+      </w:r>
+      <w:r>
+        <w:t xml:space="preserve">the assertion set as local.</w:t>
+      </w:r>
+    </w:p>
+    <w:p>
+      <w:pPr>
+        <w:pStyle w:val="BodyText"/>
+      </w:pPr>
+      <w:r>
+        <w:t xml:space="preserve">Third, Verilator is two-state. It cannot report an X, so uninitialised state,</w:t>
+      </w:r>
+      <w:r>
+        <w:t xml:space="preserve"> </w:t>
+      </w:r>
+      <w:r>
+        <w:t xml:space="preserve">missing resets and undriven inputs do not fail;</w:t>
+      </w:r>
+      <w:r>
+        <w:t xml:space="preserve"> </w:t>
+      </w:r>
+      <w:r>
+        <w:rPr>
+          <w:rStyle w:val="VerbatimChar"/>
+        </w:rPr>
+        <w:t xml:space="preserve">make simrand</w:t>
+      </w:r>
+      <w:r>
+        <w:t xml:space="preserve"> </w:t>
+      </w:r>
+      <w:r>
+        <w:t xml:space="preserve">is a partial</w:t>
+      </w:r>
+      <w:r>
+        <w:t xml:space="preserve"> </w:t>
+      </w:r>
+      <w:r>
+        <w:t xml:space="preserve">substitute, not a replacement. Neither is there timing, SDF, glitch or</w:t>
+      </w:r>
+      <w:r>
+        <w:t xml:space="preserve"> </w:t>
+      </w:r>
+      <w:r>
+        <w:t xml:space="preserve">multi-clock behaviour, so Section 11 is unverified by this flow. Re-running</w:t>
+      </w:r>
+      <w:r>
+        <w:t xml:space="preserve"> </w:t>
+      </w:r>
+      <w:r>
+        <w:t xml:space="preserve">the elaboration checks and the smoke test under a four-state simulator with</w:t>
+      </w:r>
+      <w:r>
+        <w:t xml:space="preserve"> </w:t>
+      </w:r>
+      <w:r>
+        <w:t xml:space="preserve">X-initialisation is the first thing to do in a commercial flow, and it should</w:t>
+      </w:r>
+      <w:r>
+        <w:t xml:space="preserve"> </w:t>
+      </w:r>
+      <w:r>
+        <w:t xml:space="preserve">be expected to find defects this flow cannot see.</w:t>
+      </w:r>
+    </w:p>
+    <w:bookmarkEnd w:id="77"/>
+    <w:bookmarkStart w:id="78" w:name="regenerating-this-document"/>
+    <w:p>
+      <w:pPr>
+        <w:pStyle w:val="Heading2"/>
+      </w:pPr>
+      <w:r>
+        <w:t xml:space="preserve">12.9 Regenerating this document</w:t>
+      </w:r>
+    </w:p>
+    <w:p>
+      <w:pPr>
+        <w:pStyle w:val="FirstParagraph"/>
+      </w:pPr>
+      <w:r>
         <w:t xml:space="preserve">The Word file in</w:t>
       </w:r>
       <w:r>
@@ -23762,9 +24209,9 @@
         <w:t xml:space="preserve">the cross-references in the prose stay correct in every output format.</w:t>
       </w:r>
     </w:p>
-    <w:bookmarkEnd w:id="77"/>
     <w:bookmarkEnd w:id="78"/>
-    <w:bookmarkStart w:id="81" w:name="X5bf108ade8508cab34b28d325ecb3ab81501255"/>
+    <w:bookmarkEnd w:id="79"/>
+    <w:bookmarkStart w:id="82" w:name="X5bf108ade8508cab34b28d325ecb3ab81501255"/>
     <w:p>
       <w:pPr>
         <w:pStyle w:val="Heading1"/>
@@ -23773,7 +24220,7 @@
         <w:t xml:space="preserve">13 Open issues, known limitations and decisions</w:t>
       </w:r>
     </w:p>
-    <w:bookmarkStart w:id="79" w:name="known-limitations"/>
+    <w:bookmarkStart w:id="80" w:name="known-limitations"/>
     <w:p>
       <w:pPr>
         <w:pStyle w:val="Heading2"/>
@@ -24031,8 +24478,8 @@
         <w:t xml:space="preserve">performance characterization.</w:t>
       </w:r>
     </w:p>
-    <w:bookmarkEnd w:id="79"/>
-    <w:bookmarkStart w:id="80" w:name="implementation-defined-decision-log"/>
+    <w:bookmarkEnd w:id="80"/>
+    <w:bookmarkStart w:id="81" w:name="implementation-defined-decision-log"/>
     <w:p>
       <w:pPr>
         <w:pStyle w:val="Heading2"/>
@@ -24912,8 +25359,8 @@
         </w:tc>
       </w:tr>
     </w:tbl>
-    <w:bookmarkEnd w:id="80"/>
     <w:bookmarkEnd w:id="81"/>
+    <w:bookmarkEnd w:id="82"/>
     <w:sectPr/>
   </w:body>
 </w:document>

</xml_diff>

<commit_message>
docs: add generated architecture diagrams for the fabric and the Home Node
Replaces the ASCII block diagram with Graphviz-generated figures: the
top-level request path, and the internal structure of chi_hnf_top. The .dot
sources are the reviewable artifact and make doc rebuilds the .png files.

Co-authored-by: swasthikamath <swasthikamath@gmail.com>
</commit_message>
<xml_diff>
--- a/docs/chi_interconnect_design_spec.docx
+++ b/docs/chi_interconnect_design_spec.docx
@@ -4152,7 +4152,7 @@
     </w:tbl>
     <w:bookmarkEnd w:id="24"/>
     <w:bookmarkEnd w:id="25"/>
-    <w:bookmarkStart w:id="29" w:name="architecture-and-hierarchy"/>
+    <w:bookmarkStart w:id="36" w:name="architecture-and-hierarchy"/>
     <w:p>
       <w:pPr>
         <w:pStyle w:val="Heading1"/>
@@ -4161,13 +4161,693 @@
         <w:t xml:space="preserve">2 Architecture and hierarchy</w:t>
       </w:r>
     </w:p>
-    <w:bookmarkStart w:id="26" w:name="block-diagram"/>
+    <w:bookmarkStart w:id="33" w:name="architecture"/>
     <w:p>
       <w:pPr>
         <w:pStyle w:val="Heading2"/>
       </w:pPr>
       <w:r>
-        <w:t xml:space="preserve">2.1 Block diagram</w:t>
+        <w:t xml:space="preserve">2.1 Architecture</w:t>
+      </w:r>
+    </w:p>
+    <w:p>
+      <w:pPr>
+        <w:pStyle w:val="CaptionedFigure"/>
+      </w:pPr>
+      <w:r>
+        <w:drawing>
+          <wp:inline>
+            <wp:extent cx="5334000" cy="5217583"/>
+            <wp:effectExtent b="0" l="0" r="0" t="0"/>
+            <wp:docPr descr="Top-level architecture. The vertical axis is the request path." title="" id="27" name="Picture"/>
+            <a:graphic>
+              <a:graphicData uri="http://schemas.openxmlformats.org/drawingml/2006/picture">
+                <pic:pic>
+                  <pic:nvPicPr>
+                    <pic:cNvPr descr="figures/chi_architecture.png" id="28" name="Picture"/>
+                    <pic:cNvPicPr>
+                      <a:picLocks noChangeArrowheads="1" noChangeAspect="1"/>
+                    </pic:cNvPicPr>
+                  </pic:nvPicPr>
+                  <pic:blipFill>
+                    <a:blip r:embed="rId26"/>
+                    <a:stretch>
+                      <a:fillRect/>
+                    </a:stretch>
+                  </pic:blipFill>
+                  <pic:spPr bwMode="auto">
+                    <a:xfrm>
+                      <a:off x="0" y="0"/>
+                      <a:ext cx="5334000" cy="5217583"/>
+                    </a:xfrm>
+                    <a:prstGeom prst="rect">
+                      <a:avLst/>
+                    </a:prstGeom>
+                    <a:noFill/>
+                    <a:ln w="9525">
+                      <a:noFill/>
+                      <a:headEnd/>
+                      <a:tailEnd/>
+                    </a:ln>
+                  </pic:spPr>
+                </pic:pic>
+              </a:graphicData>
+            </a:graphic>
+          </wp:inline>
+        </w:drawing>
+      </w:r>
+    </w:p>
+    <w:p>
+      <w:pPr>
+        <w:pStyle w:val="ImageCaption"/>
+      </w:pPr>
+      <w:r>
+        <w:t xml:space="preserve">Top-level architecture. The vertical axis is the request path.</w:t>
+      </w:r>
+    </w:p>
+    <w:p>
+      <w:pPr>
+        <w:pStyle w:val="BodyText"/>
+      </w:pPr>
+      <w:r>
+        <w:t xml:space="preserve">Read the figure top to bottom as the life of a request. A Requester drives a</w:t>
+      </w:r>
+      <w:r>
+        <w:t xml:space="preserve"> </w:t>
+      </w:r>
+      <w:r>
+        <w:t xml:space="preserve">REQ flit onto its</w:t>
+      </w:r>
+      <w:r>
+        <w:t xml:space="preserve"> </w:t>
+      </w:r>
+      <w:r>
+        <w:rPr>
+          <w:rStyle w:val="VerbatimChar"/>
+        </w:rPr>
+        <w:t xml:space="preserve">chi_if</w:t>
+      </w:r>
+      <w:r>
+        <w:t xml:space="preserve">. The</w:t>
+      </w:r>
+      <w:r>
+        <w:t xml:space="preserve"> </w:t>
+      </w:r>
+      <w:r>
+        <w:rPr>
+          <w:rStyle w:val="VerbatimChar"/>
+        </w:rPr>
+        <w:t xml:space="preserve">chi_link_port</w:t>
+      </w:r>
+      <w:r>
+        <w:t xml:space="preserve"> </w:t>
+      </w:r>
+      <w:r>
+        <w:t xml:space="preserve">for that port converts the</w:t>
+      </w:r>
+      <w:r>
+        <w:t xml:space="preserve"> </w:t>
+      </w:r>
+      <w:r>
+        <w:t xml:space="preserve">CHI link-layer contract, which is credit-based and has no ready signal, into</w:t>
+      </w:r>
+      <w:r>
+        <w:t xml:space="preserve"> </w:t>
+      </w:r>
+      <w:r>
+        <w:t xml:space="preserve">the ready/valid handshake the fabric uses internally: it will not accept a</w:t>
+      </w:r>
+      <w:r>
+        <w:t xml:space="preserve"> </w:t>
+      </w:r>
+      <w:r>
+        <w:t xml:space="preserve">flit unless the link is in RUN and an L-Credit is outstanding, and it checks</w:t>
+      </w:r>
+      <w:r>
+        <w:t xml:space="preserve"> </w:t>
+      </w:r>
+      <w:r>
+        <w:t xml:space="preserve">flit parity on the way in. The address then goes to that port’s</w:t>
+      </w:r>
+      <w:r>
+        <w:t xml:space="preserve"> </w:t>
+      </w:r>
+      <w:r>
+        <w:rPr>
+          <w:rStyle w:val="VerbatimChar"/>
+        </w:rPr>
+        <w:t xml:space="preserve">chi_sam</w:t>
+      </w:r>
+      <w:r>
+        <w:t xml:space="preserve">,</w:t>
+      </w:r>
+      <w:r>
+        <w:t xml:space="preserve"> </w:t>
+      </w:r>
+      <w:r>
+        <w:t xml:space="preserve">which finds the matching region, applies the</w:t>
+      </w:r>
+      <w:r>
+        <w:t xml:space="preserve"> </w:t>
+      </w:r>
+      <w:r>
+        <w:rPr>
+          <w:rStyle w:val="VerbatimChar"/>
+        </w:rPr>
+        <w:t xml:space="preserve">PAS</w:t>
+      </w:r>
+      <w:r>
+        <w:t xml:space="preserve"> </w:t>
+      </w:r>
+      <w:r>
+        <w:t xml:space="preserve">check and produces a</w:t>
+      </w:r>
+      <w:r>
+        <w:t xml:space="preserve"> </w:t>
+      </w:r>
+      <w:r>
+        <w:rPr>
+          <w:rStyle w:val="VerbatimChar"/>
+        </w:rPr>
+        <w:t xml:space="preserve">TgtID</w:t>
+      </w:r>
+      <w:r>
+        <w:t xml:space="preserve"> </w:t>
+      </w:r>
+      <w:r>
+        <w:t xml:space="preserve">— through</w:t>
+      </w:r>
+      <w:r>
+        <w:t xml:space="preserve"> </w:t>
+      </w:r>
+      <w:r>
+        <w:rPr>
+          <w:rStyle w:val="VerbatimChar"/>
+        </w:rPr>
+        <w:t xml:space="preserve">chi_hn_hash</w:t>
+      </w:r>
+      <w:r>
+        <w:t xml:space="preserve"> </w:t>
+      </w:r>
+      <w:r>
+        <w:t xml:space="preserve">for an interleaved coherent region, or</w:t>
+      </w:r>
+      <w:r>
+        <w:t xml:space="preserve"> </w:t>
+      </w:r>
+      <w:r>
+        <w:t xml:space="preserve">through</w:t>
+      </w:r>
+      <w:r>
+        <w:t xml:space="preserve"> </w:t>
+      </w:r>
+      <w:r>
+        <w:rPr>
+          <w:rStyle w:val="VerbatimChar"/>
+        </w:rPr>
+        <w:t xml:space="preserve">chi_prefetch_map</w:t>
+      </w:r>
+      <w:r>
+        <w:t xml:space="preserve"> </w:t>
+      </w:r>
+      <w:r>
+        <w:t xml:space="preserve">for a</w:t>
+      </w:r>
+      <w:r>
+        <w:t xml:space="preserve"> </w:t>
+      </w:r>
+      <w:r>
+        <w:rPr>
+          <w:rStyle w:val="VerbatimChar"/>
+        </w:rPr>
+        <w:t xml:space="preserve">PrefetchTgt</w:t>
+      </w:r>
+      <w:r>
+        <w:t xml:space="preserve"> </w:t>
+      </w:r>
+      <w:r>
+        <w:t xml:space="preserve">hint, which is routed straight</w:t>
+      </w:r>
+      <w:r>
+        <w:t xml:space="preserve"> </w:t>
+      </w:r>
+      <w:r>
+        <w:t xml:space="preserve">to an SN-F because no Home resource may be consumed for it.</w:t>
+      </w:r>
+      <w:r>
+        <w:t xml:space="preserve"> </w:t>
+      </w:r>
+      <w:r>
+        <w:rPr>
+          <w:rStyle w:val="VerbatimChar"/>
+        </w:rPr>
+        <w:t xml:space="preserve">chi_noc_top</w:t>
+      </w:r>
+      <w:r>
+        <w:t xml:space="preserve"> </w:t>
+      </w:r>
+      <w:r>
+        <w:t xml:space="preserve">carries the flit across whichever of the three topologies was elaborated, on</w:t>
+      </w:r>
+      <w:r>
+        <w:t xml:space="preserve"> </w:t>
+      </w:r>
+      <w:r>
+        <w:t xml:space="preserve">one of four independent networks. A Home Node serializes it, and anything it</w:t>
+      </w:r>
+      <w:r>
+        <w:t xml:space="preserve"> </w:t>
+      </w:r>
+      <w:r>
+        <w:t xml:space="preserve">must send downstream leaves through a second</w:t>
+      </w:r>
+      <w:r>
+        <w:t xml:space="preserve"> </w:t>
+      </w:r>
+      <w:r>
+        <w:rPr>
+          <w:rStyle w:val="VerbatimChar"/>
+        </w:rPr>
+        <w:t xml:space="preserve">chi_link_port</w:t>
+      </w:r>
+      <w:r>
+        <w:t xml:space="preserve"> </w:t>
+      </w:r>
+      <w:r>
+        <w:t xml:space="preserve">to a Subordinate.</w:t>
+      </w:r>
+    </w:p>
+    <w:p>
+      <w:pPr>
+        <w:pStyle w:val="BodyText"/>
+      </w:pPr>
+      <w:r>
+        <w:t xml:space="preserve">Three properties of this arrangement are worth stating explicitly, because</w:t>
+      </w:r>
+      <w:r>
+        <w:t xml:space="preserve"> </w:t>
+      </w:r>
+      <w:r>
+        <w:t xml:space="preserve">they are the ones that constrain everything else.</w:t>
+      </w:r>
+    </w:p>
+    <w:p>
+      <w:pPr>
+        <w:pStyle w:val="BodyText"/>
+      </w:pPr>
+      <w:r>
+        <w:t xml:space="preserve">The link layer is per port and symmetric. Every external port gets the same</w:t>
+      </w:r>
+      <w:r>
+        <w:t xml:space="preserve"> </w:t>
+      </w:r>
+      <w:r>
+        <w:t xml:space="preserve">four blocks, so credit accounting and activation are a property of the port</w:t>
+      </w:r>
+      <w:r>
+        <w:t xml:space="preserve"> </w:t>
+      </w:r>
+      <w:r>
+        <w:t xml:space="preserve">rather than of the node class. Only the channel set differs: a Requester port</w:t>
+      </w:r>
+      <w:r>
+        <w:t xml:space="preserve"> </w:t>
+      </w:r>
+      <w:r>
+        <w:t xml:space="preserve">receives REQ, RSP and DAT and transmits RSP, SNP and DAT, while a Subordinate</w:t>
+      </w:r>
+      <w:r>
+        <w:t xml:space="preserve"> </w:t>
+      </w:r>
+      <w:r>
+        <w:t xml:space="preserve">port receives RSP and DAT and transmits REQ, RSP and DAT.</w:t>
+      </w:r>
+    </w:p>
+    <w:p>
+      <w:pPr>
+        <w:pStyle w:val="BodyText"/>
+      </w:pPr>
+      <w:r>
+        <w:t xml:space="preserve">HN-F, HN-I and MN are internal fabric endpoints, not external</w:t>
+      </w:r>
+      <w:r>
+        <w:t xml:space="preserve"> </w:t>
+      </w:r>
+      <w:r>
+        <w:rPr>
+          <w:rStyle w:val="VerbatimChar"/>
+        </w:rPr>
+        <w:t xml:space="preserve">chi_if</w:t>
+      </w:r>
+      <w:r>
+        <w:t xml:space="preserve"> </w:t>
+      </w:r>
+      <w:r>
+        <w:t xml:space="preserve">ports.</w:t>
+      </w:r>
+      <w:r>
+        <w:t xml:space="preserve"> </w:t>
+      </w:r>
+      <w:r>
+        <w:t xml:space="preserve">They have no link layer, no L-Credits and no activation handshake, which is</w:t>
+      </w:r>
+      <w:r>
+        <w:t xml:space="preserve"> </w:t>
+      </w:r>
+      <w:r>
+        <w:t xml:space="preserve">why their ordinals read zero in the</w:t>
+      </w:r>
+      <w:r>
+        <w:t xml:space="preserve"> </w:t>
+      </w:r>
+      <w:r>
+        <w:rPr>
+          <w:rStyle w:val="VerbatimChar"/>
+        </w:rPr>
+        <w:t xml:space="preserve">linkUp</w:t>
+      </w:r>
+      <w:r>
+        <w:t xml:space="preserve"> </w:t>
+      </w:r>
+      <w:r>
+        <w:t xml:space="preserve">output. A request reaches them</w:t>
+      </w:r>
+      <w:r>
+        <w:t xml:space="preserve"> </w:t>
+      </w:r>
+      <w:r>
+        <w:t xml:space="preserve">over the internal ready/valid fabric only.</w:t>
+      </w:r>
+    </w:p>
+    <w:p>
+      <w:pPr>
+        <w:pStyle w:val="BodyText"/>
+      </w:pPr>
+      <w:r>
+        <w:t xml:space="preserve">The SAM is per Requester port, not central. Each port decodes its own</w:t>
+      </w:r>
+      <w:r>
+        <w:t xml:space="preserve"> </w:t>
+      </w:r>
+      <w:r>
+        <w:t xml:space="preserve">address, which is what B3.1 describes when it says Requesters must have a</w:t>
+      </w:r>
+      <w:r>
+        <w:t xml:space="preserve"> </w:t>
+      </w:r>
+      <w:r>
+        <w:t xml:space="preserve">System Address Map. A single</w:t>
+      </w:r>
+      <w:r>
+        <w:t xml:space="preserve"> </w:t>
+      </w:r>
+      <w:r>
+        <w:rPr>
+          <w:rStyle w:val="VerbatimChar"/>
+        </w:rPr>
+        <w:t xml:space="preserve">chi_cfg_slave</w:t>
+      </w:r>
+      <w:r>
+        <w:t xml:space="preserve"> </w:t>
+      </w:r>
+      <w:r>
+        <w:t xml:space="preserve">broadcasts region updates to all</w:t>
+      </w:r>
+      <w:r>
+        <w:t xml:space="preserve"> </w:t>
+      </w:r>
+      <w:r>
+        <w:t xml:space="preserve">of them so they stay consistent.</w:t>
+      </w:r>
+    </w:p>
+    <w:bookmarkStart w:id="32" w:name="home-node-internal-architecture"/>
+    <w:p>
+      <w:pPr>
+        <w:pStyle w:val="Heading3"/>
+      </w:pPr>
+      <w:r>
+        <w:t xml:space="preserve">Home Node internal architecture</w:t>
+      </w:r>
+    </w:p>
+    <w:p>
+      <w:pPr>
+        <w:pStyle w:val="CaptionedFigure"/>
+      </w:pPr>
+      <w:r>
+        <w:drawing>
+          <wp:inline>
+            <wp:extent cx="5334000" cy="2599045"/>
+            <wp:effectExtent b="0" l="0" r="0" t="0"/>
+            <wp:docPr descr="chi_hnf_top internal structure. One request is in flight at a time." title="" id="30" name="Picture"/>
+            <a:graphic>
+              <a:graphicData uri="http://schemas.openxmlformats.org/drawingml/2006/picture">
+                <pic:pic>
+                  <pic:nvPicPr>
+                    <pic:cNvPr descr="figures/chi_hnf.png" id="31" name="Picture"/>
+                    <pic:cNvPicPr>
+                      <a:picLocks noChangeArrowheads="1" noChangeAspect="1"/>
+                    </pic:cNvPicPr>
+                  </pic:nvPicPr>
+                  <pic:blipFill>
+                    <a:blip r:embed="rId29"/>
+                    <a:stretch>
+                      <a:fillRect/>
+                    </a:stretch>
+                  </pic:blipFill>
+                  <pic:spPr bwMode="auto">
+                    <a:xfrm>
+                      <a:off x="0" y="0"/>
+                      <a:ext cx="5334000" cy="2599045"/>
+                    </a:xfrm>
+                    <a:prstGeom prst="rect">
+                      <a:avLst/>
+                    </a:prstGeom>
+                    <a:noFill/>
+                    <a:ln w="9525">
+                      <a:noFill/>
+                      <a:headEnd/>
+                      <a:tailEnd/>
+                    </a:ln>
+                  </pic:spPr>
+                </pic:pic>
+              </a:graphicData>
+            </a:graphic>
+          </wp:inline>
+        </w:drawing>
+      </w:r>
+    </w:p>
+    <w:p>
+      <w:pPr>
+        <w:pStyle w:val="ImageCaption"/>
+      </w:pPr>
+      <w:r>
+        <w:t xml:space="preserve">chi_hnf_top internal structure. One request is in flight at a time.</w:t>
+      </w:r>
+    </w:p>
+    <w:p>
+      <w:pPr>
+        <w:pStyle w:val="BodyText"/>
+      </w:pPr>
+      <w:r>
+        <w:t xml:space="preserve">The coherent Home is where nearly all protocol state lives, so it is shown</w:t>
+      </w:r>
+      <w:r>
+        <w:t xml:space="preserve"> </w:t>
+      </w:r>
+      <w:r>
+        <w:t xml:space="preserve">separately. A request is either admitted into</w:t>
+      </w:r>
+      <w:r>
+        <w:t xml:space="preserve"> </w:t>
+      </w:r>
+      <w:r>
+        <w:rPr>
+          <w:rStyle w:val="VerbatimChar"/>
+        </w:rPr>
+        <w:t xml:space="preserve">chi_pos</w:t>
+      </w:r>
+      <w:r>
+        <w:t xml:space="preserve"> </w:t>
+      </w:r>
+      <w:r>
+        <w:t xml:space="preserve">or handed to</w:t>
+      </w:r>
+      <w:r>
+        <w:t xml:space="preserve"> </w:t>
+      </w:r>
+      <w:r>
+        <w:rPr>
+          <w:rStyle w:val="VerbatimChar"/>
+        </w:rPr>
+        <w:t xml:space="preserve">chi_retry</w:t>
+      </w:r>
+      <w:r>
+        <w:t xml:space="preserve">, which is the only path that can answer with</w:t>
+      </w:r>
+      <w:r>
+        <w:t xml:space="preserve"> </w:t>
+      </w:r>
+      <w:r>
+        <w:rPr>
+          <w:rStyle w:val="VerbatimChar"/>
+        </w:rPr>
+        <w:t xml:space="preserve">RetryAck</w:t>
+      </w:r>
+      <w:r>
+        <w:t xml:space="preserve"> </w:t>
+      </w:r>
+      <w:r>
+        <w:t xml:space="preserve">and later</w:t>
+      </w:r>
+      <w:r>
+        <w:t xml:space="preserve"> </w:t>
+      </w:r>
+      <w:r>
+        <w:rPr>
+          <w:rStyle w:val="VerbatimChar"/>
+        </w:rPr>
+        <w:t xml:space="preserve">PCrdGrant</w:t>
+      </w:r>
+      <w:r>
+        <w:t xml:space="preserve">. An admitted request is checked by</w:t>
+      </w:r>
+      <w:r>
+        <w:t xml:space="preserve"> </w:t>
+      </w:r>
+      <w:r>
+        <w:rPr>
+          <w:rStyle w:val="VerbatimChar"/>
+        </w:rPr>
+        <w:t xml:space="preserve">chi_hazard</w:t>
+      </w:r>
+      <w:r>
+        <w:t xml:space="preserve"> </w:t>
+      </w:r>
+      <w:r>
+        <w:t xml:space="preserve">against every</w:t>
+      </w:r>
+      <w:r>
+        <w:t xml:space="preserve"> </w:t>
+      </w:r>
+      <w:r>
+        <w:t xml:space="preserve">other active POS entry for a same-line or ordering conflict before the FSM</w:t>
+      </w:r>
+      <w:r>
+        <w:t xml:space="preserve"> </w:t>
+      </w:r>
+      <w:r>
+        <w:t xml:space="preserve">acts on it. One globally serial FSM of 22 states then drives whichever engine</w:t>
+      </w:r>
+      <w:r>
+        <w:t xml:space="preserve"> </w:t>
+      </w:r>
+      <w:r>
+        <w:t xml:space="preserve">the opcode selects: the directory and snoop generator for coherence, the DMT,</w:t>
+      </w:r>
+      <w:r>
+        <w:t xml:space="preserve"> </w:t>
+      </w:r>
+      <w:r>
+        <w:t xml:space="preserve">DWT and stash controllers when the transaction can be offloaded so that data</w:t>
+      </w:r>
+      <w:r>
+        <w:t xml:space="preserve"> </w:t>
+      </w:r>
+      <w:r>
+        <w:t xml:space="preserve">bypasses the Home, and the atomic, cache-maintenance and exclusive-monitor</w:t>
+      </w:r>
+      <w:r>
+        <w:t xml:space="preserve"> </w:t>
+      </w:r>
+      <w:r>
+        <w:t xml:space="preserve">blocks for operations the Home performs itself.</w:t>
+      </w:r>
+    </w:p>
+    <w:p>
+      <w:pPr>
+        <w:pStyle w:val="BodyText"/>
+      </w:pPr>
+      <w:r>
+        <w:t xml:space="preserve">The single-FSM structure is the dominant simplification in this design. The</w:t>
+      </w:r>
+      <w:r>
+        <w:t xml:space="preserve"> </w:t>
+      </w:r>
+      <w:r>
+        <w:t xml:space="preserve">POS holds</w:t>
+      </w:r>
+      <w:r>
+        <w:t xml:space="preserve"> </w:t>
+      </w:r>
+      <w:r>
+        <w:rPr>
+          <w:rStyle w:val="VerbatimChar"/>
+        </w:rPr>
+        <w:t xml:space="preserve">posEntries</w:t>
+      </w:r>
+      <w:r>
+        <w:t xml:space="preserve"> </w:t>
+      </w:r>
+      <w:r>
+        <w:t xml:space="preserve">entries and detects hazards across all of them, but</w:t>
+      </w:r>
+      <w:r>
+        <w:t xml:space="preserve"> </w:t>
+      </w:r>
+      <w:r>
+        <w:t xml:space="preserve">only one transaction advances at a time, so POS depth currently buys hazard</w:t>
+      </w:r>
+      <w:r>
+        <w:t xml:space="preserve"> </w:t>
+      </w:r>
+      <w:r>
+        <w:t xml:space="preserve">visibility rather than throughput. Section 9.1 covers the consequences.</w:t>
+      </w:r>
+    </w:p>
+    <w:p>
+      <w:pPr>
+        <w:pStyle w:val="BodyText"/>
+      </w:pPr>
+      <w:r>
+        <w:t xml:space="preserve">Figures are generated from Graphviz sources in</w:t>
+      </w:r>
+      <w:r>
+        <w:t xml:space="preserve"> </w:t>
+      </w:r>
+      <w:r>
+        <w:rPr>
+          <w:rStyle w:val="VerbatimChar"/>
+        </w:rPr>
+        <w:t xml:space="preserve">doc-src/figures/</w:t>
+      </w:r>
+      <w:r>
+        <w:t xml:space="preserve">;</w:t>
+      </w:r>
+      <w:r>
+        <w:t xml:space="preserve"> </w:t>
+      </w:r>
+      <w:r>
+        <w:rPr>
+          <w:rStyle w:val="VerbatimChar"/>
+        </w:rPr>
+        <w:t xml:space="preserve">make doc</w:t>
+      </w:r>
+      <w:r>
+        <w:t xml:space="preserve"> </w:t>
+      </w:r>
+      <w:r>
+        <w:t xml:space="preserve">rebuilds them.</w:t>
+      </w:r>
+    </w:p>
+    <w:bookmarkEnd w:id="32"/>
+    <w:bookmarkEnd w:id="33"/>
+    <w:bookmarkStart w:id="34" w:name="rtl-hierarchy"/>
+    <w:p>
+      <w:pPr>
+        <w:pStyle w:val="Heading2"/>
+      </w:pPr>
+      <w:r>
+        <w:t xml:space="preserve">2.2 RTL hierarchy</w:t>
       </w:r>
     </w:p>
     <w:p>
@@ -4178,7 +4858,7 @@
         <w:rPr>
           <w:rStyle w:val="VerbatimChar"/>
         </w:rPr>
-        <w:t xml:space="preserve">  RN-F / RN-D / RN-I arrays              SN-F / SN-I arrays</w:t>
+        <w:t xml:space="preserve">chi_interconnect_top</w:t>
       </w:r>
       <w:r>
         <w:br/>
@@ -4187,7 +4867,7 @@
         <w:rPr>
           <w:rStyle w:val="VerbatimChar"/>
         </w:rPr>
-        <w:t xml:space="preserve">        one chi_if each                     one chi_if each</w:t>
+        <w:t xml:space="preserve">├── chi_cfg_check                            (elaboration assertions)</w:t>
       </w:r>
       <w:r>
         <w:br/>
@@ -4196,7 +4876,7 @@
         <w:rPr>
           <w:rStyle w:val="VerbatimChar"/>
         </w:rPr>
-        <w:t xml:space="preserve">               |                                   |</w:t>
+        <w:t xml:space="preserve">├── rnf_ports[*] / rnd_ports[*] / rni_ports[*] : chi_link_port</w:t>
       </w:r>
       <w:r>
         <w:br/>
@@ -4205,7 +4885,7 @@
         <w:rPr>
           <w:rStyle w:val="VerbatimChar"/>
         </w:rPr>
-        <w:t xml:space="preserve">        chi_link_port                       chi_link_port</w:t>
+        <w:t xml:space="preserve">│   ├── chi_link_rx  x3   (REQ, RSP, DAT from the node)</w:t>
       </w:r>
       <w:r>
         <w:br/>
@@ -4214,7 +4894,7 @@
         <w:rPr>
           <w:rStyle w:val="VerbatimChar"/>
         </w:rPr>
-        <w:t xml:space="preserve">   L-Credits, parity, activation      L-Credits, parity, activation</w:t>
+        <w:t xml:space="preserve">│   ├── chi_link_tx  x3   (RSP, SNP, DAT to the node)</w:t>
       </w:r>
       <w:r>
         <w:br/>
@@ -4223,7 +4903,7 @@
         <w:rPr>
           <w:rStyle w:val="VerbatimChar"/>
         </w:rPr>
-        <w:t xml:space="preserve">               |                                   |</w:t>
+        <w:t xml:space="preserve">│   └── chi_link_fsm x6   (one per channel per direction)</w:t>
       </w:r>
       <w:r>
         <w:br/>
@@ -4232,7 +4912,7 @@
         <w:rPr>
           <w:rStyle w:val="VerbatimChar"/>
         </w:rPr>
-        <w:t xml:space="preserve">      requester SAM + PrefetchTgt map              |</w:t>
+        <w:t xml:space="preserve">├── snf_ports[*] / sni_ports[*] : chi_link_port</w:t>
       </w:r>
       <w:r>
         <w:br/>
@@ -4241,7 +4921,7 @@
         <w:rPr>
           <w:rStyle w:val="VerbatimChar"/>
         </w:rPr>
-        <w:t xml:space="preserve">               |                                   |</w:t>
+        <w:t xml:space="preserve">│   ├── chi_link_rx  x2   (RSP, DAT from the node)</w:t>
       </w:r>
       <w:r>
         <w:br/>
@@ -4250,7 +4930,7 @@
         <w:rPr>
           <w:rStyle w:val="VerbatimChar"/>
         </w:rPr>
-        <w:t xml:space="preserve">      +------------------ chi_noc_top -------------------+</w:t>
+        <w:t xml:space="preserve">│   └── chi_link_tx  x3   (REQ, RSP, DAT to the node)</w:t>
       </w:r>
       <w:r>
         <w:br/>
@@ -4259,7 +4939,7 @@
         <w:rPr>
           <w:rStyle w:val="VerbatimChar"/>
         </w:rPr>
-        <w:t xml:space="preserve">      |  CROSSBAR          RING            MESH_2D       |</w:t>
+        <w:t xml:space="preserve">├── requester_sam[*]</w:t>
       </w:r>
       <w:r>
         <w:br/>
@@ -4268,7 +4948,7 @@
         <w:rPr>
           <w:rStyle w:val="VerbatimChar"/>
         </w:rPr>
-        <w:t xml:space="preserve">      |  separate REQ / RSP / SNP / DAT ready-valid      |</w:t>
+        <w:t xml:space="preserve">│   ├── chi_sam  ── chi_hn_hash</w:t>
       </w:r>
       <w:r>
         <w:br/>
@@ -4277,7 +4957,7 @@
         <w:rPr>
           <w:rStyle w:val="VerbatimChar"/>
         </w:rPr>
-        <w:t xml:space="preserve">      +--------------------------+-----------------------+</w:t>
+        <w:t xml:space="preserve">│   └── chi_prefetch_map</w:t>
       </w:r>
       <w:r>
         <w:br/>
@@ -4286,7 +4966,7 @@
         <w:rPr>
           <w:rStyle w:val="VerbatimChar"/>
         </w:rPr>
-        <w:t xml:space="preserve">                                 |</w:t>
+        <w:t xml:space="preserve">├── apb_cfg : chi_cfg_slave                          [CFG_APB]</w:t>
       </w:r>
       <w:r>
         <w:br/>
@@ -4295,7 +4975,7 @@
         <w:rPr>
           <w:rStyle w:val="VerbatimChar"/>
         </w:rPr>
-        <w:t xml:space="preserve">            +--------------------+--------------------+</w:t>
+        <w:t xml:space="preserve">├── hnf_nodes[*] : chi_hnf_top</w:t>
       </w:r>
       <w:r>
         <w:br/>
@@ -4304,7 +4984,7 @@
         <w:rPr>
           <w:rStyle w:val="VerbatimChar"/>
         </w:rPr>
-        <w:t xml:space="preserve">            |                    |                    |</w:t>
+        <w:t xml:space="preserve">│   ├── chi_pos</w:t>
       </w:r>
       <w:r>
         <w:br/>
@@ -4313,7 +4993,7 @@
         <w:rPr>
           <w:rStyle w:val="VerbatimChar"/>
         </w:rPr>
-        <w:t xml:space="preserve">       chi_hnf_top          chi_hni_top           chi_mn_dvm</w:t>
+        <w:t xml:space="preserve">│   ├── chi_hazard</w:t>
       </w:r>
       <w:r>
         <w:br/>
@@ -4322,7 +5002,7 @@
         <w:rPr>
           <w:rStyle w:val="VerbatimChar"/>
         </w:rPr>
-        <w:t xml:space="preserve">      coherent Home       noncoherent Home       DVM sequencer</w:t>
+        <w:t xml:space="preserve">│   ├── chi_snoop_filter</w:t>
       </w:r>
       <w:r>
         <w:br/>
@@ -4331,7 +5011,7 @@
         <w:rPr>
           <w:rStyle w:val="VerbatimChar"/>
         </w:rPr>
-        <w:t xml:space="preserve">      + CFG-MMIO endpoint</w:t>
+        <w:t xml:space="preserve">│   ├── chi_snp_gen</w:t>
       </w:r>
       <w:r>
         <w:br/>
@@ -4340,7 +5020,7 @@
         <w:rPr>
           <w:rStyle w:val="VerbatimChar"/>
         </w:rPr>
-        <w:t xml:space="preserve">            |                    |</w:t>
+        <w:t xml:space="preserve">│   ├── chi_retry</w:t>
       </w:r>
       <w:r>
         <w:br/>
@@ -4349,19 +5029,160 @@
         <w:rPr>
           <w:rStyle w:val="VerbatimChar"/>
         </w:rPr>
-        <w:t xml:space="preserve">          SN-F                 SN-I</w:t>
+        <w:t xml:space="preserve">│   ├── chi_dct_ctrl</w:t>
       </w:r>
       <w:r>
         <w:br/>
       </w:r>
       <w:r>
+        <w:rPr>
+          <w:rStyle w:val="VerbatimChar"/>
+        </w:rPr>
+        <w:t xml:space="preserve">│   ├── chi_dmt_ctrl</w:t>
+      </w:r>
+      <w:r>
         <w:br/>
       </w:r>
       <w:r>
         <w:rPr>
           <w:rStyle w:val="VerbatimChar"/>
         </w:rPr>
-        <w:t xml:space="preserve">  APB4 --&gt; chi_cfg_slave --&gt; shared SAM region-update broadcast</w:t>
+        <w:t xml:space="preserve">│   ├── chi_dwt_ctrl</w:t>
+      </w:r>
+      <w:r>
+        <w:br/>
+      </w:r>
+      <w:r>
+        <w:rPr>
+          <w:rStyle w:val="VerbatimChar"/>
+        </w:rPr>
+        <w:t xml:space="preserve">│   ├── chi_stash_ctrl</w:t>
+      </w:r>
+      <w:r>
+        <w:br/>
+      </w:r>
+      <w:r>
+        <w:rPr>
+          <w:rStyle w:val="VerbatimChar"/>
+        </w:rPr>
+        <w:t xml:space="preserve">│   ├── chi_atomic_alu</w:t>
+      </w:r>
+      <w:r>
+        <w:br/>
+      </w:r>
+      <w:r>
+        <w:rPr>
+          <w:rStyle w:val="VerbatimChar"/>
+        </w:rPr>
+        <w:t xml:space="preserve">│   ├── chi_cmo</w:t>
+      </w:r>
+      <w:r>
+        <w:br/>
+      </w:r>
+      <w:r>
+        <w:rPr>
+          <w:rStyle w:val="VerbatimChar"/>
+        </w:rPr>
+        <w:t xml:space="preserve">│   └── chi_excl_mon</w:t>
+      </w:r>
+      <w:r>
+        <w:br/>
+      </w:r>
+      <w:r>
+        <w:rPr>
+          <w:rStyle w:val="VerbatimChar"/>
+        </w:rPr>
+        <w:t xml:space="preserve">├── hni_nodes[*] : chi_hni_top</w:t>
+      </w:r>
+      <w:r>
+        <w:br/>
+      </w:r>
+      <w:r>
+        <w:rPr>
+          <w:rStyle w:val="VerbatimChar"/>
+        </w:rPr>
+        <w:t xml:space="preserve">│   └── chi_sam</w:t>
+      </w:r>
+      <w:r>
+        <w:br/>
+      </w:r>
+      <w:r>
+        <w:rPr>
+          <w:rStyle w:val="VerbatimChar"/>
+        </w:rPr>
+        <w:t xml:space="preserve">├── mn_nodes[*] : chi_mn_dvm</w:t>
+      </w:r>
+      <w:r>
+        <w:br/>
+      </w:r>
+      <w:r>
+        <w:rPr>
+          <w:rStyle w:val="VerbatimChar"/>
+        </w:rPr>
+        <w:t xml:space="preserve">└── chi_noc_top</w:t>
+      </w:r>
+      <w:r>
+        <w:br/>
+      </w:r>
+      <w:r>
+        <w:rPr>
+          <w:rStyle w:val="VerbatimChar"/>
+        </w:rPr>
+        <w:t xml:space="preserve">    ├── chi_xbar ── chi_vc_arb[*]                   [CROSSBAR]</w:t>
+      </w:r>
+      <w:r>
+        <w:br/>
+      </w:r>
+      <w:r>
+        <w:rPr>
+          <w:rStyle w:val="VerbatimChar"/>
+        </w:rPr>
+        <w:t xml:space="preserve">    ├── chi_ring                                    [RING]</w:t>
+      </w:r>
+      <w:r>
+        <w:br/>
+      </w:r>
+      <w:r>
+        <w:rPr>
+          <w:rStyle w:val="VerbatimChar"/>
+        </w:rPr>
+        <w:t xml:space="preserve">    └── chi_mesh                                    [MESH_2D]</w:t>
+      </w:r>
+      <w:r>
+        <w:br/>
+      </w:r>
+      <w:r>
+        <w:rPr>
+          <w:rStyle w:val="VerbatimChar"/>
+        </w:rPr>
+        <w:t xml:space="preserve">        └── chi_mesh_xp[*]</w:t>
+      </w:r>
+      <w:r>
+        <w:br/>
+      </w:r>
+      <w:r>
+        <w:rPr>
+          <w:rStyle w:val="VerbatimChar"/>
+        </w:rPr>
+        <w:t xml:space="preserve">            └── chi_router[REQ/RSP/SNP/DAT]</w:t>
+      </w:r>
+      <w:r>
+        <w:br/>
+      </w:r>
+      <w:r>
+        <w:rPr>
+          <w:rStyle w:val="VerbatimChar"/>
+        </w:rPr>
+        <w:t xml:space="preserve">                ├── chi_route_compute[*]</w:t>
+      </w:r>
+      <w:r>
+        <w:br/>
+      </w:r>
+      <w:r>
+        <w:rPr>
+          <w:rStyle w:val="VerbatimChar"/>
+        </w:rPr>
+        <w:t xml:space="preserve">                └── chi_vc_arb[*]</w:t>
       </w:r>
     </w:p>
     <w:p>
@@ -4369,406 +5190,38 @@
         <w:pStyle w:val="FirstParagraph"/>
       </w:pPr>
       <w:r>
-        <w:t xml:space="preserve">HN-F, HN-I and MN are internal endpoints on the fabric, not external</w:t>
-      </w:r>
-      <w:r>
-        <w:t xml:space="preserve"> </w:t>
-      </w:r>
-      <w:r>
-        <w:rPr>
-          <w:rStyle w:val="VerbatimChar"/>
-        </w:rPr>
-        <w:t xml:space="preserve">chi_if</w:t>
-      </w:r>
-      <w:r>
-        <w:t xml:space="preserve"> </w:t>
-      </w:r>
-      <w:r>
-        <w:t xml:space="preserve">ports, so they have no link layer.</w:t>
+        <w:rPr>
+          <w:rStyle w:val="VerbatimChar"/>
+        </w:rPr>
+        <w:t xml:space="preserve">chi_lcrd_mgr</w:t>
+      </w:r>
+      <w:r>
+        <w:t xml:space="preserve"> </w:t>
+      </w:r>
+      <w:r>
+        <w:t xml:space="preserve">is used by</w:t>
+      </w:r>
+      <w:r>
+        <w:t xml:space="preserve"> </w:t>
+      </w:r>
+      <w:r>
+        <w:rPr>
+          <w:rStyle w:val="VerbatimChar"/>
+        </w:rPr>
+        <w:t xml:space="preserve">chi_link_tx</w:t>
+      </w:r>
+      <w:r>
+        <w:t xml:space="preserve">. Every link block is now inside the</w:t>
+      </w:r>
+      <w:r>
+        <w:t xml:space="preserve"> </w:t>
+      </w:r>
+      <w:r>
+        <w:t xml:space="preserve">product hierarchy; none of them is harness-only.</w:t>
       </w:r>
     </w:p>
-    <w:bookmarkEnd w:id="26"/>
-    <w:bookmarkStart w:id="27" w:name="rtl-hierarchy"/>
-    <w:p>
-      <w:pPr>
-        <w:pStyle w:val="Heading2"/>
-      </w:pPr>
-      <w:r>
-        <w:t xml:space="preserve">2.2 RTL hierarchy</w:t>
-      </w:r>
-    </w:p>
-    <w:p>
-      <w:pPr>
-        <w:pStyle w:val="SourceCode"/>
-      </w:pPr>
-      <w:r>
-        <w:rPr>
-          <w:rStyle w:val="VerbatimChar"/>
-        </w:rPr>
-        <w:t xml:space="preserve">chi_interconnect_top</w:t>
-      </w:r>
-      <w:r>
-        <w:br/>
-      </w:r>
-      <w:r>
-        <w:rPr>
-          <w:rStyle w:val="VerbatimChar"/>
-        </w:rPr>
-        <w:t xml:space="preserve">├── chi_cfg_check                            (elaboration assertions)</w:t>
-      </w:r>
-      <w:r>
-        <w:br/>
-      </w:r>
-      <w:r>
-        <w:rPr>
-          <w:rStyle w:val="VerbatimChar"/>
-        </w:rPr>
-        <w:t xml:space="preserve">├── rnf_ports[*] / rnd_ports[*] / rni_ports[*] : chi_link_port</w:t>
-      </w:r>
-      <w:r>
-        <w:br/>
-      </w:r>
-      <w:r>
-        <w:rPr>
-          <w:rStyle w:val="VerbatimChar"/>
-        </w:rPr>
-        <w:t xml:space="preserve">│   ├── chi_link_rx  x3   (REQ, RSP, DAT from the node)</w:t>
-      </w:r>
-      <w:r>
-        <w:br/>
-      </w:r>
-      <w:r>
-        <w:rPr>
-          <w:rStyle w:val="VerbatimChar"/>
-        </w:rPr>
-        <w:t xml:space="preserve">│   ├── chi_link_tx  x3   (RSP, SNP, DAT to the node)</w:t>
-      </w:r>
-      <w:r>
-        <w:br/>
-      </w:r>
-      <w:r>
-        <w:rPr>
-          <w:rStyle w:val="VerbatimChar"/>
-        </w:rPr>
-        <w:t xml:space="preserve">│   └── chi_link_fsm x6   (one per channel per direction)</w:t>
-      </w:r>
-      <w:r>
-        <w:br/>
-      </w:r>
-      <w:r>
-        <w:rPr>
-          <w:rStyle w:val="VerbatimChar"/>
-        </w:rPr>
-        <w:t xml:space="preserve">├── snf_ports[*] / sni_ports[*] : chi_link_port</w:t>
-      </w:r>
-      <w:r>
-        <w:br/>
-      </w:r>
-      <w:r>
-        <w:rPr>
-          <w:rStyle w:val="VerbatimChar"/>
-        </w:rPr>
-        <w:t xml:space="preserve">│   ├── chi_link_rx  x2   (RSP, DAT from the node)</w:t>
-      </w:r>
-      <w:r>
-        <w:br/>
-      </w:r>
-      <w:r>
-        <w:rPr>
-          <w:rStyle w:val="VerbatimChar"/>
-        </w:rPr>
-        <w:t xml:space="preserve">│   └── chi_link_tx  x3   (REQ, RSP, DAT to the node)</w:t>
-      </w:r>
-      <w:r>
-        <w:br/>
-      </w:r>
-      <w:r>
-        <w:rPr>
-          <w:rStyle w:val="VerbatimChar"/>
-        </w:rPr>
-        <w:t xml:space="preserve">├── requester_sam[*]</w:t>
-      </w:r>
-      <w:r>
-        <w:br/>
-      </w:r>
-      <w:r>
-        <w:rPr>
-          <w:rStyle w:val="VerbatimChar"/>
-        </w:rPr>
-        <w:t xml:space="preserve">│   ├── chi_sam  ── chi_hn_hash</w:t>
-      </w:r>
-      <w:r>
-        <w:br/>
-      </w:r>
-      <w:r>
-        <w:rPr>
-          <w:rStyle w:val="VerbatimChar"/>
-        </w:rPr>
-        <w:t xml:space="preserve">│   └── chi_prefetch_map</w:t>
-      </w:r>
-      <w:r>
-        <w:br/>
-      </w:r>
-      <w:r>
-        <w:rPr>
-          <w:rStyle w:val="VerbatimChar"/>
-        </w:rPr>
-        <w:t xml:space="preserve">├── apb_cfg : chi_cfg_slave                          [CFG_APB]</w:t>
-      </w:r>
-      <w:r>
-        <w:br/>
-      </w:r>
-      <w:r>
-        <w:rPr>
-          <w:rStyle w:val="VerbatimChar"/>
-        </w:rPr>
-        <w:t xml:space="preserve">├── hnf_nodes[*] : chi_hnf_top</w:t>
-      </w:r>
-      <w:r>
-        <w:br/>
-      </w:r>
-      <w:r>
-        <w:rPr>
-          <w:rStyle w:val="VerbatimChar"/>
-        </w:rPr>
-        <w:t xml:space="preserve">│   ├── chi_pos</w:t>
-      </w:r>
-      <w:r>
-        <w:br/>
-      </w:r>
-      <w:r>
-        <w:rPr>
-          <w:rStyle w:val="VerbatimChar"/>
-        </w:rPr>
-        <w:t xml:space="preserve">│   ├── chi_hazard</w:t>
-      </w:r>
-      <w:r>
-        <w:br/>
-      </w:r>
-      <w:r>
-        <w:rPr>
-          <w:rStyle w:val="VerbatimChar"/>
-        </w:rPr>
-        <w:t xml:space="preserve">│   ├── chi_snoop_filter</w:t>
-      </w:r>
-      <w:r>
-        <w:br/>
-      </w:r>
-      <w:r>
-        <w:rPr>
-          <w:rStyle w:val="VerbatimChar"/>
-        </w:rPr>
-        <w:t xml:space="preserve">│   ├── chi_snp_gen</w:t>
-      </w:r>
-      <w:r>
-        <w:br/>
-      </w:r>
-      <w:r>
-        <w:rPr>
-          <w:rStyle w:val="VerbatimChar"/>
-        </w:rPr>
-        <w:t xml:space="preserve">│   ├── chi_retry</w:t>
-      </w:r>
-      <w:r>
-        <w:br/>
-      </w:r>
-      <w:r>
-        <w:rPr>
-          <w:rStyle w:val="VerbatimChar"/>
-        </w:rPr>
-        <w:t xml:space="preserve">│   ├── chi_dct_ctrl</w:t>
-      </w:r>
-      <w:r>
-        <w:br/>
-      </w:r>
-      <w:r>
-        <w:rPr>
-          <w:rStyle w:val="VerbatimChar"/>
-        </w:rPr>
-        <w:t xml:space="preserve">│   ├── chi_dmt_ctrl</w:t>
-      </w:r>
-      <w:r>
-        <w:br/>
-      </w:r>
-      <w:r>
-        <w:rPr>
-          <w:rStyle w:val="VerbatimChar"/>
-        </w:rPr>
-        <w:t xml:space="preserve">│   ├── chi_dwt_ctrl</w:t>
-      </w:r>
-      <w:r>
-        <w:br/>
-      </w:r>
-      <w:r>
-        <w:rPr>
-          <w:rStyle w:val="VerbatimChar"/>
-        </w:rPr>
-        <w:t xml:space="preserve">│   ├── chi_stash_ctrl</w:t>
-      </w:r>
-      <w:r>
-        <w:br/>
-      </w:r>
-      <w:r>
-        <w:rPr>
-          <w:rStyle w:val="VerbatimChar"/>
-        </w:rPr>
-        <w:t xml:space="preserve">│   ├── chi_atomic_alu</w:t>
-      </w:r>
-      <w:r>
-        <w:br/>
-      </w:r>
-      <w:r>
-        <w:rPr>
-          <w:rStyle w:val="VerbatimChar"/>
-        </w:rPr>
-        <w:t xml:space="preserve">│   ├── chi_cmo</w:t>
-      </w:r>
-      <w:r>
-        <w:br/>
-      </w:r>
-      <w:r>
-        <w:rPr>
-          <w:rStyle w:val="VerbatimChar"/>
-        </w:rPr>
-        <w:t xml:space="preserve">│   └── chi_excl_mon</w:t>
-      </w:r>
-      <w:r>
-        <w:br/>
-      </w:r>
-      <w:r>
-        <w:rPr>
-          <w:rStyle w:val="VerbatimChar"/>
-        </w:rPr>
-        <w:t xml:space="preserve">├── hni_nodes[*] : chi_hni_top</w:t>
-      </w:r>
-      <w:r>
-        <w:br/>
-      </w:r>
-      <w:r>
-        <w:rPr>
-          <w:rStyle w:val="VerbatimChar"/>
-        </w:rPr>
-        <w:t xml:space="preserve">│   └── chi_sam</w:t>
-      </w:r>
-      <w:r>
-        <w:br/>
-      </w:r>
-      <w:r>
-        <w:rPr>
-          <w:rStyle w:val="VerbatimChar"/>
-        </w:rPr>
-        <w:t xml:space="preserve">├── mn_nodes[*] : chi_mn_dvm</w:t>
-      </w:r>
-      <w:r>
-        <w:br/>
-      </w:r>
-      <w:r>
-        <w:rPr>
-          <w:rStyle w:val="VerbatimChar"/>
-        </w:rPr>
-        <w:t xml:space="preserve">└── chi_noc_top</w:t>
-      </w:r>
-      <w:r>
-        <w:br/>
-      </w:r>
-      <w:r>
-        <w:rPr>
-          <w:rStyle w:val="VerbatimChar"/>
-        </w:rPr>
-        <w:t xml:space="preserve">    ├── chi_xbar ── chi_vc_arb[*]                   [CROSSBAR]</w:t>
-      </w:r>
-      <w:r>
-        <w:br/>
-      </w:r>
-      <w:r>
-        <w:rPr>
-          <w:rStyle w:val="VerbatimChar"/>
-        </w:rPr>
-        <w:t xml:space="preserve">    ├── chi_ring                                    [RING]</w:t>
-      </w:r>
-      <w:r>
-        <w:br/>
-      </w:r>
-      <w:r>
-        <w:rPr>
-          <w:rStyle w:val="VerbatimChar"/>
-        </w:rPr>
-        <w:t xml:space="preserve">    └── chi_mesh                                    [MESH_2D]</w:t>
-      </w:r>
-      <w:r>
-        <w:br/>
-      </w:r>
-      <w:r>
-        <w:rPr>
-          <w:rStyle w:val="VerbatimChar"/>
-        </w:rPr>
-        <w:t xml:space="preserve">        └── chi_mesh_xp[*]</w:t>
-      </w:r>
-      <w:r>
-        <w:br/>
-      </w:r>
-      <w:r>
-        <w:rPr>
-          <w:rStyle w:val="VerbatimChar"/>
-        </w:rPr>
-        <w:t xml:space="preserve">            └── chi_router[REQ/RSP/SNP/DAT]</w:t>
-      </w:r>
-      <w:r>
-        <w:br/>
-      </w:r>
-      <w:r>
-        <w:rPr>
-          <w:rStyle w:val="VerbatimChar"/>
-        </w:rPr>
-        <w:t xml:space="preserve">                ├── chi_route_compute[*]</w:t>
-      </w:r>
-      <w:r>
-        <w:br/>
-      </w:r>
-      <w:r>
-        <w:rPr>
-          <w:rStyle w:val="VerbatimChar"/>
-        </w:rPr>
-        <w:t xml:space="preserve">                └── chi_vc_arb[*]</w:t>
-      </w:r>
-    </w:p>
-    <w:p>
-      <w:pPr>
-        <w:pStyle w:val="FirstParagraph"/>
-      </w:pPr>
-      <w:r>
-        <w:rPr>
-          <w:rStyle w:val="VerbatimChar"/>
-        </w:rPr>
-        <w:t xml:space="preserve">chi_lcrd_mgr</w:t>
-      </w:r>
-      <w:r>
-        <w:t xml:space="preserve"> </w:t>
-      </w:r>
-      <w:r>
-        <w:t xml:space="preserve">is used by</w:t>
-      </w:r>
-      <w:r>
-        <w:t xml:space="preserve"> </w:t>
-      </w:r>
-      <w:r>
-        <w:rPr>
-          <w:rStyle w:val="VerbatimChar"/>
-        </w:rPr>
-        <w:t xml:space="preserve">chi_link_tx</w:t>
-      </w:r>
-      <w:r>
-        <w:t xml:space="preserve">. Every link block is now inside the</w:t>
-      </w:r>
-      <w:r>
-        <w:t xml:space="preserve"> </w:t>
-      </w:r>
-      <w:r>
-        <w:t xml:space="preserve">product hierarchy; none of them is harness-only.</w:t>
-      </w:r>
-    </w:p>
-    <w:bookmarkEnd w:id="27"/>
-    <w:bookmarkStart w:id="28" w:name="handshake-discipline"/>
+    <w:bookmarkEnd w:id="34"/>
+    <w:bookmarkStart w:id="35" w:name="handshake-discipline"/>
     <w:p>
       <w:pPr>
         <w:pStyle w:val="Heading2"/>
@@ -4934,9 +5387,9 @@
         <w:t xml:space="preserve">combinational logic, which Section 12.6 records as a passing lint result.</w:t>
       </w:r>
     </w:p>
-    <w:bookmarkEnd w:id="28"/>
-    <w:bookmarkEnd w:id="29"/>
-    <w:bookmarkStart w:id="33" w:name="parameters-and-elaboration-constraints"/>
+    <w:bookmarkEnd w:id="35"/>
+    <w:bookmarkEnd w:id="36"/>
+    <w:bookmarkStart w:id="40" w:name="parameters-and-elaboration-constraints"/>
     <w:p>
       <w:pPr>
         <w:pStyle w:val="Heading1"/>
@@ -4945,7 +5398,7 @@
         <w:t xml:space="preserve">3 Parameters and elaboration constraints</w:t>
       </w:r>
     </w:p>
-    <w:bookmarkStart w:id="30" w:name="chi_cfg_t"/>
+    <w:bookmarkStart w:id="37" w:name="chi_cfg_t"/>
     <w:p>
       <w:pPr>
         <w:pStyle w:val="Heading2"/>
@@ -7917,8 +8370,8 @@
         <w:t xml:space="preserve">helper.</w:t>
       </w:r>
     </w:p>
-    <w:bookmarkEnd w:id="30"/>
-    <w:bookmarkStart w:id="31" w:name="top-parameters-and-illegal-combinations"/>
+    <w:bookmarkEnd w:id="37"/>
+    <w:bookmarkStart w:id="38" w:name="top-parameters-and-illegal-combinations"/>
     <w:p>
       <w:pPr>
         <w:pStyle w:val="Heading2"/>
@@ -8415,8 +8868,8 @@
         <w:t xml:space="preserve">subordinate checks are essential.</w:t>
       </w:r>
     </w:p>
-    <w:bookmarkEnd w:id="31"/>
-    <w:bookmarkStart w:id="32" w:name="top-level-ports-beyond-the-interfaces"/>
+    <w:bookmarkEnd w:id="38"/>
+    <w:bookmarkStart w:id="39" w:name="top-level-ports-beyond-the-interfaces"/>
     <w:p>
       <w:pPr>
         <w:pStyle w:val="Heading2"/>
@@ -8941,9 +9394,9 @@
         <w:t xml:space="preserve">and MN ordinals read zero, because those endpoints have no external link.</w:t>
       </w:r>
     </w:p>
-    <w:bookmarkEnd w:id="32"/>
-    <w:bookmarkEnd w:id="33"/>
-    <w:bookmarkStart w:id="37" w:name="the-single-chi_if-node-facing-interface"/>
+    <w:bookmarkEnd w:id="39"/>
+    <w:bookmarkEnd w:id="40"/>
+    <w:bookmarkStart w:id="44" w:name="the-single-chi_if-node-facing-interface"/>
     <w:p>
       <w:pPr>
         <w:pStyle w:val="Heading1"/>
@@ -8967,7 +9420,7 @@
         <w:t xml:space="preserve">node-facing interface</w:t>
       </w:r>
     </w:p>
-    <w:bookmarkStart w:id="34" w:name="superset-rule"/>
+    <w:bookmarkStart w:id="41" w:name="superset-rule"/>
     <w:p>
       <w:pPr>
         <w:pStyle w:val="Heading2"/>
@@ -9088,8 +9541,8 @@
         <w:t xml:space="preserve">zero-length interface array. That sentinel is inactive and must be tied off.</w:t>
       </w:r>
     </w:p>
-    <w:bookmarkEnd w:id="34"/>
-    <w:bookmarkStart w:id="35" w:name="signal-widths-and-drivers"/>
+    <w:bookmarkEnd w:id="41"/>
+    <w:bookmarkStart w:id="42" w:name="signal-widths-and-drivers"/>
     <w:p>
       <w:pPr>
         <w:pStyle w:val="Heading2"/>
@@ -11556,8 +12009,8 @@
         <w:t xml:space="preserve">presence of a signal in this superset.</w:t>
       </w:r>
     </w:p>
-    <w:bookmarkEnd w:id="35"/>
-    <w:bookmarkStart w:id="36" w:name="link-credit-behaviour"/>
+    <w:bookmarkEnd w:id="42"/>
+    <w:bookmarkStart w:id="43" w:name="link-credit-behaviour"/>
     <w:p>
       <w:pPr>
         <w:pStyle w:val="Heading2"/>
@@ -11672,9 +12125,9 @@
         <w:t xml:space="preserve">credit contract, not a recoverable condition.</w:t>
       </w:r>
     </w:p>
-    <w:bookmarkEnd w:id="36"/>
-    <w:bookmarkEnd w:id="37"/>
-    <w:bookmarkStart w:id="43" w:name="X2fe9938731c8eed18a556030bbcfb1970107fb8"/>
+    <w:bookmarkEnd w:id="43"/>
+    <w:bookmarkEnd w:id="44"/>
+    <w:bookmarkStart w:id="50" w:name="X2fe9938731c8eed18a556030bbcfb1970107fb8"/>
     <w:p>
       <w:pPr>
         <w:pStyle w:val="Heading1"/>
@@ -11683,7 +12136,7 @@
         <w:t xml:space="preserve">5 Topologies, routing, arbitration and progress</w:t>
       </w:r>
     </w:p>
-    <w:bookmarkStart w:id="38" w:name="common-transport"/>
+    <w:bookmarkStart w:id="45" w:name="common-transport"/>
     <w:p>
       <w:pPr>
         <w:pStyle w:val="Heading2"/>
@@ -11745,8 +12198,8 @@
         <w:t xml:space="preserve">.</w:t>
       </w:r>
     </w:p>
-    <w:bookmarkEnd w:id="38"/>
-    <w:bookmarkStart w:id="39" w:name="crossbar"/>
+    <w:bookmarkEnd w:id="45"/>
+    <w:bookmarkStart w:id="46" w:name="crossbar"/>
     <w:p>
       <w:pPr>
         <w:pStyle w:val="Heading2"/>
@@ -11799,8 +12252,8 @@
         <w:t xml:space="preserve">backpressured.</w:t>
       </w:r>
     </w:p>
-    <w:bookmarkEnd w:id="39"/>
-    <w:bookmarkStart w:id="40" w:name="bidirectional-ring"/>
+    <w:bookmarkEnd w:id="46"/>
+    <w:bookmarkStart w:id="47" w:name="bidirectional-ring"/>
     <w:p>
       <w:pPr>
         <w:pStyle w:val="Heading2"/>
@@ -11879,8 +12332,8 @@
         <w:t xml:space="preserve">ejection does worse.</w:t>
       </w:r>
     </w:p>
-    <w:bookmarkEnd w:id="40"/>
-    <w:bookmarkStart w:id="41" w:name="mesh-placement-and-nodeid"/>
+    <w:bookmarkEnd w:id="47"/>
+    <w:bookmarkStart w:id="48" w:name="mesh-placement-and-nodeid"/>
     <w:p>
       <w:pPr>
         <w:pStyle w:val="Heading2"/>
@@ -12232,8 +12685,8 @@
         <w:t xml:space="preserve">adds one receive-buffer cycle in each direction.</w:t>
       </w:r>
     </w:p>
-    <w:bookmarkEnd w:id="41"/>
-    <w:bookmarkStart w:id="42" w:name="snoop-distribution-deadlock-and-livelock"/>
+    <w:bookmarkEnd w:id="48"/>
+    <w:bookmarkStart w:id="49" w:name="snoop-distribution-deadlock-and-livelock"/>
     <w:p>
       <w:pPr>
         <w:pStyle w:val="Heading2"/>
@@ -12360,9 +12813,9 @@
         <w:t xml:space="preserve">there is no end-to-end livelock watchdog and no bounded-completion proof.</w:t>
       </w:r>
     </w:p>
-    <w:bookmarkEnd w:id="42"/>
-    <w:bookmarkEnd w:id="43"/>
-    <w:bookmarkStart w:id="48" w:name="system-address-map"/>
+    <w:bookmarkEnd w:id="49"/>
+    <w:bookmarkEnd w:id="50"/>
+    <w:bookmarkStart w:id="55" w:name="system-address-map"/>
     <w:p>
       <w:pPr>
         <w:pStyle w:val="Heading1"/>
@@ -12371,7 +12824,7 @@
         <w:t xml:space="preserve">6 System Address Map</w:t>
       </w:r>
     </w:p>
-    <w:bookmarkStart w:id="44" w:name="lookup-and-default-regions"/>
+    <w:bookmarkStart w:id="51" w:name="lookup-and-default-regions"/>
     <w:p>
       <w:pPr>
         <w:pStyle w:val="Heading2"/>
@@ -12891,8 +13344,8 @@
         <w:t xml:space="preserve">.</w:t>
       </w:r>
     </w:p>
-    <w:bookmarkEnd w:id="44"/>
-    <w:bookmarkStart w:id="45" w:name="hn-hash-and-worked-example"/>
+    <w:bookmarkEnd w:id="51"/>
+    <w:bookmarkStart w:id="52" w:name="hn-hash-and-worked-example"/>
     <w:p>
       <w:pPr>
         <w:pStyle w:val="Heading2"/>
@@ -13016,8 +13469,8 @@
         <w:t xml:space="preserve">).</w:t>
       </w:r>
     </w:p>
-    <w:bookmarkEnd w:id="45"/>
-    <w:bookmarkStart w:id="46" w:name="prefetchtgt-mapping"/>
+    <w:bookmarkEnd w:id="52"/>
+    <w:bookmarkStart w:id="53" w:name="prefetchtgt-mapping"/>
     <w:p>
       <w:pPr>
         <w:pStyle w:val="Heading2"/>
@@ -13146,8 +13599,8 @@
         <w:t xml:space="preserve">reaches them.</w:t>
       </w:r>
     </w:p>
-    <w:bookmarkEnd w:id="46"/>
-    <w:bookmarkStart w:id="47" w:name="retargeting"/>
+    <w:bookmarkEnd w:id="53"/>
+    <w:bookmarkStart w:id="54" w:name="retargeting"/>
     <w:p>
       <w:pPr>
         <w:pStyle w:val="Heading2"/>
@@ -13233,9 +13686,9 @@
         <w:t xml:space="preserve">existence on a runtime update.</w:t>
       </w:r>
     </w:p>
-    <w:bookmarkEnd w:id="47"/>
-    <w:bookmarkEnd w:id="48"/>
-    <w:bookmarkStart w:id="51" w:name="configuration-access"/>
+    <w:bookmarkEnd w:id="54"/>
+    <w:bookmarkEnd w:id="55"/>
+    <w:bookmarkStart w:id="58" w:name="configuration-access"/>
     <w:p>
       <w:pPr>
         <w:pStyle w:val="Heading1"/>
@@ -13271,7 +13724,7 @@
         <w:t xml:space="preserve">.</w:t>
       </w:r>
     </w:p>
-    <w:bookmarkStart w:id="49" w:name="apb4-map"/>
+    <w:bookmarkStart w:id="56" w:name="apb4-map"/>
     <w:p>
       <w:pPr>
         <w:pStyle w:val="Heading2"/>
@@ -14058,8 +14511,8 @@
         <w:t xml:space="preserve">does nothing and does not error.</w:t>
       </w:r>
     </w:p>
-    <w:bookmarkEnd w:id="49"/>
-    <w:bookmarkStart w:id="50" w:name="chi-mmio-map-and-limitations"/>
+    <w:bookmarkEnd w:id="56"/>
+    <w:bookmarkStart w:id="57" w:name="chi-mmio-map-and-limitations"/>
     <w:p>
       <w:pPr>
         <w:pStyle w:val="Heading2"/>
@@ -14365,9 +14818,9 @@
         <w:t xml:space="preserve">path, not a hardened management interface.</w:t>
       </w:r>
     </w:p>
-    <w:bookmarkEnd w:id="50"/>
-    <w:bookmarkEnd w:id="51"/>
-    <w:bookmarkStart w:id="60" w:name="transaction-flows"/>
+    <w:bookmarkEnd w:id="57"/>
+    <w:bookmarkEnd w:id="58"/>
+    <w:bookmarkStart w:id="67" w:name="transaction-flows"/>
     <w:p>
       <w:pPr>
         <w:pStyle w:val="Heading1"/>
@@ -14390,7 +14843,7 @@
         <w:t xml:space="preserve">table states what the RTL does.</w:t>
       </w:r>
     </w:p>
-    <w:bookmarkStart w:id="52" w:name="readshared-with-dct"/>
+    <w:bookmarkStart w:id="59" w:name="readshared-with-dct"/>
     <w:p>
       <w:pPr>
         <w:pStyle w:val="Heading2"/>
@@ -14763,8 +15216,8 @@
         <w:t xml:space="preserve">not implemented.</w:t>
       </w:r>
     </w:p>
-    <w:bookmarkEnd w:id="52"/>
-    <w:bookmarkStart w:id="53" w:name="readunique-with-dmt"/>
+    <w:bookmarkEnd w:id="59"/>
+    <w:bookmarkStart w:id="60" w:name="readunique-with-dmt"/>
     <w:p>
       <w:pPr>
         <w:pStyle w:val="Heading2"/>
@@ -15197,8 +15650,8 @@
         <w:t xml:space="preserve">same path.</w:t>
       </w:r>
     </w:p>
-    <w:bookmarkEnd w:id="53"/>
-    <w:bookmarkStart w:id="54" w:name="writebackfull-with-dwt"/>
+    <w:bookmarkEnd w:id="60"/>
+    <w:bookmarkStart w:id="61" w:name="writebackfull-with-dwt"/>
     <w:p>
       <w:pPr>
         <w:pStyle w:val="Heading2"/>
@@ -15663,8 +16116,8 @@
         <w:t xml:space="preserve">and write cancellation remain incomplete.</w:t>
       </w:r>
     </w:p>
-    <w:bookmarkEnd w:id="54"/>
-    <w:bookmarkStart w:id="55" w:name="cleanunique-with-snoops"/>
+    <w:bookmarkEnd w:id="61"/>
+    <w:bookmarkStart w:id="62" w:name="cleanunique-with-snoops"/>
     <w:p>
       <w:pPr>
         <w:pStyle w:val="Heading2"/>
@@ -16113,8 +16566,8 @@
         <w:t xml:space="preserve">selection and directory transitions are simplified.</w:t>
       </w:r>
     </w:p>
-    <w:bookmarkEnd w:id="55"/>
-    <w:bookmarkStart w:id="56" w:name="atomicload"/>
+    <w:bookmarkEnd w:id="62"/>
+    <w:bookmarkStart w:id="63" w:name="atomicload"/>
     <w:p>
       <w:pPr>
         <w:pStyle w:val="Heading2"/>
@@ -16775,8 +17228,8 @@
         <w:t xml:space="preserve">performed at the Home; there is no far-atomic negotiation.</w:t>
       </w:r>
     </w:p>
-    <w:bookmarkEnd w:id="56"/>
-    <w:bookmarkStart w:id="57" w:name="request-retry"/>
+    <w:bookmarkEnd w:id="63"/>
+    <w:bookmarkStart w:id="64" w:name="request-retry"/>
     <w:p>
       <w:pPr>
         <w:pStyle w:val="Heading2"/>
@@ -17332,8 +17785,8 @@
         <w:t xml:space="preserve">the credit accounting exact.</w:t>
       </w:r>
     </w:p>
-    <w:bookmarkEnd w:id="57"/>
-    <w:bookmarkStart w:id="58" w:name="writeuniquefullstash-with-data-pull"/>
+    <w:bookmarkEnd w:id="64"/>
+    <w:bookmarkStart w:id="65" w:name="writeuniquefullstash-with-data-pull"/>
     <w:p>
       <w:pPr>
         <w:pStyle w:val="Heading2"/>
@@ -18137,8 +18590,8 @@
         <w:t xml:space="preserve">.</w:t>
       </w:r>
     </w:p>
-    <w:bookmarkEnd w:id="58"/>
-    <w:bookmarkStart w:id="59" w:name="dvm-sync"/>
+    <w:bookmarkEnd w:id="65"/>
+    <w:bookmarkStart w:id="66" w:name="dvm-sync"/>
     <w:p>
       <w:pPr>
         <w:pStyle w:val="Heading2"/>
@@ -18552,9 +19005,9 @@
         <w:t xml:space="preserve">applied.</w:t>
       </w:r>
     </w:p>
-    <w:bookmarkEnd w:id="59"/>
-    <w:bookmarkEnd w:id="60"/>
-    <w:bookmarkStart w:id="65" w:name="home-node-internals"/>
+    <w:bookmarkEnd w:id="66"/>
+    <w:bookmarkEnd w:id="67"/>
+    <w:bookmarkStart w:id="72" w:name="home-node-internals"/>
     <w:p>
       <w:pPr>
         <w:pStyle w:val="Heading1"/>
@@ -18563,7 +19016,7 @@
         <w:t xml:space="preserve">9 Home Node internals</w:t>
       </w:r>
     </w:p>
-    <w:bookmarkStart w:id="61" w:name="serialization"/>
+    <w:bookmarkStart w:id="68" w:name="serialization"/>
     <w:p>
       <w:pPr>
         <w:pStyle w:val="Heading2"/>
@@ -18800,8 +19253,8 @@
         <w:t xml:space="preserve">and discarded without allocating a POS entry.</w:t>
       </w:r>
     </w:p>
-    <w:bookmarkEnd w:id="61"/>
-    <w:bookmarkStart w:id="62" w:name="directory"/>
+    <w:bookmarkEnd w:id="68"/>
+    <w:bookmarkStart w:id="69" w:name="directory"/>
     <w:p>
       <w:pPr>
         <w:pStyle w:val="Heading2"/>
@@ -18854,8 +19307,8 @@
         <w:t xml:space="preserve">is not the complete Issue H state machine.</w:t>
       </w:r>
     </w:p>
-    <w:bookmarkEnd w:id="62"/>
-    <w:bookmarkStart w:id="63" w:name="retry-credits"/>
+    <w:bookmarkEnd w:id="69"/>
+    <w:bookmarkStart w:id="70" w:name="retry-credits"/>
     <w:p>
       <w:pPr>
         <w:pStyle w:val="Heading2"/>
@@ -19013,8 +19466,8 @@
         <w:t xml:space="preserve">.</w:t>
       </w:r>
     </w:p>
-    <w:bookmarkEnd w:id="63"/>
-    <w:bookmarkStart w:id="64" w:name="ordering"/>
+    <w:bookmarkEnd w:id="70"/>
+    <w:bookmarkStart w:id="71" w:name="ordering"/>
     <w:p>
       <w:pPr>
         <w:pStyle w:val="Heading2"/>
@@ -19073,9 +19526,9 @@
         <w:t xml:space="preserve">not distinguished, so the implementation is stricter than Issue H requires.</w:t>
       </w:r>
     </w:p>
-    <w:bookmarkEnd w:id="64"/>
-    <w:bookmarkEnd w:id="65"/>
-    <w:bookmarkStart w:id="68" w:name="rn-f-boundary-cache-state-model"/>
+    <w:bookmarkEnd w:id="71"/>
+    <w:bookmarkEnd w:id="72"/>
+    <w:bookmarkStart w:id="75" w:name="rn-f-boundary-cache-state-model"/>
     <w:p>
       <w:pPr>
         <w:pStyle w:val="Heading1"/>
@@ -19131,7 +19584,7 @@
         <w:t xml:space="preserve">repository.</w:t>
       </w:r>
     </w:p>
-    <w:bookmarkStart w:id="66" w:name="request-driven-target-states"/>
+    <w:bookmarkStart w:id="73" w:name="request-driven-target-states"/>
     <w:p>
       <w:pPr>
         <w:pStyle w:val="Heading2"/>
@@ -19667,8 +20120,8 @@
         </w:tc>
       </w:tr>
     </w:tbl>
-    <w:bookmarkEnd w:id="66"/>
-    <w:bookmarkStart w:id="67" w:name="snoop-driven-transitions"/>
+    <w:bookmarkEnd w:id="73"/>
+    <w:bookmarkStart w:id="74" w:name="snoop-driven-transitions"/>
     <w:p>
       <w:pPr>
         <w:pStyle w:val="Heading2"/>
@@ -20229,9 +20682,9 @@
         <w:t xml:space="preserve">combinations remain the RN implementer’s responsibility.</w:t>
       </w:r>
     </w:p>
-    <w:bookmarkEnd w:id="67"/>
-    <w:bookmarkEnd w:id="68"/>
-    <w:bookmarkStart w:id="69" w:name="clocking-reset-cdc-and-performance"/>
+    <w:bookmarkEnd w:id="74"/>
+    <w:bookmarkEnd w:id="75"/>
+    <w:bookmarkStart w:id="76" w:name="clocking-reset-cdc-and-performance"/>
     <w:p>
       <w:pPr>
         <w:pStyle w:val="Heading1"/>
@@ -20533,8 +20986,8 @@
         <w:t xml:space="preserve">or performance guarantees are supplied.</w:t>
       </w:r>
     </w:p>
-    <w:bookmarkEnd w:id="69"/>
-    <w:bookmarkStart w:id="79" w:name="verification-source-manifest-and-lint"/>
+    <w:bookmarkEnd w:id="76"/>
+    <w:bookmarkStart w:id="86" w:name="verification-source-manifest-and-lint"/>
     <w:p>
       <w:pPr>
         <w:pStyle w:val="Heading1"/>
@@ -20543,7 +20996,7 @@
         <w:t xml:space="preserve">12 Verification, source manifest and lint</w:t>
       </w:r>
     </w:p>
-    <w:bookmarkStart w:id="70" w:name="bound-sva-inventory"/>
+    <w:bookmarkStart w:id="77" w:name="bound-sva-inventory"/>
     <w:p>
       <w:pPr>
         <w:pStyle w:val="Heading2"/>
@@ -21477,8 +21930,8 @@
         <w:t xml:space="preserve">are packed two-dimensional rather than unpacked.</w:t>
       </w:r>
     </w:p>
-    <w:bookmarkEnd w:id="70"/>
-    <w:bookmarkStart w:id="71" w:name="functional-coverage-outline"/>
+    <w:bookmarkEnd w:id="77"/>
+    <w:bookmarkStart w:id="78" w:name="functional-coverage-outline"/>
     <w:p>
       <w:pPr>
         <w:pStyle w:val="Heading2"/>
@@ -21558,8 +22011,8 @@
         <w:t xml:space="preserve">identifiers, flit parity faults and credit-contract violations.</w:t>
       </w:r>
     </w:p>
-    <w:bookmarkEnd w:id="71"/>
-    <w:bookmarkStart w:id="72" w:name="uvm-structure"/>
+    <w:bookmarkEnd w:id="78"/>
+    <w:bookmarkStart w:id="79" w:name="uvm-structure"/>
     <w:p>
       <w:pPr>
         <w:pStyle w:val="Heading2"/>
@@ -21698,8 +22151,8 @@
         <w:t xml:space="preserve">may be sent only while the link is in RUN and a credit is held.</w:t>
       </w:r>
     </w:p>
-    <w:bookmarkEnd w:id="72"/>
-    <w:bookmarkStart w:id="73" w:name="formal-friendly-properties"/>
+    <w:bookmarkEnd w:id="79"/>
+    <w:bookmarkStart w:id="80" w:name="formal-friendly-properties"/>
     <w:p>
       <w:pPr>
         <w:pStyle w:val="Heading2"/>
@@ -21770,8 +22223,8 @@
         <w:t xml:space="preserve">eventual legal response.</w:t>
       </w:r>
     </w:p>
-    <w:bookmarkEnd w:id="73"/>
-    <w:bookmarkStart w:id="74" w:name="source-manifest"/>
+    <w:bookmarkEnd w:id="80"/>
+    <w:bookmarkStart w:id="81" w:name="source-manifest"/>
     <w:p>
       <w:pPr>
         <w:pStyle w:val="Heading2"/>
@@ -22379,8 +22832,8 @@
         <w:t xml:space="preserve">smoke run and document generation.</w:t>
       </w:r>
     </w:p>
-    <w:bookmarkEnd w:id="74"/>
-    <w:bookmarkStart w:id="75" w:name="passing-lint-commands"/>
+    <w:bookmarkEnd w:id="81"/>
+    <w:bookmarkStart w:id="82" w:name="passing-lint-commands"/>
     <w:p>
       <w:pPr>
         <w:pStyle w:val="Heading2"/>
@@ -23259,8 +23712,8 @@
         <w:t xml:space="preserve">all pass with the same options.</w:t>
       </w:r>
     </w:p>
-    <w:bookmarkEnd w:id="75"/>
-    <w:bookmarkStart w:id="76" w:name="reset-link-bring-up-and-idle-smoke-run"/>
+    <w:bookmarkEnd w:id="82"/>
+    <w:bookmarkStart w:id="83" w:name="reset-link-bring-up-and-idle-smoke-run"/>
     <w:p>
       <w:pPr>
         <w:pStyle w:val="Heading2"/>
@@ -23706,8 +24159,8 @@
         <w:t xml:space="preserve">that does not exist.</w:t>
       </w:r>
     </w:p>
-    <w:bookmarkEnd w:id="76"/>
-    <w:bookmarkStart w:id="77" w:name="tool-dependence-of-this-code"/>
+    <w:bookmarkEnd w:id="83"/>
+    <w:bookmarkStart w:id="84" w:name="tool-dependence-of-this-code"/>
     <w:p>
       <w:pPr>
         <w:pStyle w:val="Heading2"/>
@@ -24051,8 +24504,8 @@
         <w:t xml:space="preserve">be expected to find defects this flow cannot see.</w:t>
       </w:r>
     </w:p>
-    <w:bookmarkEnd w:id="77"/>
-    <w:bookmarkStart w:id="78" w:name="regenerating-this-document"/>
+    <w:bookmarkEnd w:id="84"/>
+    <w:bookmarkStart w:id="85" w:name="regenerating-this-document"/>
     <w:p>
       <w:pPr>
         <w:pStyle w:val="Heading2"/>
@@ -24209,9 +24662,9 @@
         <w:t xml:space="preserve">the cross-references in the prose stay correct in every output format.</w:t>
       </w:r>
     </w:p>
-    <w:bookmarkEnd w:id="78"/>
-    <w:bookmarkEnd w:id="79"/>
-    <w:bookmarkStart w:id="82" w:name="X5bf108ade8508cab34b28d325ecb3ab81501255"/>
+    <w:bookmarkEnd w:id="85"/>
+    <w:bookmarkEnd w:id="86"/>
+    <w:bookmarkStart w:id="89" w:name="X5bf108ade8508cab34b28d325ecb3ab81501255"/>
     <w:p>
       <w:pPr>
         <w:pStyle w:val="Heading1"/>
@@ -24220,7 +24673,7 @@
         <w:t xml:space="preserve">13 Open issues, known limitations and decisions</w:t>
       </w:r>
     </w:p>
-    <w:bookmarkStart w:id="80" w:name="known-limitations"/>
+    <w:bookmarkStart w:id="87" w:name="known-limitations"/>
     <w:p>
       <w:pPr>
         <w:pStyle w:val="Heading2"/>
@@ -24478,8 +24931,8 @@
         <w:t xml:space="preserve">performance characterization.</w:t>
       </w:r>
     </w:p>
-    <w:bookmarkEnd w:id="80"/>
-    <w:bookmarkStart w:id="81" w:name="implementation-defined-decision-log"/>
+    <w:bookmarkEnd w:id="87"/>
+    <w:bookmarkStart w:id="88" w:name="implementation-defined-decision-log"/>
     <w:p>
       <w:pPr>
         <w:pStyle w:val="Heading2"/>
@@ -25359,8 +25812,8 @@
         </w:tc>
       </w:tr>
     </w:tbl>
-    <w:bookmarkEnd w:id="81"/>
-    <w:bookmarkEnd w:id="82"/>
+    <w:bookmarkEnd w:id="88"/>
+    <w:bookmarkEnd w:id="89"/>
     <w:sectPr/>
   </w:body>
 </w:document>

</xml_diff>

<commit_message>
docs: lay the Home Node figure out squarer so it is legible on the page
The diagram was twice as wide as it was tall, so fitting it to the text
column shrank the block labels to about four points. Chaining each engine
group into a column instead of spreading it across a rank, and dropping the
edge labels that the surrounding prose already states, brings it to roughly
square and the labels to about seven points.

Co-authored-by: swasthikamath <swasthikamath@gmail.com>
</commit_message>
<xml_diff>
--- a/docs/chi_interconnect_design_spec.docx
+++ b/docs/chi_interconnect_design_spec.docx
@@ -7991,7 +7991,7 @@
       <w:r>
         <w:drawing>
           <wp:inline>
-            <wp:extent cx="6235700" cy="3038407"/>
+            <wp:extent cx="6235700" cy="5971399"/>
             <wp:effectExtent b="0" l="0" r="0" t="0"/>
             <wp:docPr descr="Fig 2.2 chi_hnf_top internal structure. One request is in flight at a time." title="" id="38" name="Picture"/>
             <a:graphic>
@@ -8012,7 +8012,7 @@
                   <pic:spPr bwMode="auto">
                     <a:xfrm>
                       <a:off x="0" y="0"/>
-                      <a:ext cx="6235700" cy="3038407"/>
+                      <a:ext cx="6235700" cy="5971399"/>
                     </a:xfrm>
                     <a:prstGeom prst="rect">
                       <a:avLst/>

</xml_diff>

<commit_message>
docs: document TgtID determination and state that no traffic has been run
Chapter 6 opens with the B3.3.1 case analysis: which requests take their
target from the address mapper, which take it from the opcode, which use the
separate PrefetchTgt mapper, and which must keep the TgtID the Requester
sent. The chapter previously started at the region table, which described
how the mapper works without saying when it applies.

The limitations section now says plainly that the smoke run drives no
traffic, so every Implemented row rests on review and lint rather than on
execution, and the bound assertions cannot fire yet.

Co-authored-by: swasthikamath <swasthikamath@gmail.com>
</commit_message>
<xml_diff>
--- a/docs/chi_interconnect_design_spec.docx
+++ b/docs/chi_interconnect_design_spec.docx
@@ -2014,7 +2014,19 @@
               <w:jc w:val="left"/>
             </w:pPr>
             <w:r>
-              <w:t xml:space="preserve">Ordered region table, security rejection, XOR-fold hash and runtime update ports.</w:t>
+              <w:t xml:space="preserve">Ordered region table, security rejection, XOR-fold hash and runtime update ports. The decode result overwrites the incoming</w:t>
+            </w:r>
+            <w:r>
+              <w:t xml:space="preserve"> </w:t>
+            </w:r>
+            <w:r>
+              <w:rPr>
+                <w:rStyle w:val="VerbatimChar"/>
+              </w:rPr>
+              <w:t xml:space="preserve">TgtID</w:t>
+            </w:r>
+            <w:r>
+              <w:t xml:space="preserve">, which B3.3.1 permits. All five B3.3.1 cases are distinguished, including the two that bypass the address mapper; see Section 6.1.</w:t>
             </w:r>
           </w:p>
         </w:tc>
@@ -21148,7 +21160,7 @@
     </w:p>
     <w:bookmarkEnd w:id="62"/>
     <w:bookmarkEnd w:id="63"/>
-    <w:bookmarkStart w:id="68" w:name="system-address-map"/>
+    <w:bookmarkStart w:id="69" w:name="system-address-map"/>
     <w:p>
       <w:pPr>
         <w:pStyle w:val="Heading1"/>
@@ -21167,13 +21179,695 @@
         <w:t xml:space="preserve">SYSTEM ADDRESS MAP</w:t>
       </w:r>
     </w:p>
-    <w:bookmarkStart w:id="64" w:name="lookup-and-default-regions"/>
+    <w:bookmarkStart w:id="64" w:name="how-the-tgtid-is-determined"/>
     <w:p>
       <w:pPr>
         <w:pStyle w:val="Heading2"/>
       </w:pPr>
       <w:r>
-        <w:t xml:space="preserve">6.1 Lookup and default regions</w:t>
+        <w:t xml:space="preserve">6.1 How the TgtID is determined</w:t>
+      </w:r>
+    </w:p>
+    <w:p>
+      <w:pPr>
+        <w:pStyle w:val="FirstParagraph"/>
+      </w:pPr>
+      <w:r>
+        <w:t xml:space="preserve">B3.1 puts the SAM on the Requester side and gives it one job: determine the</w:t>
+      </w:r>
+      <w:r>
+        <w:t xml:space="preserve"> </w:t>
+      </w:r>
+      <w:r>
+        <w:rPr>
+          <w:rStyle w:val="VerbatimChar"/>
+        </w:rPr>
+        <w:t xml:space="preserve">TgtID</w:t>
+      </w:r>
+      <w:r>
+        <w:t xml:space="preserve"> </w:t>
+      </w:r>
+      <w:r>
+        <w:t xml:space="preserve">of a request. B3.3.1 then allows that logic to live either in the</w:t>
+      </w:r>
+      <w:r>
+        <w:t xml:space="preserve"> </w:t>
+      </w:r>
+      <w:r>
+        <w:t xml:space="preserve">Request Node or in the interconnect, and states that a Request Node must</w:t>
+      </w:r>
+      <w:r>
+        <w:t xml:space="preserve"> </w:t>
+      </w:r>
+      <w:r>
+        <w:t xml:space="preserve">expect the interconnect to remap the</w:t>
+      </w:r>
+      <w:r>
+        <w:t xml:space="preserve"> </w:t>
+      </w:r>
+      <w:r>
+        <w:rPr>
+          <w:rStyle w:val="VerbatimChar"/>
+        </w:rPr>
+        <w:t xml:space="preserve">TgtID</w:t>
+      </w:r>
+      <w:r>
+        <w:t xml:space="preserve"> </w:t>
+      </w:r>
+      <w:r>
+        <w:t xml:space="preserve">it sent. This design takes the</w:t>
+      </w:r>
+      <w:r>
+        <w:t xml:space="preserve"> </w:t>
+      </w:r>
+      <w:r>
+        <w:t xml:space="preserve">interconnect-side option, so</w:t>
+      </w:r>
+      <w:r>
+        <w:t xml:space="preserve"> </w:t>
+      </w:r>
+      <w:r>
+        <w:rPr>
+          <w:rStyle w:val="VerbatimChar"/>
+        </w:rPr>
+        <w:t xml:space="preserve">reqToNoc</w:t>
+      </w:r>
+      <w:r>
+        <w:t xml:space="preserve"> </w:t>
+      </w:r>
+      <w:r>
+        <w:t xml:space="preserve">in</w:t>
+      </w:r>
+      <w:r>
+        <w:t xml:space="preserve"> </w:t>
+      </w:r>
+      <w:r>
+        <w:rPr>
+          <w:rStyle w:val="VerbatimChar"/>
+        </w:rPr>
+        <w:t xml:space="preserve">chi_interconnect_top</w:t>
+      </w:r>
+      <w:r>
+        <w:t xml:space="preserve"> </w:t>
+      </w:r>
+      <w:r>
+        <w:t xml:space="preserve">overwrites</w:t>
+      </w:r>
+      <w:r>
+        <w:t xml:space="preserve"> </w:t>
+      </w:r>
+      <w:r>
+        <w:t xml:space="preserve">the incoming</w:t>
+      </w:r>
+      <w:r>
+        <w:t xml:space="preserve"> </w:t>
+      </w:r>
+      <w:r>
+        <w:rPr>
+          <w:rStyle w:val="VerbatimChar"/>
+        </w:rPr>
+        <w:t xml:space="preserve">TgtID</w:t>
+      </w:r>
+      <w:r>
+        <w:t xml:space="preserve"> </w:t>
+      </w:r>
+      <w:r>
+        <w:t xml:space="preserve">with the decode result and copies the same value into</w:t>
+      </w:r>
+      <w:r>
+        <w:t xml:space="preserve"> </w:t>
+      </w:r>
+      <w:r>
+        <w:t xml:space="preserve">the internal flit’s route target. Address decode therefore happens exactly</w:t>
+      </w:r>
+      <w:r>
+        <w:t xml:space="preserve"> </w:t>
+      </w:r>
+      <w:r>
+        <w:t xml:space="preserve">once, at the Requester port; every hop after that routes on NodeID alone.</w:t>
+      </w:r>
+    </w:p>
+    <w:p>
+      <w:pPr>
+        <w:pStyle w:val="BodyText"/>
+      </w:pPr>
+      <w:r>
+        <w:t xml:space="preserve">B3.3.1 does not send every request through the address mapper. The cases it</w:t>
+      </w:r>
+      <w:r>
+        <w:t xml:space="preserve"> </w:t>
+      </w:r>
+      <w:r>
+        <w:t xml:space="preserve">distinguishes are handled as follows.</w:t>
+      </w:r>
+    </w:p>
+    <w:tbl>
+      <w:tblPr>
+        <w:tblStyle w:val="Table"/>
+        <w:tblW w:type="pct" w:w="5000"/>
+        <w:tblLook w:firstRow="1" w:lastRow="0" w:firstColumn="0" w:lastColumn="0" w:noHBand="0" w:noVBand="0" w:val="0020"/>
+        <w:jc w:val="start"/>
+      </w:tblPr>
+      <w:tblGrid>
+        <w:gridCol w:w="2673"/>
+        <w:gridCol w:w="3168"/>
+        <w:gridCol w:w="2079"/>
+      </w:tblGrid>
+      <w:tr>
+        <w:trPr>
+          <w:tblHeader w:val="true"/>
+        </w:trPr>
+        <w:tc>
+          <w:tcPr/>
+          <w:p>
+            <w:pPr>
+              <w:pStyle w:val="Compact"/>
+              <w:jc w:val="left"/>
+            </w:pPr>
+            <w:r>
+              <w:t xml:space="preserve">Request</w:t>
+            </w:r>
+          </w:p>
+        </w:tc>
+        <w:tc>
+          <w:tcPr/>
+          <w:p>
+            <w:pPr>
+              <w:pStyle w:val="Compact"/>
+              <w:jc w:val="left"/>
+            </w:pPr>
+            <w:r>
+              <w:t xml:space="preserve">Source of</w:t>
+            </w:r>
+            <w:r>
+              <w:t xml:space="preserve"> </w:t>
+            </w:r>
+            <w:r>
+              <w:rPr>
+                <w:rStyle w:val="VerbatimChar"/>
+              </w:rPr>
+              <w:t xml:space="preserve">TgtID</w:t>
+            </w:r>
+          </w:p>
+        </w:tc>
+        <w:tc>
+          <w:tcPr/>
+          <w:p>
+            <w:pPr>
+              <w:pStyle w:val="Compact"/>
+              <w:jc w:val="left"/>
+            </w:pPr>
+            <w:r>
+              <w:t xml:space="preserve">Where</w:t>
+            </w:r>
+          </w:p>
+        </w:tc>
+      </w:tr>
+      <w:tr>
+        <w:tc>
+          <w:tcPr/>
+          <w:p>
+            <w:pPr>
+              <w:pStyle w:val="Compact"/>
+              <w:jc w:val="left"/>
+            </w:pPr>
+            <w:r>
+              <w:rPr>
+                <w:rStyle w:val="VerbatimChar"/>
+              </w:rPr>
+              <w:t xml:space="preserve">DVMOp</w:t>
+            </w:r>
+          </w:p>
+        </w:tc>
+        <w:tc>
+          <w:tcPr/>
+          <w:p>
+            <w:pPr>
+              <w:pStyle w:val="Compact"/>
+              <w:jc w:val="left"/>
+            </w:pPr>
+            <w:r>
+              <w:t xml:space="preserve">The opcode, which selects the MN</w:t>
+            </w:r>
+          </w:p>
+        </w:tc>
+        <w:tc>
+          <w:tcPr/>
+          <w:p>
+            <w:pPr>
+              <w:pStyle w:val="Compact"/>
+              <w:jc w:val="left"/>
+            </w:pPr>
+            <w:r>
+              <w:t xml:space="preserve">Route block, by opcode</w:t>
+            </w:r>
+          </w:p>
+        </w:tc>
+      </w:tr>
+      <w:tr>
+        <w:tc>
+          <w:tcPr/>
+          <w:p>
+            <w:pPr>
+              <w:pStyle w:val="Compact"/>
+              <w:jc w:val="left"/>
+            </w:pPr>
+            <w:r>
+              <w:rPr>
+                <w:rStyle w:val="VerbatimChar"/>
+              </w:rPr>
+              <w:t xml:space="preserve">PrefetchTgt</w:t>
+            </w:r>
+          </w:p>
+        </w:tc>
+        <w:tc>
+          <w:tcPr/>
+          <w:p>
+            <w:pPr>
+              <w:pStyle w:val="Compact"/>
+              <w:jc w:val="left"/>
+            </w:pPr>
+            <w:r>
+              <w:t xml:space="preserve">A separate address mapper to an SN-F</w:t>
+            </w:r>
+          </w:p>
+        </w:tc>
+        <w:tc>
+          <w:tcPr/>
+          <w:p>
+            <w:pPr>
+              <w:pStyle w:val="Compact"/>
+              <w:jc w:val="left"/>
+            </w:pPr>
+            <w:r>
+              <w:rPr>
+                <w:rStyle w:val="VerbatimChar"/>
+              </w:rPr>
+              <w:t xml:space="preserve">chi_prefetch_map</w:t>
+            </w:r>
+          </w:p>
+        </w:tc>
+      </w:tr>
+      <w:tr>
+        <w:tc>
+          <w:tcPr/>
+          <w:p>
+            <w:pPr>
+              <w:pStyle w:val="Compact"/>
+              <w:jc w:val="left"/>
+            </w:pPr>
+            <w:r>
+              <w:rPr>
+                <w:rStyle w:val="VerbatimChar"/>
+              </w:rPr>
+              <w:t xml:space="preserve">PCrdReturn</w:t>
+            </w:r>
+          </w:p>
+        </w:tc>
+        <w:tc>
+          <w:tcPr/>
+          <w:p>
+            <w:pPr>
+              <w:pStyle w:val="Compact"/>
+              <w:jc w:val="left"/>
+            </w:pPr>
+            <w:r>
+              <w:t xml:space="preserve">The</w:t>
+            </w:r>
+            <w:r>
+              <w:t xml:space="preserve"> </w:t>
+            </w:r>
+            <w:r>
+              <w:rPr>
+                <w:rStyle w:val="VerbatimChar"/>
+              </w:rPr>
+              <w:t xml:space="preserve">TgtID</w:t>
+            </w:r>
+            <w:r>
+              <w:t xml:space="preserve"> </w:t>
+            </w:r>
+            <w:r>
+              <w:t xml:space="preserve">the Requester sent, which B3.3.1 requires to match the</w:t>
+            </w:r>
+            <w:r>
+              <w:t xml:space="preserve"> </w:t>
+            </w:r>
+            <w:r>
+              <w:rPr>
+                <w:rStyle w:val="VerbatimChar"/>
+              </w:rPr>
+              <w:t xml:space="preserve">SrcID</w:t>
+            </w:r>
+            <w:r>
+              <w:t xml:space="preserve"> </w:t>
+            </w:r>
+            <w:r>
+              <w:t xml:space="preserve">of the</w:t>
+            </w:r>
+            <w:r>
+              <w:t xml:space="preserve"> </w:t>
+            </w:r>
+            <w:r>
+              <w:rPr>
+                <w:rStyle w:val="VerbatimChar"/>
+              </w:rPr>
+              <w:t xml:space="preserve">PCrdGrant</w:t>
+            </w:r>
+            <w:r>
+              <w:t xml:space="preserve"> </w:t>
+            </w:r>
+            <w:r>
+              <w:t xml:space="preserve">that supplied the credit</w:t>
+            </w:r>
+          </w:p>
+        </w:tc>
+        <w:tc>
+          <w:tcPr/>
+          <w:p>
+            <w:pPr>
+              <w:pStyle w:val="Compact"/>
+              <w:jc w:val="left"/>
+            </w:pPr>
+            <w:r>
+              <w:t xml:space="preserve">Route block, preserved</w:t>
+            </w:r>
+          </w:p>
+        </w:tc>
+      </w:tr>
+      <w:tr>
+        <w:tc>
+          <w:tcPr/>
+          <w:p>
+            <w:pPr>
+              <w:pStyle w:val="Compact"/>
+              <w:jc w:val="left"/>
+            </w:pPr>
+            <w:r>
+              <w:t xml:space="preserve">Replay on a pre-allocated credit,</w:t>
+            </w:r>
+            <w:r>
+              <w:t xml:space="preserve"> </w:t>
+            </w:r>
+            <w:r>
+              <w:rPr>
+                <w:rStyle w:val="VerbatimChar"/>
+              </w:rPr>
+              <w:t xml:space="preserve">AllowRetry == 0</w:t>
+            </w:r>
+          </w:p>
+        </w:tc>
+        <w:tc>
+          <w:tcPr/>
+          <w:p>
+            <w:pPr>
+              <w:pStyle w:val="Compact"/>
+              <w:jc w:val="left"/>
+            </w:pPr>
+            <w:r>
+              <w:t xml:space="preserve">The</w:t>
+            </w:r>
+            <w:r>
+              <w:t xml:space="preserve"> </w:t>
+            </w:r>
+            <w:r>
+              <w:rPr>
+                <w:rStyle w:val="VerbatimChar"/>
+              </w:rPr>
+              <w:t xml:space="preserve">TgtID</w:t>
+            </w:r>
+            <w:r>
+              <w:t xml:space="preserve"> </w:t>
+            </w:r>
+            <w:r>
+              <w:t xml:space="preserve">the Requester sent, which B3.3.1 requires to be the</w:t>
+            </w:r>
+            <w:r>
+              <w:t xml:space="preserve"> </w:t>
+            </w:r>
+            <w:r>
+              <w:rPr>
+                <w:rStyle w:val="VerbatimChar"/>
+              </w:rPr>
+              <w:t xml:space="preserve">SrcID</w:t>
+            </w:r>
+            <w:r>
+              <w:t xml:space="preserve"> </w:t>
+            </w:r>
+            <w:r>
+              <w:t xml:space="preserve">of the</w:t>
+            </w:r>
+            <w:r>
+              <w:t xml:space="preserve"> </w:t>
+            </w:r>
+            <w:r>
+              <w:rPr>
+                <w:rStyle w:val="VerbatimChar"/>
+              </w:rPr>
+              <w:t xml:space="preserve">RetryAck</w:t>
+            </w:r>
+            <w:r>
+              <w:t xml:space="preserve"> </w:t>
+            </w:r>
+            <w:r>
+              <w:t xml:space="preserve">or the original</w:t>
+            </w:r>
+            <w:r>
+              <w:t xml:space="preserve"> </w:t>
+            </w:r>
+            <w:r>
+              <w:rPr>
+                <w:rStyle w:val="VerbatimChar"/>
+              </w:rPr>
+              <w:t xml:space="preserve">TgtID</w:t>
+            </w:r>
+          </w:p>
+        </w:tc>
+        <w:tc>
+          <w:tcPr/>
+          <w:p>
+            <w:pPr>
+              <w:pStyle w:val="Compact"/>
+              <w:jc w:val="left"/>
+            </w:pPr>
+            <w:r>
+              <w:t xml:space="preserve">Route block, preserved</w:t>
+            </w:r>
+          </w:p>
+        </w:tc>
+      </w:tr>
+      <w:tr>
+        <w:tc>
+          <w:tcPr/>
+          <w:p>
+            <w:pPr>
+              <w:pStyle w:val="Compact"/>
+              <w:jc w:val="left"/>
+            </w:pPr>
+            <w:r>
+              <w:t xml:space="preserve">Everything else</w:t>
+            </w:r>
+          </w:p>
+        </w:tc>
+        <w:tc>
+          <w:tcPr/>
+          <w:p>
+            <w:pPr>
+              <w:pStyle w:val="Compact"/>
+              <w:jc w:val="left"/>
+            </w:pPr>
+            <w:r>
+              <w:t xml:space="preserve">The region table, and the HN-F hash for an interleaved region</w:t>
+            </w:r>
+          </w:p>
+        </w:tc>
+        <w:tc>
+          <w:tcPr/>
+          <w:p>
+            <w:pPr>
+              <w:pStyle w:val="Compact"/>
+              <w:jc w:val="left"/>
+            </w:pPr>
+            <w:r>
+              <w:rPr>
+                <w:rStyle w:val="VerbatimChar"/>
+              </w:rPr>
+              <w:t xml:space="preserve">chi_sam</w:t>
+            </w:r>
+          </w:p>
+        </w:tc>
+      </w:tr>
+    </w:tbl>
+    <w:p>
+      <w:pPr>
+        <w:pStyle w:val="TableCaption"/>
+      </w:pPr>
+      <w:r>
+        <w:t xml:space="preserve">Table 6.1 Source of the request</w:t>
+      </w:r>
+      <w:r>
+        <w:t xml:space="preserve"> </w:t>
+      </w:r>
+      <w:r>
+        <w:rPr>
+          <w:rStyle w:val="VerbatimChar"/>
+        </w:rPr>
+        <w:t xml:space="preserve">TgtID</w:t>
+      </w:r>
+      <w:r>
+        <w:t xml:space="preserve"> </w:t>
+      </w:r>
+      <w:r>
+        <w:t xml:space="preserve">for each case in B3.3.1</w:t>
+      </w:r>
+    </w:p>
+    <w:p>
+      <w:pPr>
+        <w:pStyle w:val="BodyText"/>
+      </w:pPr>
+      <w:r>
+        <w:t xml:space="preserve">The last two rows are why the route block cannot simply use the mapper</w:t>
+      </w:r>
+      <w:r>
+        <w:t xml:space="preserve"> </w:t>
+      </w:r>
+      <w:r>
+        <w:t xml:space="preserve">output. A</w:t>
+      </w:r>
+      <w:r>
+        <w:t xml:space="preserve"> </w:t>
+      </w:r>
+      <w:r>
+        <w:rPr>
+          <w:rStyle w:val="VerbatimChar"/>
+        </w:rPr>
+        <w:t xml:space="preserve">PCrdReturn</w:t>
+      </w:r>
+      <w:r>
+        <w:t xml:space="preserve"> </w:t>
+      </w:r>
+      <w:r>
+        <w:t xml:space="preserve">does not use its address field, so decoding it would</w:t>
+      </w:r>
+      <w:r>
+        <w:t xml:space="preserve"> </w:t>
+      </w:r>
+      <w:r>
+        <w:t xml:space="preserve">send the credit back to whichever Home owns the region containing address</w:t>
+      </w:r>
+      <w:r>
+        <w:t xml:space="preserve"> </w:t>
+      </w:r>
+      <w:r>
+        <w:t xml:space="preserve">zero rather than to the Home that granted it, leaking a P-Credit on every</w:t>
+      </w:r>
+      <w:r>
+        <w:t xml:space="preserve"> </w:t>
+      </w:r>
+      <w:r>
+        <w:t xml:space="preserve">return. A replay must reach the Home that issued the</w:t>
+      </w:r>
+      <w:r>
+        <w:t xml:space="preserve"> </w:t>
+      </w:r>
+      <w:r>
+        <w:rPr>
+          <w:rStyle w:val="VerbatimChar"/>
+        </w:rPr>
+        <w:t xml:space="preserve">RetryAck</w:t>
+      </w:r>
+      <w:r>
+        <w:t xml:space="preserve"> </w:t>
+      </w:r>
+      <w:r>
+        <w:t xml:space="preserve">because only</w:t>
+      </w:r>
+      <w:r>
+        <w:t xml:space="preserve"> </w:t>
+      </w:r>
+      <w:r>
+        <w:t xml:space="preserve">that Home holds the matching retry record, and a region table edited between</w:t>
+      </w:r>
+      <w:r>
+        <w:t xml:space="preserve"> </w:t>
+      </w:r>
+      <w:r>
+        <w:t xml:space="preserve">the</w:t>
+      </w:r>
+      <w:r>
+        <w:t xml:space="preserve"> </w:t>
+      </w:r>
+      <w:r>
+        <w:rPr>
+          <w:rStyle w:val="VerbatimChar"/>
+        </w:rPr>
+        <w:t xml:space="preserve">RetryAck</w:t>
+      </w:r>
+      <w:r>
+        <w:t xml:space="preserve"> </w:t>
+      </w:r>
+      <w:r>
+        <w:t xml:space="preserve">and the replay would otherwise redirect it.</w:t>
+      </w:r>
+      <w:r>
+        <w:t xml:space="preserve"> </w:t>
+      </w:r>
+      <w:r>
+        <w:rPr>
+          <w:rStyle w:val="VerbatimChar"/>
+        </w:rPr>
+        <w:t xml:space="preserve">PrefetchTgt</w:t>
+      </w:r>
+      <w:r>
+        <w:t xml:space="preserve"> </w:t>
+      </w:r>
+      <w:r>
+        <w:t xml:space="preserve">is</w:t>
+      </w:r>
+      <w:r>
+        <w:t xml:space="preserve"> </w:t>
+      </w:r>
+      <w:r>
+        <w:t xml:space="preserve">unaffected by the</w:t>
+      </w:r>
+      <w:r>
+        <w:t xml:space="preserve"> </w:t>
+      </w:r>
+      <w:r>
+        <w:rPr>
+          <w:rStyle w:val="VerbatimChar"/>
+        </w:rPr>
+        <w:t xml:space="preserve">AllowRetry</w:t>
+      </w:r>
+      <w:r>
+        <w:t xml:space="preserve"> </w:t>
+      </w:r>
+      <w:r>
+        <w:t xml:space="preserve">rule because B2.10.2.1 requires</w:t>
+      </w:r>
+      <w:r>
+        <w:t xml:space="preserve"> </w:t>
+      </w:r>
+      <w:r>
+        <w:rPr>
+          <w:rStyle w:val="VerbatimChar"/>
+        </w:rPr>
+        <w:t xml:space="preserve">AllowRetry</w:t>
+      </w:r>
+      <w:r>
+        <w:t xml:space="preserve"> </w:t>
+      </w:r>
+      <w:r>
+        <w:t xml:space="preserve">to be 1 for it.</w:t>
+      </w:r>
+    </w:p>
+    <w:bookmarkEnd w:id="64"/>
+    <w:bookmarkStart w:id="65" w:name="lookup-and-default-regions"/>
+    <w:p>
+      <w:pPr>
+        <w:pStyle w:val="Heading2"/>
+      </w:pPr>
+      <w:r>
+        <w:t xml:space="preserve">6.2 Lookup and default regions</w:t>
       </w:r>
     </w:p>
     <w:p>
@@ -21657,7 +22351,7 @@
         <w:pStyle w:val="TableCaption"/>
       </w:pPr>
       <w:r>
-        <w:t xml:space="preserve">Table 6.1 Default region table loaded at reset</w:t>
+        <w:t xml:space="preserve">Table 6.2 Default region table loaded at reset</w:t>
       </w:r>
     </w:p>
     <w:p>
@@ -21695,14 +22389,14 @@
         <w:t xml:space="preserve">.</w:t>
       </w:r>
     </w:p>
-    <w:bookmarkEnd w:id="64"/>
-    <w:bookmarkStart w:id="65" w:name="hn-hash-and-worked-example"/>
+    <w:bookmarkEnd w:id="65"/>
+    <w:bookmarkStart w:id="66" w:name="hn-hash-and-worked-example"/>
     <w:p>
       <w:pPr>
         <w:pStyle w:val="Heading2"/>
       </w:pPr>
       <w:r>
-        <w:t xml:space="preserve">6.2 HN hash and worked example</w:t>
+        <w:t xml:space="preserve">6.3 HN hash and worked example</w:t>
       </w:r>
     </w:p>
     <w:p>
@@ -21820,14 +22514,14 @@
         <w:t xml:space="preserve">).</w:t>
       </w:r>
     </w:p>
-    <w:bookmarkEnd w:id="65"/>
-    <w:bookmarkStart w:id="66" w:name="prefetchtgt-mapping"/>
+    <w:bookmarkEnd w:id="66"/>
+    <w:bookmarkStart w:id="67" w:name="prefetchtgt-mapping"/>
     <w:p>
       <w:pPr>
         <w:pStyle w:val="Heading2"/>
       </w:pPr>
       <w:r>
-        <w:t xml:space="preserve">6.3</w:t>
+        <w:t xml:space="preserve">6.4</w:t>
       </w:r>
       <w:r>
         <w:t xml:space="preserve"> </w:t>
@@ -21950,14 +22644,14 @@
         <w:t xml:space="preserve">reaches them.</w:t>
       </w:r>
     </w:p>
-    <w:bookmarkEnd w:id="66"/>
-    <w:bookmarkStart w:id="67" w:name="retargeting"/>
+    <w:bookmarkEnd w:id="67"/>
+    <w:bookmarkStart w:id="68" w:name="retargeting"/>
     <w:p>
       <w:pPr>
         <w:pStyle w:val="Heading2"/>
       </w:pPr>
       <w:r>
-        <w:t xml:space="preserve">6.4 Retargeting</w:t>
+        <w:t xml:space="preserve">6.5 Retargeting</w:t>
       </w:r>
     </w:p>
     <w:p>
@@ -22037,9 +22731,9 @@
         <w:t xml:space="preserve">existence on a runtime update.</w:t>
       </w:r>
     </w:p>
-    <w:bookmarkEnd w:id="67"/>
     <w:bookmarkEnd w:id="68"/>
-    <w:bookmarkStart w:id="71" w:name="configuration-access"/>
+    <w:bookmarkEnd w:id="69"/>
+    <w:bookmarkStart w:id="72" w:name="configuration-access"/>
     <w:p>
       <w:pPr>
         <w:pStyle w:val="Heading1"/>
@@ -22085,7 +22779,7 @@
         <w:t xml:space="preserve">.</w:t>
       </w:r>
     </w:p>
-    <w:bookmarkStart w:id="69" w:name="apb4-map"/>
+    <w:bookmarkStart w:id="70" w:name="apb4-map"/>
     <w:p>
       <w:pPr>
         <w:pStyle w:val="Heading2"/>
@@ -22889,8 +23583,8 @@
         <w:t xml:space="preserve">does nothing and does not error.</w:t>
       </w:r>
     </w:p>
-    <w:bookmarkEnd w:id="69"/>
-    <w:bookmarkStart w:id="70" w:name="chi-mmio-map-and-limitations"/>
+    <w:bookmarkEnd w:id="70"/>
+    <w:bookmarkStart w:id="71" w:name="chi-mmio-map-and-limitations"/>
     <w:p>
       <w:pPr>
         <w:pStyle w:val="Heading2"/>
@@ -23204,9 +23898,9 @@
         <w:t xml:space="preserve">path, not a hardened management interface.</w:t>
       </w:r>
     </w:p>
-    <w:bookmarkEnd w:id="70"/>
     <w:bookmarkEnd w:id="71"/>
-    <w:bookmarkStart w:id="80" w:name="transaction-flows"/>
+    <w:bookmarkEnd w:id="72"/>
+    <w:bookmarkStart w:id="81" w:name="transaction-flows"/>
     <w:p>
       <w:pPr>
         <w:pStyle w:val="Heading1"/>
@@ -23239,7 +23933,7 @@
         <w:t xml:space="preserve">table states what the RTL does.</w:t>
       </w:r>
     </w:p>
-    <w:bookmarkStart w:id="72" w:name="readshared-with-dct"/>
+    <w:bookmarkStart w:id="73" w:name="readshared-with-dct"/>
     <w:p>
       <w:pPr>
         <w:pStyle w:val="Heading2"/>
@@ -23620,8 +24314,8 @@
         <w:t xml:space="preserve">not implemented.</w:t>
       </w:r>
     </w:p>
-    <w:bookmarkEnd w:id="72"/>
-    <w:bookmarkStart w:id="73" w:name="readunique-with-dmt"/>
+    <w:bookmarkEnd w:id="73"/>
+    <w:bookmarkStart w:id="74" w:name="readunique-with-dmt"/>
     <w:p>
       <w:pPr>
         <w:pStyle w:val="Heading2"/>
@@ -24062,8 +24756,8 @@
         <w:t xml:space="preserve">same path.</w:t>
       </w:r>
     </w:p>
-    <w:bookmarkEnd w:id="73"/>
-    <w:bookmarkStart w:id="74" w:name="writebackfull-with-dwt"/>
+    <w:bookmarkEnd w:id="74"/>
+    <w:bookmarkStart w:id="75" w:name="writebackfull-with-dwt"/>
     <w:p>
       <w:pPr>
         <w:pStyle w:val="Heading2"/>
@@ -24536,8 +25230,8 @@
         <w:t xml:space="preserve">and write cancellation remain incomplete.</w:t>
       </w:r>
     </w:p>
-    <w:bookmarkEnd w:id="74"/>
-    <w:bookmarkStart w:id="75" w:name="cleanunique-with-snoops"/>
+    <w:bookmarkEnd w:id="75"/>
+    <w:bookmarkStart w:id="76" w:name="cleanunique-with-snoops"/>
     <w:p>
       <w:pPr>
         <w:pStyle w:val="Heading2"/>
@@ -24994,8 +25688,8 @@
         <w:t xml:space="preserve">selection and directory transitions are simplified.</w:t>
       </w:r>
     </w:p>
-    <w:bookmarkEnd w:id="75"/>
-    <w:bookmarkStart w:id="76" w:name="atomicload"/>
+    <w:bookmarkEnd w:id="76"/>
+    <w:bookmarkStart w:id="77" w:name="atomicload"/>
     <w:p>
       <w:pPr>
         <w:pStyle w:val="Heading2"/>
@@ -25664,8 +26358,8 @@
         <w:t xml:space="preserve">performed at the Home; there is no far-atomic negotiation.</w:t>
       </w:r>
     </w:p>
-    <w:bookmarkEnd w:id="76"/>
-    <w:bookmarkStart w:id="77" w:name="request-retry"/>
+    <w:bookmarkEnd w:id="77"/>
+    <w:bookmarkStart w:id="78" w:name="request-retry"/>
     <w:p>
       <w:pPr>
         <w:pStyle w:val="Heading2"/>
@@ -26229,8 +26923,8 @@
         <w:t xml:space="preserve">the credit accounting exact.</w:t>
       </w:r>
     </w:p>
-    <w:bookmarkEnd w:id="77"/>
-    <w:bookmarkStart w:id="78" w:name="writeuniquefullstash-with-data-pull"/>
+    <w:bookmarkEnd w:id="78"/>
+    <w:bookmarkStart w:id="79" w:name="writeuniquefullstash-with-data-pull"/>
     <w:p>
       <w:pPr>
         <w:pStyle w:val="Heading2"/>
@@ -27042,8 +27736,8 @@
         <w:t xml:space="preserve">.</w:t>
       </w:r>
     </w:p>
-    <w:bookmarkEnd w:id="78"/>
-    <w:bookmarkStart w:id="79" w:name="dvm-sync"/>
+    <w:bookmarkEnd w:id="79"/>
+    <w:bookmarkStart w:id="80" w:name="dvm-sync"/>
     <w:p>
       <w:pPr>
         <w:pStyle w:val="Heading2"/>
@@ -27465,9 +28159,9 @@
         <w:t xml:space="preserve">applied.</w:t>
       </w:r>
     </w:p>
-    <w:bookmarkEnd w:id="79"/>
     <w:bookmarkEnd w:id="80"/>
-    <w:bookmarkStart w:id="85" w:name="home-node-internals"/>
+    <w:bookmarkEnd w:id="81"/>
+    <w:bookmarkStart w:id="86" w:name="home-node-internals"/>
     <w:p>
       <w:pPr>
         <w:pStyle w:val="Heading1"/>
@@ -27486,7 +28180,7 @@
         <w:t xml:space="preserve">HOME NODE INTERNALS</w:t>
       </w:r>
     </w:p>
-    <w:bookmarkStart w:id="81" w:name="serialization"/>
+    <w:bookmarkStart w:id="82" w:name="serialization"/>
     <w:p>
       <w:pPr>
         <w:pStyle w:val="Heading2"/>
@@ -27723,8 +28417,8 @@
         <w:t xml:space="preserve">and discarded without allocating a POS entry.</w:t>
       </w:r>
     </w:p>
-    <w:bookmarkEnd w:id="81"/>
-    <w:bookmarkStart w:id="82" w:name="directory"/>
+    <w:bookmarkEnd w:id="82"/>
+    <w:bookmarkStart w:id="83" w:name="directory"/>
     <w:p>
       <w:pPr>
         <w:pStyle w:val="Heading2"/>
@@ -27777,8 +28471,8 @@
         <w:t xml:space="preserve">is not the complete Issue H state machine.</w:t>
       </w:r>
     </w:p>
-    <w:bookmarkEnd w:id="82"/>
-    <w:bookmarkStart w:id="83" w:name="retry-credits"/>
+    <w:bookmarkEnd w:id="83"/>
+    <w:bookmarkStart w:id="84" w:name="retry-credits"/>
     <w:p>
       <w:pPr>
         <w:pStyle w:val="Heading2"/>
@@ -27936,8 +28630,8 @@
         <w:t xml:space="preserve">.</w:t>
       </w:r>
     </w:p>
-    <w:bookmarkEnd w:id="83"/>
-    <w:bookmarkStart w:id="84" w:name="ordering"/>
+    <w:bookmarkEnd w:id="84"/>
+    <w:bookmarkStart w:id="85" w:name="ordering"/>
     <w:p>
       <w:pPr>
         <w:pStyle w:val="Heading2"/>
@@ -27996,9 +28690,9 @@
         <w:t xml:space="preserve">not distinguished, so the implementation is stricter than Issue H requires.</w:t>
       </w:r>
     </w:p>
-    <w:bookmarkEnd w:id="84"/>
     <w:bookmarkEnd w:id="85"/>
-    <w:bookmarkStart w:id="88" w:name="rn-f-boundary-cache-state-model"/>
+    <w:bookmarkEnd w:id="86"/>
+    <w:bookmarkStart w:id="89" w:name="rn-f-boundary-cache-state-model"/>
     <w:p>
       <w:pPr>
         <w:pStyle w:val="Heading1"/>
@@ -28064,7 +28758,7 @@
         <w:t xml:space="preserve">repository.</w:t>
       </w:r>
     </w:p>
-    <w:bookmarkStart w:id="86" w:name="request-driven-target-states"/>
+    <w:bookmarkStart w:id="87" w:name="request-driven-target-states"/>
     <w:p>
       <w:pPr>
         <w:pStyle w:val="Heading2"/>
@@ -28608,8 +29302,8 @@
         <w:t xml:space="preserve">Table 10.1 Required RN-F target state for each request</w:t>
       </w:r>
     </w:p>
-    <w:bookmarkEnd w:id="86"/>
-    <w:bookmarkStart w:id="87" w:name="snoop-driven-transitions"/>
+    <w:bookmarkEnd w:id="87"/>
+    <w:bookmarkStart w:id="88" w:name="snoop-driven-transitions"/>
     <w:p>
       <w:pPr>
         <w:pStyle w:val="Heading2"/>
@@ -29178,9 +29872,9 @@
         <w:t xml:space="preserve">combinations remain the RN implementer’s responsibility.</w:t>
       </w:r>
     </w:p>
-    <w:bookmarkEnd w:id="87"/>
     <w:bookmarkEnd w:id="88"/>
-    <w:bookmarkStart w:id="89" w:name="clocking-reset-cdc-and-performance"/>
+    <w:bookmarkEnd w:id="89"/>
+    <w:bookmarkStart w:id="90" w:name="clocking-reset-cdc-and-performance"/>
     <w:p>
       <w:pPr>
         <w:pStyle w:val="Heading1"/>
@@ -29492,8 +30186,8 @@
         <w:t xml:space="preserve">or performance guarantees are supplied.</w:t>
       </w:r>
     </w:p>
-    <w:bookmarkEnd w:id="89"/>
-    <w:bookmarkStart w:id="99" w:name="verification-source-manifest-and-lint"/>
+    <w:bookmarkEnd w:id="90"/>
+    <w:bookmarkStart w:id="100" w:name="verification-source-manifest-and-lint"/>
     <w:p>
       <w:pPr>
         <w:pStyle w:val="Heading1"/>
@@ -29512,7 +30206,7 @@
         <w:t xml:space="preserve">VERIFICATION, SOURCE MANIFEST AND LINT</w:t>
       </w:r>
     </w:p>
-    <w:bookmarkStart w:id="90" w:name="bound-sva-inventory"/>
+    <w:bookmarkStart w:id="91" w:name="bound-sva-inventory"/>
     <w:p>
       <w:pPr>
         <w:pStyle w:val="Heading2"/>
@@ -30454,8 +31148,8 @@
         <w:t xml:space="preserve">are packed two-dimensional rather than unpacked.</w:t>
       </w:r>
     </w:p>
-    <w:bookmarkEnd w:id="90"/>
-    <w:bookmarkStart w:id="91" w:name="functional-coverage-outline"/>
+    <w:bookmarkEnd w:id="91"/>
+    <w:bookmarkStart w:id="92" w:name="functional-coverage-outline"/>
     <w:p>
       <w:pPr>
         <w:pStyle w:val="Heading2"/>
@@ -30535,8 +31229,8 @@
         <w:t xml:space="preserve">identifiers, flit parity faults and credit-contract violations.</w:t>
       </w:r>
     </w:p>
-    <w:bookmarkEnd w:id="91"/>
-    <w:bookmarkStart w:id="92" w:name="uvm-structure"/>
+    <w:bookmarkEnd w:id="92"/>
+    <w:bookmarkStart w:id="93" w:name="uvm-structure"/>
     <w:p>
       <w:pPr>
         <w:pStyle w:val="Heading2"/>
@@ -30675,8 +31369,8 @@
         <w:t xml:space="preserve">may be sent only while the link is in RUN and a credit is held.</w:t>
       </w:r>
     </w:p>
-    <w:bookmarkEnd w:id="92"/>
-    <w:bookmarkStart w:id="93" w:name="formal-friendly-properties"/>
+    <w:bookmarkEnd w:id="93"/>
+    <w:bookmarkStart w:id="94" w:name="formal-friendly-properties"/>
     <w:p>
       <w:pPr>
         <w:pStyle w:val="Heading2"/>
@@ -30747,8 +31441,8 @@
         <w:t xml:space="preserve">eventual legal response.</w:t>
       </w:r>
     </w:p>
-    <w:bookmarkEnd w:id="93"/>
-    <w:bookmarkStart w:id="94" w:name="source-manifest"/>
+    <w:bookmarkEnd w:id="94"/>
+    <w:bookmarkStart w:id="95" w:name="source-manifest"/>
     <w:p>
       <w:pPr>
         <w:pStyle w:val="Heading2"/>
@@ -31356,8 +32050,8 @@
         <w:t xml:space="preserve">smoke run and document generation.</w:t>
       </w:r>
     </w:p>
-    <w:bookmarkEnd w:id="94"/>
-    <w:bookmarkStart w:id="95" w:name="passing-lint-commands"/>
+    <w:bookmarkEnd w:id="95"/>
+    <w:bookmarkStart w:id="96" w:name="passing-lint-commands"/>
     <w:p>
       <w:pPr>
         <w:pStyle w:val="Heading2"/>
@@ -32236,8 +32930,8 @@
         <w:t xml:space="preserve">all pass with the same options.</w:t>
       </w:r>
     </w:p>
-    <w:bookmarkEnd w:id="95"/>
-    <w:bookmarkStart w:id="96" w:name="reset-link-bring-up-and-idle-smoke-run"/>
+    <w:bookmarkEnd w:id="96"/>
+    <w:bookmarkStart w:id="97" w:name="reset-link-bring-up-and-idle-smoke-run"/>
     <w:p>
       <w:pPr>
         <w:pStyle w:val="Heading2"/>
@@ -32683,8 +33377,8 @@
         <w:t xml:space="preserve">that does not exist.</w:t>
       </w:r>
     </w:p>
-    <w:bookmarkEnd w:id="96"/>
-    <w:bookmarkStart w:id="97" w:name="tool-dependence-of-this-code"/>
+    <w:bookmarkEnd w:id="97"/>
+    <w:bookmarkStart w:id="98" w:name="tool-dependence-of-this-code"/>
     <w:p>
       <w:pPr>
         <w:pStyle w:val="Heading2"/>
@@ -33028,8 +33722,8 @@
         <w:t xml:space="preserve">be expected to find defects this flow cannot see.</w:t>
       </w:r>
     </w:p>
-    <w:bookmarkEnd w:id="97"/>
-    <w:bookmarkStart w:id="98" w:name="regenerating-this-document"/>
+    <w:bookmarkEnd w:id="98"/>
+    <w:bookmarkStart w:id="99" w:name="regenerating-this-document"/>
     <w:p>
       <w:pPr>
         <w:pStyle w:val="Heading2"/>
@@ -33186,9 +33880,9 @@
         <w:t xml:space="preserve">the cross-references in the prose stay correct in every output format.</w:t>
       </w:r>
     </w:p>
-    <w:bookmarkEnd w:id="98"/>
     <w:bookmarkEnd w:id="99"/>
-    <w:bookmarkStart w:id="102" w:name="X5bf108ade8508cab34b28d325ecb3ab81501255"/>
+    <w:bookmarkEnd w:id="100"/>
+    <w:bookmarkStart w:id="103" w:name="X5bf108ade8508cab34b28d325ecb3ab81501255"/>
     <w:p>
       <w:pPr>
         <w:pStyle w:val="Heading1"/>
@@ -33207,7 +33901,7 @@
         <w:t xml:space="preserve">OPEN ISSUES, KNOWN LIMITATIONS AND DECISIONS</w:t>
       </w:r>
     </w:p>
-    <w:bookmarkStart w:id="100" w:name="known-limitations"/>
+    <w:bookmarkStart w:id="101" w:name="known-limitations"/>
     <w:p>
       <w:pPr>
         <w:pStyle w:val="Heading2"/>
@@ -33462,11 +34156,35 @@
         <w:t xml:space="preserve"> </w:t>
       </w:r>
       <w:r>
-        <w:t xml:space="preserve">performance characterization.</w:t>
+        <w:t xml:space="preserve">performance characterization. The smoke run in Section 12.7 drives no</w:t>
+      </w:r>
+      <w:r>
+        <w:t xml:space="preserve"> </w:t>
+      </w:r>
+      <w:r>
+        <w:t xml:space="preserve">traffic at all: it brings the links up and then asserts that no flit is</w:t>
+      </w:r>
+      <w:r>
+        <w:t xml:space="preserve"> </w:t>
+      </w:r>
+      <w:r>
+        <w:t xml:space="preserve">delivered. So every row this document marks Implemented rests on reading</w:t>
+      </w:r>
+      <w:r>
+        <w:t xml:space="preserve"> </w:t>
+      </w:r>
+      <w:r>
+        <w:t xml:space="preserve">the source and on lint, not on having been executed, and the bound SVA</w:t>
+      </w:r>
+      <w:r>
+        <w:t xml:space="preserve"> </w:t>
+      </w:r>
+      <w:r>
+        <w:t xml:space="preserve">cannot fire until something drives the design.</w:t>
       </w:r>
     </w:p>
-    <w:bookmarkEnd w:id="100"/>
-    <w:bookmarkStart w:id="101" w:name="implementation-defined-decision-log"/>
+    <w:bookmarkEnd w:id="101"/>
+    <w:bookmarkStart w:id="102" w:name="implementation-defined-decision-log"/>
     <w:p>
       <w:pPr>
         <w:pStyle w:val="Heading2"/>
@@ -34354,8 +35072,8 @@
         <w:t xml:space="preserve">Table 13.1 Implementation-defined decisions and their consequences</w:t>
       </w:r>
     </w:p>
-    <w:bookmarkEnd w:id="101"/>
     <w:bookmarkEnd w:id="102"/>
+    <w:bookmarkEnd w:id="103"/>
     <w:sectPr>
       <w:footerReference r:id="rId9" w:type="default"/>
       <w:pgSz w:h="16838" w:w="11906"/>

</xml_diff>

<commit_message>
docs: record the data-message boundary rule, the LCrdReturn exchange and the P-Credit reservation gap
Co-authored-by: swasthikamath <swasthikamath@gmail.com>
</commit_message>
<xml_diff>
--- a/docs/chi_interconnect_design_spec.docx
+++ b/docs/chi_interconnect_design_spec.docx
@@ -1210,7 +1210,61 @@
               <w:t xml:space="preserve"> </w:t>
             </w:r>
             <w:r>
-              <w:t xml:space="preserve">implement finite credit accounting, receive buffering and credit return.</w:t>
+              <w:t xml:space="preserve">implement finite credit accounting, receive buffering, and the</w:t>
+            </w:r>
+            <w:r>
+              <w:t xml:space="preserve"> </w:t>
+            </w:r>
+            <w:r>
+              <w:rPr>
+                <w:rStyle w:val="VerbatimChar"/>
+              </w:rPr>
+              <w:t xml:space="preserve">LCrdReturn</w:t>
+            </w:r>
+            <w:r>
+              <w:t xml:space="preserve"> </w:t>
+            </w:r>
+            <w:r>
+              <w:t xml:space="preserve">exchange in both directions: the transmitter spends its remaining credits on</w:t>
+            </w:r>
+            <w:r>
+              <w:t xml:space="preserve"> </w:t>
+            </w:r>
+            <w:r>
+              <w:rPr>
+                <w:rStyle w:val="VerbatimChar"/>
+              </w:rPr>
+              <w:t xml:space="preserve">LCrdReturn</w:t>
+            </w:r>
+            <w:r>
+              <w:t xml:space="preserve"> </w:t>
+            </w:r>
+            <w:r>
+              <w:t xml:space="preserve">flits when it deactivates, and the receiver recognises a zero</w:t>
+            </w:r>
+            <w:r>
+              <w:t xml:space="preserve"> </w:t>
+            </w:r>
+            <w:r>
+              <w:rPr>
+                <w:rStyle w:val="VerbatimChar"/>
+              </w:rPr>
+              <w:t xml:space="preserve">Opcode</w:t>
+            </w:r>
+            <w:r>
+              <w:t xml:space="preserve">, extinguishes the credit and waits for all of them before it releases</w:t>
+            </w:r>
+            <w:r>
+              <w:t xml:space="preserve"> </w:t>
+            </w:r>
+            <w:r>
+              <w:rPr>
+                <w:rStyle w:val="VerbatimChar"/>
+              </w:rPr>
+              <w:t xml:space="preserve">LINKACTIVEACK</w:t>
+            </w:r>
+            <w:r>
+              <w:t xml:space="preserve">.</w:t>
             </w:r>
           </w:p>
         </w:tc>
@@ -6456,6 +6510,188 @@
         <w:t xml:space="preserve">type.</w:t>
       </w:r>
     </w:p>
+    <w:p>
+      <w:pPr>
+        <w:pStyle w:val="BodyText"/>
+      </w:pPr>
+      <w:r>
+        <w:t xml:space="preserve">One property of the DAT channel is worth stating here because every consumer</w:t>
+      </w:r>
+      <w:r>
+        <w:t xml:space="preserve"> </w:t>
+      </w:r>
+      <w:r>
+        <w:t xml:space="preserve">of data in the design depends on it. A data message is not one flit. B2.4.6</w:t>
+      </w:r>
+      <w:r>
+        <w:t xml:space="preserve"> </w:t>
+      </w:r>
+      <w:r>
+        <w:t xml:space="preserve">makes</w:t>
+      </w:r>
+      <w:r>
+        <w:t xml:space="preserve"> </w:t>
+      </w:r>
+      <w:r>
+        <w:rPr>
+          <w:rStyle w:val="VerbatimChar"/>
+        </w:rPr>
+        <w:t xml:space="preserve">DataID</w:t>
+      </w:r>
+      <w:r>
+        <w:t xml:space="preserve"> </w:t>
+      </w:r>
+      <w:r>
+        <w:t xml:space="preserve">a count of 16-byte granules within the 64-byte line, so a</w:t>
+      </w:r>
+      <w:r>
+        <w:t xml:space="preserve"> </w:t>
+      </w:r>
+      <w:r>
+        <w:t xml:space="preserve">message of</w:t>
+      </w:r>
+      <w:r>
+        <w:t xml:space="preserve"> </w:t>
+      </w:r>
+      <w:r>
+        <w:rPr>
+          <w:rStyle w:val="VerbatimChar"/>
+        </w:rPr>
+        <w:t xml:space="preserve">Size</w:t>
+      </w:r>
+      <w:r>
+        <w:t xml:space="preserve"> </w:t>
+      </w:r>
+      <w:r>
+        <w:t xml:space="preserve">bytes occupies as many packets as the data bus needs to</w:t>
+      </w:r>
+      <w:r>
+        <w:t xml:space="preserve"> </w:t>
+      </w:r>
+      <w:r>
+        <w:t xml:space="preserve">carry them: one packet on a 512-bit bus, two on the default 256-bit bus, four</w:t>
+      </w:r>
+      <w:r>
+        <w:t xml:space="preserve"> </w:t>
+      </w:r>
+      <w:r>
+        <w:t xml:space="preserve">on a 128-bit bus.</w:t>
+      </w:r>
+      <w:r>
+        <w:t xml:space="preserve"> </w:t>
+      </w:r>
+      <w:r>
+        <w:rPr>
+          <w:rStyle w:val="VerbatimChar"/>
+        </w:rPr>
+        <w:t xml:space="preserve">NumDat</w:t>
+      </w:r>
+      <w:r>
+        <w:t xml:space="preserve"> </w:t>
+      </w:r>
+      <w:r>
+        <w:t xml:space="preserve">is unrelated to that count. It belongs to Limited</w:t>
+      </w:r>
+      <w:r>
+        <w:t xml:space="preserve"> </w:t>
+      </w:r>
+      <w:r>
+        <w:t xml:space="preserve">Data Elision (B2.9.5) and says how many packets behind this one have been</w:t>
+      </w:r>
+      <w:r>
+        <w:t xml:space="preserve"> </w:t>
+      </w:r>
+      <w:r>
+        <w:t xml:space="preserve">elided. Recognising the end of a message therefore needs the transaction as</w:t>
+      </w:r>
+      <w:r>
+        <w:t xml:space="preserve"> </w:t>
+      </w:r>
+      <w:r>
+        <w:t xml:space="preserve">well as the packet, which is what</w:t>
+      </w:r>
+      <w:r>
+        <w:t xml:space="preserve"> </w:t>
+      </w:r>
+      <w:r>
+        <w:rPr>
+          <w:rStyle w:val="VerbatimChar"/>
+        </w:rPr>
+        <w:t xml:space="preserve">datLastPacket</w:t>
+      </w:r>
+      <w:r>
+        <w:t xml:space="preserve"> </w:t>
+      </w:r>
+      <w:r>
+        <w:t xml:space="preserve">in</w:t>
+      </w:r>
+      <w:r>
+        <w:t xml:space="preserve"> </w:t>
+      </w:r>
+      <w:r>
+        <w:rPr>
+          <w:rStyle w:val="VerbatimChar"/>
+        </w:rPr>
+        <w:t xml:space="preserve">chi_pkg</w:t>
+      </w:r>
+      <w:r>
+        <w:t xml:space="preserve"> </w:t>
+      </w:r>
+      <w:r>
+        <w:t xml:space="preserve">takes: the</w:t>
+      </w:r>
+      <w:r>
+        <w:t xml:space="preserve"> </w:t>
+      </w:r>
+      <w:r>
+        <w:rPr>
+          <w:rStyle w:val="VerbatimChar"/>
+        </w:rPr>
+        <w:t xml:space="preserve">DataID</w:t>
+      </w:r>
+      <w:r>
+        <w:t xml:space="preserve"> </w:t>
+      </w:r>
+      <w:r>
+        <w:t xml:space="preserve">and</w:t>
+      </w:r>
+      <w:r>
+        <w:t xml:space="preserve"> </w:t>
+      </w:r>
+      <w:r>
+        <w:rPr>
+          <w:rStyle w:val="VerbatimChar"/>
+        </w:rPr>
+        <w:t xml:space="preserve">NumDat</w:t>
+      </w:r>
+      <w:r>
+        <w:t xml:space="preserve"> </w:t>
+      </w:r>
+      <w:r>
+        <w:t xml:space="preserve">of the packet in hand, plus the address and</w:t>
+      </w:r>
+      <w:r>
+        <w:t xml:space="preserve"> </w:t>
+      </w:r>
+      <w:r>
+        <w:rPr>
+          <w:rStyle w:val="VerbatimChar"/>
+        </w:rPr>
+        <w:t xml:space="preserve">Size</w:t>
+      </w:r>
+      <w:r>
+        <w:t xml:space="preserve"> </w:t>
+      </w:r>
+      <w:r>
+        <w:t xml:space="preserve">of</w:t>
+      </w:r>
+      <w:r>
+        <w:t xml:space="preserve"> </w:t>
+      </w:r>
+      <w:r>
+        <w:t xml:space="preserve">the request it answers.</w:t>
+      </w:r>
+    </w:p>
     <w:bookmarkEnd w:id="31"/>
     <w:bookmarkStart w:id="36" w:name="the-four-layers"/>
     <w:p>
@@ -7152,6 +7388,254 @@
     <w:p>
       <w:pPr>
         <w:pStyle w:val="FirstParagraph"/>
+      </w:pPr>
+      <w:r>
+        <w:t xml:space="preserve">Credits are borrowed, not given, and that is what makes deactivation more than</w:t>
+      </w:r>
+      <w:r>
+        <w:t xml:space="preserve"> </w:t>
+      </w:r>
+      <w:r>
+        <w:t xml:space="preserve">a handshake. B14.6.3.2 requires a link to stay in DEACTIVATE until every</w:t>
+      </w:r>
+      <w:r>
+        <w:t xml:space="preserve"> </w:t>
+      </w:r>
+      <w:r>
+        <w:t xml:space="preserve">credit has come back, and B13.11 gives the transmitter the means to send them</w:t>
+      </w:r>
+      <w:r>
+        <w:t xml:space="preserve"> </w:t>
+      </w:r>
+      <w:r>
+        <w:t xml:space="preserve">back:</w:t>
+      </w:r>
+      <w:r>
+        <w:t xml:space="preserve"> </w:t>
+      </w:r>
+      <w:r>
+        <w:rPr>
+          <w:rStyle w:val="VerbatimChar"/>
+        </w:rPr>
+        <w:t xml:space="preserve">LCrdReturn</w:t>
+      </w:r>
+      <w:r>
+        <w:t xml:space="preserve">, a flit whose</w:t>
+      </w:r>
+      <w:r>
+        <w:t xml:space="preserve"> </w:t>
+      </w:r>
+      <w:r>
+        <w:rPr>
+          <w:rStyle w:val="VerbatimChar"/>
+        </w:rPr>
+        <w:t xml:space="preserve">Opcode</w:t>
+      </w:r>
+      <w:r>
+        <w:t xml:space="preserve"> </w:t>
+      </w:r>
+      <w:r>
+        <w:t xml:space="preserve">is zero and whose other fields are</w:t>
+      </w:r>
+      <w:r>
+        <w:t xml:space="preserve"> </w:t>
+      </w:r>
+      <w:r>
+        <w:t xml:space="preserve">unused. So</w:t>
+      </w:r>
+      <w:r>
+        <w:t xml:space="preserve"> </w:t>
+      </w:r>
+      <w:r>
+        <w:rPr>
+          <w:rStyle w:val="VerbatimChar"/>
+        </w:rPr>
+        <w:t xml:space="preserve">chi_link_tx</w:t>
+      </w:r>
+      <w:r>
+        <w:t xml:space="preserve"> </w:t>
+      </w:r>
+      <w:r>
+        <w:t xml:space="preserve">spends its remaining credits on</w:t>
+      </w:r>
+      <w:r>
+        <w:t xml:space="preserve"> </w:t>
+      </w:r>
+      <w:r>
+        <w:rPr>
+          <w:rStyle w:val="VerbatimChar"/>
+        </w:rPr>
+        <w:t xml:space="preserve">LCrdReturn</w:t>
+      </w:r>
+      <w:r>
+        <w:t xml:space="preserve"> </w:t>
+      </w:r>
+      <w:r>
+        <w:t xml:space="preserve">flits</w:t>
+      </w:r>
+      <w:r>
+        <w:t xml:space="preserve"> </w:t>
+      </w:r>
+      <w:r>
+        <w:t xml:space="preserve">once it enters DEACTIVATE and only then drops</w:t>
+      </w:r>
+      <w:r>
+        <w:t xml:space="preserve"> </w:t>
+      </w:r>
+      <w:r>
+        <w:rPr>
+          <w:rStyle w:val="VerbatimChar"/>
+        </w:rPr>
+        <w:t xml:space="preserve">LINKACTIVEREQ</w:t>
+      </w:r>
+      <w:r>
+        <w:t xml:space="preserve">, while</w:t>
+      </w:r>
+      <w:r>
+        <w:t xml:space="preserve"> </w:t>
+      </w:r>
+      <w:r>
+        <w:rPr>
+          <w:rStyle w:val="VerbatimChar"/>
+        </w:rPr>
+        <w:t xml:space="preserve">chi_link_rx</w:t>
+      </w:r>
+      <w:r>
+        <w:t xml:space="preserve"> </w:t>
+      </w:r>
+      <w:r>
+        <w:t xml:space="preserve">recognises a zero</w:t>
+      </w:r>
+      <w:r>
+        <w:t xml:space="preserve"> </w:t>
+      </w:r>
+      <w:r>
+        <w:rPr>
+          <w:rStyle w:val="VerbatimChar"/>
+        </w:rPr>
+        <w:t xml:space="preserve">Opcode</w:t>
+      </w:r>
+      <w:r>
+        <w:t xml:space="preserve">, extinguishes the credit rather than</w:t>
+      </w:r>
+      <w:r>
+        <w:t xml:space="preserve"> </w:t>
+      </w:r>
+      <w:r>
+        <w:t xml:space="preserve">replacing it, and keeps</w:t>
+      </w:r>
+      <w:r>
+        <w:t xml:space="preserve"> </w:t>
+      </w:r>
+      <w:r>
+        <w:rPr>
+          <w:rStyle w:val="VerbatimChar"/>
+        </w:rPr>
+        <w:t xml:space="preserve">LINKACTIVEACK</w:t>
+      </w:r>
+      <w:r>
+        <w:t xml:space="preserve"> </w:t>
+      </w:r>
+      <w:r>
+        <w:t xml:space="preserve">asserted until its count of credits</w:t>
+      </w:r>
+      <w:r>
+        <w:t xml:space="preserve"> </w:t>
+      </w:r>
+      <w:r>
+        <w:t xml:space="preserve">held by the peer reaches zero. A receiver also has to keep accepting flits in</w:t>
+      </w:r>
+      <w:r>
+        <w:t xml:space="preserve"> </w:t>
+      </w:r>
+      <w:r>
+        <w:t xml:space="preserve">DEACTIVATE, both for these returns and for a protocol flit that raced the</w:t>
+      </w:r>
+      <w:r>
+        <w:t xml:space="preserve"> </w:t>
+      </w:r>
+      <w:r>
+        <w:t xml:space="preserve">deassertion of</w:t>
+      </w:r>
+      <w:r>
+        <w:t xml:space="preserve"> </w:t>
+      </w:r>
+      <w:r>
+        <w:rPr>
+          <w:rStyle w:val="VerbatimChar"/>
+        </w:rPr>
+        <w:t xml:space="preserve">LINKACTIVEREQ</w:t>
+      </w:r>
+      <w:r>
+        <w:t xml:space="preserve">. Because the</w:t>
+      </w:r>
+      <w:r>
+        <w:t xml:space="preserve"> </w:t>
+      </w:r>
+      <w:r>
+        <w:rPr>
+          <w:rStyle w:val="VerbatimChar"/>
+        </w:rPr>
+        <w:t xml:space="preserve">Opcode</w:t>
+      </w:r>
+      <w:r>
+        <w:t xml:space="preserve"> </w:t>
+      </w:r>
+      <w:r>
+        <w:t xml:space="preserve">field sits at a different</w:t>
+      </w:r>
+      <w:r>
+        <w:t xml:space="preserve"> </w:t>
+      </w:r>
+      <w:r>
+        <w:t xml:space="preserve">offset in each channel’s flit, each</w:t>
+      </w:r>
+      <w:r>
+        <w:t xml:space="preserve"> </w:t>
+      </w:r>
+      <w:r>
+        <w:rPr>
+          <w:rStyle w:val="VerbatimChar"/>
+        </w:rPr>
+        <w:t xml:space="preserve">chi_link_rx</w:t>
+      </w:r>
+      <w:r>
+        <w:t xml:space="preserve"> </w:t>
+      </w:r>
+      <w:r>
+        <w:t xml:space="preserve">instance is given a mask of</w:t>
+      </w:r>
+      <w:r>
+        <w:t xml:space="preserve"> </w:t>
+      </w:r>
+      <w:r>
+        <w:t xml:space="preserve">that field, derived in</w:t>
+      </w:r>
+      <w:r>
+        <w:t xml:space="preserve"> </w:t>
+      </w:r>
+      <w:r>
+        <w:rPr>
+          <w:rStyle w:val="VerbatimChar"/>
+        </w:rPr>
+        <w:t xml:space="preserve">chi_pkg</w:t>
+      </w:r>
+      <w:r>
+        <w:t xml:space="preserve"> </w:t>
+      </w:r>
+      <w:r>
+        <w:t xml:space="preserve">from the matching pack function so it cannot</w:t>
+      </w:r>
+      <w:r>
+        <w:t xml:space="preserve"> </w:t>
+      </w:r>
+      <w:r>
+        <w:t xml:space="preserve">drift away from the layout.</w:t>
+      </w:r>
+    </w:p>
+    <w:p>
+      <w:pPr>
+        <w:pStyle w:val="BodyText"/>
       </w:pPr>
       <w:r>
         <w:t xml:space="preserve">Two consequences of this structure show up elsewhere in the document. First,</w:t>
@@ -20413,19 +20897,34 @@
         <w:t xml:space="preserve"> </w:t>
       </w:r>
       <w:r>
-        <w:t xml:space="preserve">holding at least one credit. Deactivation waits until the channel’s credits</w:t>
-      </w:r>
-      <w:r>
-        <w:t xml:space="preserve"> </w:t>
-      </w:r>
-      <w:r>
-        <w:t xml:space="preserve">are quiescent, which is why the port ORs the per-channel activation signals:</w:t>
-      </w:r>
-      <w:r>
-        <w:t xml:space="preserve"> </w:t>
-      </w:r>
-      <w:r>
-        <w:t xml:space="preserve">the OR holds the handshake asserted until the last channel has drained.</w:t>
+        <w:t xml:space="preserve">holding at least one credit. Deactivation hands the credits back with</w:t>
+      </w:r>
+      <w:r>
+        <w:t xml:space="preserve"> </w:t>
+      </w:r>
+      <w:r>
+        <w:rPr>
+          <w:rStyle w:val="VerbatimChar"/>
+        </w:rPr>
+        <w:t xml:space="preserve">LCrdReturn</w:t>
+      </w:r>
+      <w:r>
+        <w:t xml:space="preserve"> </w:t>
+      </w:r>
+      <w:r>
+        <w:t xml:space="preserve">flits and completes only once the last of them has been returned,</w:t>
+      </w:r>
+      <w:r>
+        <w:t xml:space="preserve"> </w:t>
+      </w:r>
+      <w:r>
+        <w:t xml:space="preserve">which is why the port ORs the per-channel activation signals: the OR holds the</w:t>
+      </w:r>
+      <w:r>
+        <w:t xml:space="preserve"> </w:t>
+      </w:r>
+      <w:r>
+        <w:t xml:space="preserve">handshake asserted until the last channel has drained.</w:t>
       </w:r>
     </w:p>
     <w:p>
@@ -30462,7 +30961,31 @@
               <w:rPr>
                 <w:rStyle w:val="VerbatimChar"/>
               </w:rPr>
-              <w:t xml:space="preserve">NO_RECEIVE_WITHOUT_RUN</w:t>
+              <w:t xml:space="preserve">NO_RECEIVE_OUTSIDE_ACTIVE</w:t>
+            </w:r>
+            <w:r>
+              <w:t xml:space="preserve">,</w:t>
+            </w:r>
+            <w:r>
+              <w:t xml:space="preserve"> </w:t>
+            </w:r>
+            <w:r>
+              <w:rPr>
+                <w:rStyle w:val="VerbatimChar"/>
+              </w:rPr>
+              <w:t xml:space="preserve">LCRD_RETURN_NOT_DELIVERED</w:t>
+            </w:r>
+            <w:r>
+              <w:t xml:space="preserve">,</w:t>
+            </w:r>
+            <w:r>
+              <w:t xml:space="preserve"> </w:t>
+            </w:r>
+            <w:r>
+              <w:rPr>
+                <w:rStyle w:val="VerbatimChar"/>
+              </w:rPr>
+              <w:t xml:space="preserve">PEER_CREDITS_IN_RANGE</w:t>
             </w:r>
             <w:r>
               <w:t xml:space="preserve">,</w:t>
@@ -34132,7 +34655,127 @@
         <w:pStyle w:val="Compact"/>
       </w:pPr>
       <w:r>
-        <w:t xml:space="preserve">System coherency and link power sequencing are placeholders.</w:t>
+        <w:t xml:space="preserve">System coherency and link power sequencing are placeholders. Nothing in</w:t>
+      </w:r>
+      <w:r>
+        <w:t xml:space="preserve"> </w:t>
+      </w:r>
+      <w:r>
+        <w:t xml:space="preserve">the design asserts</w:t>
+      </w:r>
+      <w:r>
+        <w:t xml:space="preserve"> </w:t>
+      </w:r>
+      <w:r>
+        <w:rPr>
+          <w:rStyle w:val="VerbatimChar"/>
+        </w:rPr>
+        <w:t xml:space="preserve">deactivate</w:t>
+      </w:r>
+      <w:r>
+        <w:t xml:space="preserve">, so although the link layer now implements</w:t>
+      </w:r>
+      <w:r>
+        <w:t xml:space="preserve"> </w:t>
+      </w:r>
+      <w:r>
+        <w:t xml:space="preserve">the</w:t>
+      </w:r>
+      <w:r>
+        <w:t xml:space="preserve"> </w:t>
+      </w:r>
+      <w:r>
+        <w:rPr>
+          <w:rStyle w:val="VerbatimChar"/>
+        </w:rPr>
+        <w:t xml:space="preserve">LCrdReturn</w:t>
+      </w:r>
+      <w:r>
+        <w:t xml:space="preserve"> </w:t>
+      </w:r>
+      <w:r>
+        <w:t xml:space="preserve">exchange in both directions, the deactivation path has</w:t>
+      </w:r>
+      <w:r>
+        <w:t xml:space="preserve"> </w:t>
+      </w:r>
+      <w:r>
+        <w:t xml:space="preserve">never been walked.</w:t>
+      </w:r>
+    </w:p>
+    <w:p>
+      <w:pPr>
+        <w:numPr>
+          <w:ilvl w:val="0"/>
+          <w:numId w:val="1009"/>
+        </w:numPr>
+        <w:pStyle w:val="Compact"/>
+      </w:pPr>
+      <w:r>
+        <w:t xml:space="preserve">A granted P-Credit reserves nothing.</w:t>
+      </w:r>
+      <w:r>
+        <w:t xml:space="preserve"> </w:t>
+      </w:r>
+      <w:r>
+        <w:rPr>
+          <w:rStyle w:val="VerbatimChar"/>
+        </w:rPr>
+        <w:t xml:space="preserve">chi_retry</w:t>
+      </w:r>
+      <w:r>
+        <w:t xml:space="preserve"> </w:t>
+      </w:r>
+      <w:r>
+        <w:t xml:space="preserve">grants a credit only</w:t>
+      </w:r>
+      <w:r>
+        <w:t xml:space="preserve"> </w:t>
+      </w:r>
+      <w:r>
+        <w:t xml:space="preserve">while a Home resource exists, but the resource is not held for the</w:t>
+      </w:r>
+      <w:r>
+        <w:t xml:space="preserve"> </w:t>
+      </w:r>
+      <w:r>
+        <w:t xml:space="preserve">credited request, so by the time that request arrives the Home can be busy</w:t>
+      </w:r>
+      <w:r>
+        <w:t xml:space="preserve"> </w:t>
+      </w:r>
+      <w:r>
+        <w:t xml:space="preserve">with another one. It is then back-pressured rather than retried a second</w:t>
+      </w:r>
+      <w:r>
+        <w:t xml:space="preserve"> </w:t>
+      </w:r>
+      <w:r>
+        <w:t xml:space="preserve">time, which satisfies B2.10, but it satisfies it only because the Home is</w:t>
+      </w:r>
+      <w:r>
+        <w:t xml:space="preserve"> </w:t>
+      </w:r>
+      <w:r>
+        <w:t xml:space="preserve">serial and the REQ channel is in order: the credited request blocks</w:t>
+      </w:r>
+      <w:r>
+        <w:t xml:space="preserve"> </w:t>
+      </w:r>
+      <w:r>
+        <w:t xml:space="preserve">everything behind it until the Home is free. Pipelining the Home without</w:t>
+      </w:r>
+      <w:r>
+        <w:t xml:space="preserve"> </w:t>
+      </w:r>
+      <w:r>
+        <w:t xml:space="preserve">adding a real reservation would break the guarantee that the second</w:t>
+      </w:r>
+      <w:r>
+        <w:t xml:space="preserve"> </w:t>
+      </w:r>
+      <w:r>
+        <w:t xml:space="preserve">attempt is accepted.</w:t>
       </w:r>
     </w:p>
     <w:p>

</xml_diff>